<commit_message>
docs: enfocar el proyecto solo en Android
- app.json solo para Android (sin configuracion de iOS)
- README y CONTRIBUTING: development build para todos, emulador para
  Kassie, Jorge y Jeshua, APK de desarrollo compartido por Isabel
- Plantilla de PR sin pruebas en iOS
- Documento de arquitectura actualizado (seccion 4 reescrita)
- Ignorar llaves de Firebase y la carpeta "Claude outputs"

Co-Authored-By: Claude Opus 5.5 <noreply@anthropic.com>
Claude-Session: https://claude.ai/code/session_019xLn7cYorBNSuBjLRXFLrS
</commit_message>
<xml_diff>
--- a/docs/Arquitectura_App_Subastas.docx
+++ b/docs/Arquitectura_App_Subastas.docx
@@ -85,10 +85,10 @@
           <w:b/>
           <w:bCs/>
         </w:rPr>
-        <w:t xml:space="preserve">Plataformas:</w:t>
-      </w:r>
-      <w:r>
-        <w:t xml:space="preserve"> Android (2 integrantes, development build) e iOS (3 integrantes, Expo Go)</w:t>
+        <w:t xml:space="preserve">Plataforma:</w:t>
+      </w:r>
+      <w:r>
+        <w:t xml:space="preserve"> Android (development build). Celulares físicos: Isabel y Brayan. Emulador: Kassie, Jorge y Jeshua.</w:t>
       </w:r>
     </w:p>
     <w:p>
@@ -304,7 +304,7 @@
               <w:spacing w:after="40"/>
             </w:pPr>
             <w:r>
-              <w:t xml:space="preserve">Notificaciones push en Android</w:t>
+              <w:t xml:space="preserve">Plataforma única: Android</w:t>
             </w:r>
           </w:p>
         </w:tc>
@@ -330,17 +330,17 @@
               <w:spacing w:after="40"/>
             </w:pPr>
             <w:r>
-              <w:t xml:space="preserve">Desde Expo SDK 53, </w:t>
+              <w:t xml:space="preserve">La app se desarrolla, prueba y presenta </w:t>
             </w:r>
             <w:r>
               <w:rPr>
                 <w:b/>
                 <w:bCs/>
               </w:rPr>
-              <w:t xml:space="preserve">Expo Go en Android no recibe notificaciones push remotas</w:t>
-            </w:r>
-            <w:r>
-              <w:t xml:space="preserve">. Los dos integrantes con Android deben usar un </w:t>
+              <w:t xml:space="preserve">solo en Android</w:t>
+            </w:r>
+            <w:r>
+              <w:t xml:space="preserve">. Todos ejecutan el mismo </w:t>
             </w:r>
             <w:r>
               <w:rPr>
@@ -350,7 +350,193 @@
               <w:t xml:space="preserve">development build</w:t>
             </w:r>
             <w:r>
-              <w:t xml:space="preserve"> (</w:t>
+              <w:t xml:space="preserve"> (no Expo Go), así que funcionan push, pagos y sensores en cualquier dispositivo del equipo.</w:t>
+            </w:r>
+          </w:p>
+        </w:tc>
+      </w:tr>
+      <w:tr>
+        <w:tc>
+          <w:tcPr>
+            <w:tcW w:type="dxa" w:w="2400"/>
+            <w:gridSpan w:val="1"/>
+            <w:tcBorders>
+              <w:top w:val="single" w:color="CBD5E1" w:sz="4"/>
+              <w:left w:val="single" w:color="CBD5E1" w:sz="4"/>
+              <w:bottom w:val="single" w:color="CBD5E1" w:sz="4"/>
+              <w:right w:val="single" w:color="CBD5E1" w:sz="4"/>
+            </w:tcBorders>
+            <w:shd w:fill="F1F5F9" w:color="auto" w:val="clear"/>
+            <w:tcMar>
+              <w:top w:type="dxa" w:w="70"/>
+              <w:left w:type="dxa" w:w="110"/>
+              <w:bottom w:type="dxa" w:w="70"/>
+              <w:right w:type="dxa" w:w="110"/>
+            </w:tcMar>
+          </w:tcPr>
+          <w:p>
+            <w:pPr>
+              <w:spacing w:after="40"/>
+            </w:pPr>
+            <w:r>
+              <w:t xml:space="preserve">Integrantes sin celular Android</w:t>
+            </w:r>
+          </w:p>
+        </w:tc>
+        <w:tc>
+          <w:tcPr>
+            <w:tcW w:type="dxa" w:w="6960"/>
+            <w:gridSpan w:val="1"/>
+            <w:tcBorders>
+              <w:top w:val="single" w:color="CBD5E1" w:sz="4"/>
+              <w:left w:val="single" w:color="CBD5E1" w:sz="4"/>
+              <w:bottom w:val="single" w:color="CBD5E1" w:sz="4"/>
+              <w:right w:val="single" w:color="CBD5E1" w:sz="4"/>
+            </w:tcBorders>
+            <w:shd w:fill="F1F5F9" w:color="auto" w:val="clear"/>
+            <w:tcMar>
+              <w:top w:type="dxa" w:w="70"/>
+              <w:left w:type="dxa" w:w="110"/>
+              <w:bottom w:type="dxa" w:w="70"/>
+              <w:right w:type="dxa" w:w="110"/>
+            </w:tcMar>
+          </w:tcPr>
+          <w:p>
+            <w:pPr>
+              <w:spacing w:after="40"/>
+            </w:pPr>
+            <w:r>
+              <w:t xml:space="preserve">Kassie, Jorge y Jeshua trabajan con el </w:t>
+            </w:r>
+            <w:r>
+              <w:rPr>
+                <w:b/>
+                <w:bCs/>
+              </w:rPr>
+              <w:t xml:space="preserve">emulador de Android Studio</w:t>
+            </w:r>
+            <w:r>
+              <w:t xml:space="preserve"> e instalan el APK de desarrollo que genera Isabel. El emulador simula ubicación, acelerómetro y giroscopio (Extended controls &gt; Virtual sensors) y puede usar la webcam como cámara. La prueba final de sensores siempre se hace en el celular de Isabel o Brayan.</w:t>
+            </w:r>
+          </w:p>
+        </w:tc>
+      </w:tr>
+      <w:tr>
+        <w:tc>
+          <w:tcPr>
+            <w:tcW w:type="dxa" w:w="2400"/>
+            <w:gridSpan w:val="1"/>
+            <w:tcBorders>
+              <w:top w:val="single" w:color="CBD5E1" w:sz="4"/>
+              <w:left w:val="single" w:color="CBD5E1" w:sz="4"/>
+              <w:bottom w:val="single" w:color="CBD5E1" w:sz="4"/>
+              <w:right w:val="single" w:color="CBD5E1" w:sz="4"/>
+            </w:tcBorders>
+            <w:tcMar>
+              <w:top w:type="dxa" w:w="70"/>
+              <w:left w:type="dxa" w:w="110"/>
+              <w:bottom w:type="dxa" w:w="70"/>
+              <w:right w:type="dxa" w:w="110"/>
+            </w:tcMar>
+          </w:tcPr>
+          <w:p>
+            <w:pPr>
+              <w:spacing w:after="40"/>
+            </w:pPr>
+            <w:r>
+              <w:t xml:space="preserve">Requisitos del emulador</w:t>
+            </w:r>
+          </w:p>
+        </w:tc>
+        <w:tc>
+          <w:tcPr>
+            <w:tcW w:type="dxa" w:w="6960"/>
+            <w:gridSpan w:val="1"/>
+            <w:tcBorders>
+              <w:top w:val="single" w:color="CBD5E1" w:sz="4"/>
+              <w:left w:val="single" w:color="CBD5E1" w:sz="4"/>
+              <w:bottom w:val="single" w:color="CBD5E1" w:sz="4"/>
+              <w:right w:val="single" w:color="CBD5E1" w:sz="4"/>
+            </w:tcBorders>
+            <w:tcMar>
+              <w:top w:type="dxa" w:w="70"/>
+              <w:left w:type="dxa" w:w="110"/>
+              <w:bottom w:type="dxa" w:w="70"/>
+              <w:right w:type="dxa" w:w="110"/>
+            </w:tcMar>
+          </w:tcPr>
+          <w:p>
+            <w:pPr>
+              <w:spacing w:after="40"/>
+            </w:pPr>
+            <w:r>
+              <w:t xml:space="preserve">Virtualización activada en la BIOS, 8 GB de RAM o más y una imagen </w:t>
+            </w:r>
+            <w:r>
+              <w:rPr>
+                <w:b/>
+                <w:bCs/>
+              </w:rPr>
+              <w:t xml:space="preserve">con Google Play</w:t>
+            </w:r>
+            <w:r>
+              <w:t xml:space="preserve"> (necesaria para push). Verificarlo el día 1: si una PC no lo soporta, ese integrante usa el celular de Isabel o Brayan en las sesiones de prueba.</w:t>
+            </w:r>
+          </w:p>
+        </w:tc>
+      </w:tr>
+      <w:tr>
+        <w:tc>
+          <w:tcPr>
+            <w:tcW w:type="dxa" w:w="2400"/>
+            <w:gridSpan w:val="1"/>
+            <w:tcBorders>
+              <w:top w:val="single" w:color="CBD5E1" w:sz="4"/>
+              <w:left w:val="single" w:color="CBD5E1" w:sz="4"/>
+              <w:bottom w:val="single" w:color="CBD5E1" w:sz="4"/>
+              <w:right w:val="single" w:color="CBD5E1" w:sz="4"/>
+            </w:tcBorders>
+            <w:shd w:fill="F1F5F9" w:color="auto" w:val="clear"/>
+            <w:tcMar>
+              <w:top w:type="dxa" w:w="70"/>
+              <w:left w:type="dxa" w:w="110"/>
+              <w:bottom w:type="dxa" w:w="70"/>
+              <w:right w:type="dxa" w:w="110"/>
+            </w:tcMar>
+          </w:tcPr>
+          <w:p>
+            <w:pPr>
+              <w:spacing w:after="40"/>
+            </w:pPr>
+            <w:r>
+              <w:t xml:space="preserve">Push necesita Firebase (FCM)</w:t>
+            </w:r>
+          </w:p>
+        </w:tc>
+        <w:tc>
+          <w:tcPr>
+            <w:tcW w:type="dxa" w:w="6960"/>
+            <w:gridSpan w:val="1"/>
+            <w:tcBorders>
+              <w:top w:val="single" w:color="CBD5E1" w:sz="4"/>
+              <w:left w:val="single" w:color="CBD5E1" w:sz="4"/>
+              <w:bottom w:val="single" w:color="CBD5E1" w:sz="4"/>
+              <w:right w:val="single" w:color="CBD5E1" w:sz="4"/>
+            </w:tcBorders>
+            <w:shd w:fill="F1F5F9" w:color="auto" w:val="clear"/>
+            <w:tcMar>
+              <w:top w:type="dxa" w:w="70"/>
+              <w:left w:type="dxa" w:w="110"/>
+              <w:bottom w:type="dxa" w:w="70"/>
+              <w:right w:type="dxa" w:w="110"/>
+            </w:tcMar>
+          </w:tcPr>
+          <w:p>
+            <w:pPr>
+              <w:spacing w:after="40"/>
+            </w:pPr>
+            <w:r>
+              <w:t xml:space="preserve">Desde Expo SDK 53 el push remoto no funciona en Expo Go para Android, por eso se usa development build. Brayan configura Firebase el día 1 (sección 11.2). La app guarda además cada aviso en la tabla </w:t>
             </w:r>
             <w:r>
               <w:rPr>
@@ -359,10 +545,260 @@
                 <w:sz w:val="19"/>
                 <w:szCs w:val="19"/>
               </w:rPr>
-              <w:t xml:space="preserve">npm run android</w:t>
-            </w:r>
-            <w:r>
-              <w:t xml:space="preserve">). Los integrantes con iOS pueden seguir en Expo Go. La app guarda además cada aviso en la tabla </w:t>
+              <w:t xml:space="preserve">notificaciones</w:t>
+            </w:r>
+            <w:r>
+              <w:t xml:space="preserve">, visible en Perfil, para que la demo funcione aunque el push falle.</w:t>
+            </w:r>
+          </w:p>
+        </w:tc>
+      </w:tr>
+      <w:tr>
+        <w:tc>
+          <w:tcPr>
+            <w:tcW w:type="dxa" w:w="2400"/>
+            <w:gridSpan w:val="1"/>
+            <w:tcBorders>
+              <w:top w:val="single" w:color="CBD5E1" w:sz="4"/>
+              <w:left w:val="single" w:color="CBD5E1" w:sz="4"/>
+              <w:bottom w:val="single" w:color="CBD5E1" w:sz="4"/>
+              <w:right w:val="single" w:color="CBD5E1" w:sz="4"/>
+            </w:tcBorders>
+            <w:tcMar>
+              <w:top w:type="dxa" w:w="70"/>
+              <w:left w:type="dxa" w:w="110"/>
+              <w:bottom w:type="dxa" w:w="70"/>
+              <w:right w:type="dxa" w:w="110"/>
+            </w:tcMar>
+          </w:tcPr>
+          <w:p>
+            <w:pPr>
+              <w:spacing w:after="40"/>
+            </w:pPr>
+            <w:r>
+              <w:t xml:space="preserve">Librerías nativas</w:t>
+            </w:r>
+          </w:p>
+        </w:tc>
+        <w:tc>
+          <w:tcPr>
+            <w:tcW w:type="dxa" w:w="6960"/>
+            <w:gridSpan w:val="1"/>
+            <w:tcBorders>
+              <w:top w:val="single" w:color="CBD5E1" w:sz="4"/>
+              <w:left w:val="single" w:color="CBD5E1" w:sz="4"/>
+              <w:bottom w:val="single" w:color="CBD5E1" w:sz="4"/>
+              <w:right w:val="single" w:color="CBD5E1" w:sz="4"/>
+            </w:tcBorders>
+            <w:tcMar>
+              <w:top w:type="dxa" w:w="70"/>
+              <w:left w:type="dxa" w:w="110"/>
+              <w:bottom w:type="dxa" w:w="70"/>
+              <w:right w:type="dxa" w:w="110"/>
+            </w:tcMar>
+          </w:tcPr>
+          <w:p>
+            <w:pPr>
+              <w:spacing w:after="40"/>
+            </w:pPr>
+            <w:r>
+              <w:t xml:space="preserve">Cada librería nativa nueva obliga a </w:t>
+            </w:r>
+            <w:r>
+              <w:rPr>
+                <w:b/>
+                <w:bCs/>
+              </w:rPr>
+              <w:t xml:space="preserve">regenerar el APK de desarrollo</w:t>
+            </w:r>
+            <w:r>
+              <w:t xml:space="preserve"> y reinstalarlo en todos los dispositivos. Se agregan solo con aviso al equipo y las instala Isabel o Brayan. Los cambios de código JavaScript se ven al instante, sin recompilar.</w:t>
+            </w:r>
+          </w:p>
+        </w:tc>
+      </w:tr>
+      <w:tr>
+        <w:tc>
+          <w:tcPr>
+            <w:tcW w:type="dxa" w:w="2400"/>
+            <w:gridSpan w:val="1"/>
+            <w:tcBorders>
+              <w:top w:val="single" w:color="CBD5E1" w:sz="4"/>
+              <w:left w:val="single" w:color="CBD5E1" w:sz="4"/>
+              <w:bottom w:val="single" w:color="CBD5E1" w:sz="4"/>
+              <w:right w:val="single" w:color="CBD5E1" w:sz="4"/>
+            </w:tcBorders>
+            <w:shd w:fill="F1F5F9" w:color="auto" w:val="clear"/>
+            <w:tcMar>
+              <w:top w:type="dxa" w:w="70"/>
+              <w:left w:type="dxa" w:w="110"/>
+              <w:bottom w:type="dxa" w:w="70"/>
+              <w:right w:type="dxa" w:w="110"/>
+            </w:tcMar>
+          </w:tcPr>
+          <w:p>
+            <w:pPr>
+              <w:spacing w:after="40"/>
+            </w:pPr>
+            <w:r>
+              <w:t xml:space="preserve">Versión de Expo</w:t>
+            </w:r>
+          </w:p>
+        </w:tc>
+        <w:tc>
+          <w:tcPr>
+            <w:tcW w:type="dxa" w:w="6960"/>
+            <w:gridSpan w:val="1"/>
+            <w:tcBorders>
+              <w:top w:val="single" w:color="CBD5E1" w:sz="4"/>
+              <w:left w:val="single" w:color="CBD5E1" w:sz="4"/>
+              <w:bottom w:val="single" w:color="CBD5E1" w:sz="4"/>
+              <w:right w:val="single" w:color="CBD5E1" w:sz="4"/>
+            </w:tcBorders>
+            <w:shd w:fill="F1F5F9" w:color="auto" w:val="clear"/>
+            <w:tcMar>
+              <w:top w:type="dxa" w:w="70"/>
+              <w:left w:type="dxa" w:w="110"/>
+              <w:bottom w:type="dxa" w:w="70"/>
+              <w:right w:type="dxa" w:w="110"/>
+            </w:tcMar>
+          </w:tcPr>
+          <w:p>
+            <w:pPr>
+              <w:spacing w:after="40"/>
+            </w:pPr>
+            <w:r>
+              <w:t xml:space="preserve">El proyecto usa </w:t>
+            </w:r>
+            <w:r>
+              <w:rPr>
+                <w:b/>
+                <w:bCs/>
+              </w:rPr>
+              <w:t xml:space="preserve">Expo SDK 57</w:t>
+            </w:r>
+            <w:r>
+              <w:t xml:space="preserve">. No actualizar el SDK ni React Native durante la semana.</w:t>
+            </w:r>
+          </w:p>
+        </w:tc>
+      </w:tr>
+      <w:tr>
+        <w:tc>
+          <w:tcPr>
+            <w:tcW w:type="dxa" w:w="2400"/>
+            <w:gridSpan w:val="1"/>
+            <w:tcBorders>
+              <w:top w:val="single" w:color="CBD5E1" w:sz="4"/>
+              <w:left w:val="single" w:color="CBD5E1" w:sz="4"/>
+              <w:bottom w:val="single" w:color="CBD5E1" w:sz="4"/>
+              <w:right w:val="single" w:color="CBD5E1" w:sz="4"/>
+            </w:tcBorders>
+            <w:tcMar>
+              <w:top w:type="dxa" w:w="70"/>
+              <w:left w:type="dxa" w:w="110"/>
+              <w:bottom w:type="dxa" w:w="70"/>
+              <w:right w:type="dxa" w:w="110"/>
+            </w:tcMar>
+          </w:tcPr>
+          <w:p>
+            <w:pPr>
+              <w:spacing w:after="40"/>
+            </w:pPr>
+            <w:r>
+              <w:t xml:space="preserve">Confirmación de correo</w:t>
+            </w:r>
+          </w:p>
+        </w:tc>
+        <w:tc>
+          <w:tcPr>
+            <w:tcW w:type="dxa" w:w="6960"/>
+            <w:gridSpan w:val="1"/>
+            <w:tcBorders>
+              <w:top w:val="single" w:color="CBD5E1" w:sz="4"/>
+              <w:left w:val="single" w:color="CBD5E1" w:sz="4"/>
+              <w:bottom w:val="single" w:color="CBD5E1" w:sz="4"/>
+              <w:right w:val="single" w:color="CBD5E1" w:sz="4"/>
+            </w:tcBorders>
+            <w:tcMar>
+              <w:top w:type="dxa" w:w="70"/>
+              <w:left w:type="dxa" w:w="110"/>
+              <w:bottom w:type="dxa" w:w="70"/>
+              <w:right w:type="dxa" w:w="110"/>
+            </w:tcMar>
+          </w:tcPr>
+          <w:p>
+            <w:pPr>
+              <w:spacing w:after="40"/>
+            </w:pPr>
+            <w:r>
+              <w:t xml:space="preserve">En Supabase &gt; Authentication &gt; Providers &gt; Email, </w:t>
+            </w:r>
+            <w:r>
+              <w:rPr>
+                <w:b/>
+                <w:bCs/>
+              </w:rPr>
+              <w:t xml:space="preserve">desactivar "Confirm email"</w:t>
+            </w:r>
+            <w:r>
+              <w:t xml:space="preserve"> durante el proyecto. Si queda activo, el registro no inicia sesión hasta confirmar el correo y el plan gratuito limita los correos por hora.</w:t>
+            </w:r>
+          </w:p>
+        </w:tc>
+      </w:tr>
+      <w:tr>
+        <w:tc>
+          <w:tcPr>
+            <w:tcW w:type="dxa" w:w="2400"/>
+            <w:gridSpan w:val="1"/>
+            <w:tcBorders>
+              <w:top w:val="single" w:color="CBD5E1" w:sz="4"/>
+              <w:left w:val="single" w:color="CBD5E1" w:sz="4"/>
+              <w:bottom w:val="single" w:color="CBD5E1" w:sz="4"/>
+              <w:right w:val="single" w:color="CBD5E1" w:sz="4"/>
+            </w:tcBorders>
+            <w:shd w:fill="F1F5F9" w:color="auto" w:val="clear"/>
+            <w:tcMar>
+              <w:top w:type="dxa" w:w="70"/>
+              <w:left w:type="dxa" w:w="110"/>
+              <w:bottom w:type="dxa" w:w="70"/>
+              <w:right w:type="dxa" w:w="110"/>
+            </w:tcMar>
+          </w:tcPr>
+          <w:p>
+            <w:pPr>
+              <w:spacing w:after="40"/>
+            </w:pPr>
+            <w:r>
+              <w:t xml:space="preserve">Secretos</w:t>
+            </w:r>
+          </w:p>
+        </w:tc>
+        <w:tc>
+          <w:tcPr>
+            <w:tcW w:type="dxa" w:w="6960"/>
+            <w:gridSpan w:val="1"/>
+            <w:tcBorders>
+              <w:top w:val="single" w:color="CBD5E1" w:sz="4"/>
+              <w:left w:val="single" w:color="CBD5E1" w:sz="4"/>
+              <w:bottom w:val="single" w:color="CBD5E1" w:sz="4"/>
+              <w:right w:val="single" w:color="CBD5E1" w:sz="4"/>
+            </w:tcBorders>
+            <w:shd w:fill="F1F5F9" w:color="auto" w:val="clear"/>
+            <w:tcMar>
+              <w:top w:type="dxa" w:w="70"/>
+              <w:left w:type="dxa" w:w="110"/>
+              <w:bottom w:type="dxa" w:w="70"/>
+              <w:right w:type="dxa" w:w="110"/>
+            </w:tcMar>
+          </w:tcPr>
+          <w:p>
+            <w:pPr>
+              <w:spacing w:after="40"/>
+            </w:pPr>
+            <w:r>
+              <w:t xml:space="preserve">La </w:t>
             </w:r>
             <w:r>
               <w:rPr>
@@ -371,326 +807,20 @@
                 <w:sz w:val="19"/>
                 <w:szCs w:val="19"/>
               </w:rPr>
-              <w:t xml:space="preserve">notificaciones</w:t>
-            </w:r>
-            <w:r>
-              <w:t xml:space="preserve">, que se muestra en Perfil, para que la demo funcione aunque el push falle.</w:t>
-            </w:r>
-          </w:p>
-        </w:tc>
-      </w:tr>
-      <w:tr>
-        <w:tc>
-          <w:tcPr>
-            <w:tcW w:type="dxa" w:w="2400"/>
-            <w:gridSpan w:val="1"/>
-            <w:tcBorders>
-              <w:top w:val="single" w:color="CBD5E1" w:sz="4"/>
-              <w:left w:val="single" w:color="CBD5E1" w:sz="4"/>
-              <w:bottom w:val="single" w:color="CBD5E1" w:sz="4"/>
-              <w:right w:val="single" w:color="CBD5E1" w:sz="4"/>
-            </w:tcBorders>
-            <w:shd w:fill="F1F5F9" w:color="auto" w:val="clear"/>
-            <w:tcMar>
-              <w:top w:type="dxa" w:w="70"/>
-              <w:left w:type="dxa" w:w="110"/>
-              <w:bottom w:type="dxa" w:w="70"/>
-              <w:right w:type="dxa" w:w="110"/>
-            </w:tcMar>
-          </w:tcPr>
-          <w:p>
-            <w:pPr>
-              <w:spacing w:after="40"/>
-            </w:pPr>
-            <w:r>
-              <w:t xml:space="preserve">Versión de Expo</w:t>
-            </w:r>
-          </w:p>
-        </w:tc>
-        <w:tc>
-          <w:tcPr>
-            <w:tcW w:type="dxa" w:w="6960"/>
-            <w:gridSpan w:val="1"/>
-            <w:tcBorders>
-              <w:top w:val="single" w:color="CBD5E1" w:sz="4"/>
-              <w:left w:val="single" w:color="CBD5E1" w:sz="4"/>
-              <w:bottom w:val="single" w:color="CBD5E1" w:sz="4"/>
-              <w:right w:val="single" w:color="CBD5E1" w:sz="4"/>
-            </w:tcBorders>
-            <w:shd w:fill="F1F5F9" w:color="auto" w:val="clear"/>
-            <w:tcMar>
-              <w:top w:type="dxa" w:w="70"/>
-              <w:left w:type="dxa" w:w="110"/>
-              <w:bottom w:type="dxa" w:w="70"/>
-              <w:right w:type="dxa" w:w="110"/>
-            </w:tcMar>
-          </w:tcPr>
-          <w:p>
-            <w:pPr>
-              <w:spacing w:after="40"/>
-            </w:pPr>
-            <w:r>
-              <w:t xml:space="preserve">El proyecto usa </w:t>
+              <w:t xml:space="preserve">service_role key</w:t>
+            </w:r>
+            <w:r>
+              <w:t xml:space="preserve"> de Supabase y la llave secreta de Stripe </w:t>
             </w:r>
             <w:r>
               <w:rPr>
                 <w:b/>
                 <w:bCs/>
               </w:rPr>
-              <w:t xml:space="preserve">Expo SDK 57</w:t>
-            </w:r>
-            <w:r>
-              <w:t xml:space="preserve">, la versión que soporta Expo Go de la App Store. No actualizar el SDK durante la semana: si el SDK del proyecto no coincide con Expo Go, los iPhone dejan de abrir la app.</w:t>
-            </w:r>
-          </w:p>
-        </w:tc>
-      </w:tr>
-      <w:tr>
-        <w:tc>
-          <w:tcPr>
-            <w:tcW w:type="dxa" w:w="2400"/>
-            <w:gridSpan w:val="1"/>
-            <w:tcBorders>
-              <w:top w:val="single" w:color="CBD5E1" w:sz="4"/>
-              <w:left w:val="single" w:color="CBD5E1" w:sz="4"/>
-              <w:bottom w:val="single" w:color="CBD5E1" w:sz="4"/>
-              <w:right w:val="single" w:color="CBD5E1" w:sz="4"/>
-            </w:tcBorders>
-            <w:tcMar>
-              <w:top w:type="dxa" w:w="70"/>
-              <w:left w:type="dxa" w:w="110"/>
-              <w:bottom w:type="dxa" w:w="70"/>
-              <w:right w:type="dxa" w:w="110"/>
-            </w:tcMar>
-          </w:tcPr>
-          <w:p>
-            <w:pPr>
-              <w:spacing w:after="40"/>
-            </w:pPr>
-            <w:r>
-              <w:t xml:space="preserve">Solo librerías compatibles con Expo Go</w:t>
-            </w:r>
-          </w:p>
-        </w:tc>
-        <w:tc>
-          <w:tcPr>
-            <w:tcW w:type="dxa" w:w="6960"/>
-            <w:gridSpan w:val="1"/>
-            <w:tcBorders>
-              <w:top w:val="single" w:color="CBD5E1" w:sz="4"/>
-              <w:left w:val="single" w:color="CBD5E1" w:sz="4"/>
-              <w:bottom w:val="single" w:color="CBD5E1" w:sz="4"/>
-              <w:right w:val="single" w:color="CBD5E1" w:sz="4"/>
-            </w:tcBorders>
-            <w:tcMar>
-              <w:top w:type="dxa" w:w="70"/>
-              <w:left w:type="dxa" w:w="110"/>
-              <w:bottom w:type="dxa" w:w="70"/>
-              <w:right w:type="dxa" w:w="110"/>
-            </w:tcMar>
-          </w:tcPr>
-          <w:p>
-            <w:pPr>
-              <w:spacing w:after="40"/>
-            </w:pPr>
-            <w:r>
-              <w:t xml:space="preserve">Como tres integrantes no pueden compilar para iOS (requiere Mac y cuenta de Apple de pago), </w:t>
-            </w:r>
-            <w:r>
-              <w:rPr>
-                <w:b/>
-                <w:bCs/>
-              </w:rPr>
-              <w:t xml:space="preserve">toda librería nativa debe estar incluida en Expo Go</w:t>
-            </w:r>
-            <w:r>
-              <w:t xml:space="preserve">. Todas las elegidas lo están: expo-camera, expo-location, expo-sensors, expo-notifications, expo-haptics y @stripe/stripe-react-native. Antes de agregar otra librería, revisar que diga "Expo Go: compatible".</w:t>
-            </w:r>
-          </w:p>
-        </w:tc>
-      </w:tr>
-      <w:tr>
-        <w:tc>
-          <w:tcPr>
-            <w:tcW w:type="dxa" w:w="2400"/>
-            <w:gridSpan w:val="1"/>
-            <w:tcBorders>
-              <w:top w:val="single" w:color="CBD5E1" w:sz="4"/>
-              <w:left w:val="single" w:color="CBD5E1" w:sz="4"/>
-              <w:bottom w:val="single" w:color="CBD5E1" w:sz="4"/>
-              <w:right w:val="single" w:color="CBD5E1" w:sz="4"/>
-            </w:tcBorders>
-            <w:shd w:fill="F1F5F9" w:color="auto" w:val="clear"/>
-            <w:tcMar>
-              <w:top w:type="dxa" w:w="70"/>
-              <w:left w:type="dxa" w:w="110"/>
-              <w:bottom w:type="dxa" w:w="70"/>
-              <w:right w:type="dxa" w:w="110"/>
-            </w:tcMar>
-          </w:tcPr>
-          <w:p>
-            <w:pPr>
-              <w:spacing w:after="40"/>
-            </w:pPr>
-            <w:r>
-              <w:t xml:space="preserve">Sensores en emulador</w:t>
-            </w:r>
-          </w:p>
-        </w:tc>
-        <w:tc>
-          <w:tcPr>
-            <w:tcW w:type="dxa" w:w="6960"/>
-            <w:gridSpan w:val="1"/>
-            <w:tcBorders>
-              <w:top w:val="single" w:color="CBD5E1" w:sz="4"/>
-              <w:left w:val="single" w:color="CBD5E1" w:sz="4"/>
-              <w:bottom w:val="single" w:color="CBD5E1" w:sz="4"/>
-              <w:right w:val="single" w:color="CBD5E1" w:sz="4"/>
-            </w:tcBorders>
-            <w:shd w:fill="F1F5F9" w:color="auto" w:val="clear"/>
-            <w:tcMar>
-              <w:top w:type="dxa" w:w="70"/>
-              <w:left w:type="dxa" w:w="110"/>
-              <w:bottom w:type="dxa" w:w="70"/>
-              <w:right w:type="dxa" w:w="110"/>
-            </w:tcMar>
-          </w:tcPr>
-          <w:p>
-            <w:pPr>
-              <w:spacing w:after="40"/>
-            </w:pPr>
-            <w:r>
-              <w:t xml:space="preserve">El acelerómetro y el giroscopio deben probarse en </w:t>
-            </w:r>
-            <w:r>
-              <w:rPr>
-                <w:b/>
-                <w:bCs/>
-              </w:rPr>
-              <w:t xml:space="preserve">celulares físicos</w:t>
-            </w:r>
-            <w:r>
-              <w:t xml:space="preserve">. Los emuladores no los simulan de forma útil.</w:t>
-            </w:r>
-          </w:p>
-        </w:tc>
-      </w:tr>
-      <w:tr>
-        <w:tc>
-          <w:tcPr>
-            <w:tcW w:type="dxa" w:w="2400"/>
-            <w:gridSpan w:val="1"/>
-            <w:tcBorders>
-              <w:top w:val="single" w:color="CBD5E1" w:sz="4"/>
-              <w:left w:val="single" w:color="CBD5E1" w:sz="4"/>
-              <w:bottom w:val="single" w:color="CBD5E1" w:sz="4"/>
-              <w:right w:val="single" w:color="CBD5E1" w:sz="4"/>
-            </w:tcBorders>
-            <w:tcMar>
-              <w:top w:type="dxa" w:w="70"/>
-              <w:left w:type="dxa" w:w="110"/>
-              <w:bottom w:type="dxa" w:w="70"/>
-              <w:right w:type="dxa" w:w="110"/>
-            </w:tcMar>
-          </w:tcPr>
-          <w:p>
-            <w:pPr>
-              <w:spacing w:after="40"/>
-            </w:pPr>
-            <w:r>
-              <w:t xml:space="preserve">Confirmación de correo</w:t>
-            </w:r>
-          </w:p>
-        </w:tc>
-        <w:tc>
-          <w:tcPr>
-            <w:tcW w:type="dxa" w:w="6960"/>
-            <w:gridSpan w:val="1"/>
-            <w:tcBorders>
-              <w:top w:val="single" w:color="CBD5E1" w:sz="4"/>
-              <w:left w:val="single" w:color="CBD5E1" w:sz="4"/>
-              <w:bottom w:val="single" w:color="CBD5E1" w:sz="4"/>
-              <w:right w:val="single" w:color="CBD5E1" w:sz="4"/>
-            </w:tcBorders>
-            <w:tcMar>
-              <w:top w:type="dxa" w:w="70"/>
-              <w:left w:type="dxa" w:w="110"/>
-              <w:bottom w:type="dxa" w:w="70"/>
-              <w:right w:type="dxa" w:w="110"/>
-            </w:tcMar>
-          </w:tcPr>
-          <w:p>
-            <w:pPr>
-              <w:spacing w:after="40"/>
-            </w:pPr>
-            <w:r>
-              <w:t xml:space="preserve">En Supabase &gt; Authentication &gt; Providers &gt; Email, </w:t>
-            </w:r>
-            <w:r>
-              <w:rPr>
-                <w:b/>
-                <w:bCs/>
-              </w:rPr>
-              <w:t xml:space="preserve">desactivar "Confirm email"</w:t>
-            </w:r>
-            <w:r>
-              <w:t xml:space="preserve"> durante el proyecto. Si queda activo, el registro no inicia sesión hasta confirmar el correo y el plan gratuito limita los correos por hora.</w:t>
-            </w:r>
-          </w:p>
-        </w:tc>
-      </w:tr>
-      <w:tr>
-        <w:tc>
-          <w:tcPr>
-            <w:tcW w:type="dxa" w:w="2400"/>
-            <w:gridSpan w:val="1"/>
-            <w:tcBorders>
-              <w:top w:val="single" w:color="CBD5E1" w:sz="4"/>
-              <w:left w:val="single" w:color="CBD5E1" w:sz="4"/>
-              <w:bottom w:val="single" w:color="CBD5E1" w:sz="4"/>
-              <w:right w:val="single" w:color="CBD5E1" w:sz="4"/>
-            </w:tcBorders>
-            <w:shd w:fill="F1F5F9" w:color="auto" w:val="clear"/>
-            <w:tcMar>
-              <w:top w:type="dxa" w:w="70"/>
-              <w:left w:type="dxa" w:w="110"/>
-              <w:bottom w:type="dxa" w:w="70"/>
-              <w:right w:type="dxa" w:w="110"/>
-            </w:tcMar>
-          </w:tcPr>
-          <w:p>
-            <w:pPr>
-              <w:spacing w:after="40"/>
-            </w:pPr>
-            <w:r>
-              <w:t xml:space="preserve">Secretos</w:t>
-            </w:r>
-          </w:p>
-        </w:tc>
-        <w:tc>
-          <w:tcPr>
-            <w:tcW w:type="dxa" w:w="6960"/>
-            <w:gridSpan w:val="1"/>
-            <w:tcBorders>
-              <w:top w:val="single" w:color="CBD5E1" w:sz="4"/>
-              <w:left w:val="single" w:color="CBD5E1" w:sz="4"/>
-              <w:bottom w:val="single" w:color="CBD5E1" w:sz="4"/>
-              <w:right w:val="single" w:color="CBD5E1" w:sz="4"/>
-            </w:tcBorders>
-            <w:shd w:fill="F1F5F9" w:color="auto" w:val="clear"/>
-            <w:tcMar>
-              <w:top w:type="dxa" w:w="70"/>
-              <w:left w:type="dxa" w:w="110"/>
-              <w:bottom w:type="dxa" w:w="70"/>
-              <w:right w:type="dxa" w:w="110"/>
-            </w:tcMar>
-          </w:tcPr>
-          <w:p>
-            <w:pPr>
-              <w:spacing w:after="40"/>
-            </w:pPr>
-            <w:r>
-              <w:t xml:space="preserve">La </w:t>
+              <w:t xml:space="preserve">nunca van en la app ni en Git</w:t>
+            </w:r>
+            <w:r>
+              <w:t xml:space="preserve">. Solo viven en los secretos de las Edge Functions. En </w:t>
             </w:r>
             <w:r>
               <w:rPr>
@@ -699,20 +829,10 @@
                 <w:sz w:val="19"/>
                 <w:szCs w:val="19"/>
               </w:rPr>
-              <w:t xml:space="preserve">service_role key</w:t>
-            </w:r>
-            <w:r>
-              <w:t xml:space="preserve"> de Supabase y la llave secreta de Stripe </w:t>
-            </w:r>
-            <w:r>
-              <w:rPr>
-                <w:b/>
-                <w:bCs/>
-              </w:rPr>
-              <w:t xml:space="preserve">nunca van en la app ni en Git</w:t>
-            </w:r>
-            <w:r>
-              <w:t xml:space="preserve">. Solo viven en los secretos de las Edge Functions. En </w:t>
+              <w:t xml:space="preserve">.env</w:t>
+            </w:r>
+            <w:r>
+              <w:t xml:space="preserve"> de la app solo van llaves públicas (</w:t>
             </w:r>
             <w:r>
               <w:rPr>
@@ -721,10 +841,74 @@
                 <w:sz w:val="19"/>
                 <w:szCs w:val="19"/>
               </w:rPr>
-              <w:t xml:space="preserve">.env</w:t>
-            </w:r>
-            <w:r>
-              <w:t xml:space="preserve"> de la app solo van llaves públicas (</w:t>
+              <w:t xml:space="preserve">EXPO_PUBLIC_...</w:t>
+            </w:r>
+            <w:r>
+              <w:t xml:space="preserve">).</w:t>
+            </w:r>
+          </w:p>
+        </w:tc>
+      </w:tr>
+      <w:tr>
+        <w:tc>
+          <w:tcPr>
+            <w:tcW w:type="dxa" w:w="2400"/>
+            <w:gridSpan w:val="1"/>
+            <w:tcBorders>
+              <w:top w:val="single" w:color="CBD5E1" w:sz="4"/>
+              <w:left w:val="single" w:color="CBD5E1" w:sz="4"/>
+              <w:bottom w:val="single" w:color="CBD5E1" w:sz="4"/>
+              <w:right w:val="single" w:color="CBD5E1" w:sz="4"/>
+            </w:tcBorders>
+            <w:tcMar>
+              <w:top w:type="dxa" w:w="70"/>
+              <w:left w:type="dxa" w:w="110"/>
+              <w:bottom w:type="dxa" w:w="70"/>
+              <w:right w:type="dxa" w:w="110"/>
+            </w:tcMar>
+          </w:tcPr>
+          <w:p>
+            <w:pPr>
+              <w:spacing w:after="40"/>
+            </w:pPr>
+            <w:r>
+              <w:t xml:space="preserve">Pagos</w:t>
+            </w:r>
+          </w:p>
+        </w:tc>
+        <w:tc>
+          <w:tcPr>
+            <w:tcW w:type="dxa" w:w="6960"/>
+            <w:gridSpan w:val="1"/>
+            <w:tcBorders>
+              <w:top w:val="single" w:color="CBD5E1" w:sz="4"/>
+              <w:left w:val="single" w:color="CBD5E1" w:sz="4"/>
+              <w:bottom w:val="single" w:color="CBD5E1" w:sz="4"/>
+              <w:right w:val="single" w:color="CBD5E1" w:sz="4"/>
+            </w:tcBorders>
+            <w:tcMar>
+              <w:top w:type="dxa" w:w="70"/>
+              <w:left w:type="dxa" w:w="110"/>
+              <w:bottom w:type="dxa" w:w="70"/>
+              <w:right w:type="dxa" w:w="110"/>
+            </w:tcMar>
+          </w:tcPr>
+          <w:p>
+            <w:pPr>
+              <w:spacing w:after="40"/>
+            </w:pPr>
+            <w:r>
+              <w:t xml:space="preserve">Stripe en </w:t>
+            </w:r>
+            <w:r>
+              <w:rPr>
+                <w:b/>
+                <w:bCs/>
+              </w:rPr>
+              <w:t xml:space="preserve">modo prueba</w:t>
+            </w:r>
+            <w:r>
+              <w:t xml:space="preserve"> (no se cobra dinero real). Si el registro en Stripe se complica, existe un respaldo: </w:t>
             </w:r>
             <w:r>
               <w:rPr>
@@ -733,10 +917,10 @@
                 <w:sz w:val="19"/>
                 <w:szCs w:val="19"/>
               </w:rPr>
-              <w:t xml:space="preserve">EXPO_PUBLIC_...</w:t>
-            </w:r>
-            <w:r>
-              <w:t xml:space="preserve">).</w:t>
+              <w:t xml:space="preserve">PAGOS_MODO=simulado</w:t>
+            </w:r>
+            <w:r>
+              <w:t xml:space="preserve"> acredita los créditos sin pasarela, sin cambiar la app.</w:t>
             </w:r>
           </w:p>
         </w:tc>
@@ -752,19 +936,20 @@
               <w:bottom w:val="single" w:color="CBD5E1" w:sz="4"/>
               <w:right w:val="single" w:color="CBD5E1" w:sz="4"/>
             </w:tcBorders>
-            <w:tcMar>
-              <w:top w:type="dxa" w:w="70"/>
-              <w:left w:type="dxa" w:w="110"/>
-              <w:bottom w:type="dxa" w:w="70"/>
-              <w:right w:type="dxa" w:w="110"/>
-            </w:tcMar>
-          </w:tcPr>
-          <w:p>
-            <w:pPr>
-              <w:spacing w:after="40"/>
-            </w:pPr>
-            <w:r>
-              <w:t xml:space="preserve">Pagos</w:t>
+            <w:shd w:fill="F1F5F9" w:color="auto" w:val="clear"/>
+            <w:tcMar>
+              <w:top w:type="dxa" w:w="70"/>
+              <w:left w:type="dxa" w:w="110"/>
+              <w:bottom w:type="dxa" w:w="70"/>
+              <w:right w:type="dxa" w:w="110"/>
+            </w:tcMar>
+          </w:tcPr>
+          <w:p>
+            <w:pPr>
+              <w:spacing w:after="40"/>
+            </w:pPr>
+            <w:r>
+              <w:t xml:space="preserve">Push requiere projectId</w:t>
             </w:r>
           </w:p>
         </w:tc>
@@ -778,29 +963,20 @@
               <w:bottom w:val="single" w:color="CBD5E1" w:sz="4"/>
               <w:right w:val="single" w:color="CBD5E1" w:sz="4"/>
             </w:tcBorders>
-            <w:tcMar>
-              <w:top w:type="dxa" w:w="70"/>
-              <w:left w:type="dxa" w:w="110"/>
-              <w:bottom w:type="dxa" w:w="70"/>
-              <w:right w:type="dxa" w:w="110"/>
-            </w:tcMar>
-          </w:tcPr>
-          <w:p>
-            <w:pPr>
-              <w:spacing w:after="40"/>
-            </w:pPr>
-            <w:r>
-              <w:t xml:space="preserve">Stripe en </w:t>
-            </w:r>
-            <w:r>
-              <w:rPr>
-                <w:b/>
-                <w:bCs/>
-              </w:rPr>
-              <w:t xml:space="preserve">modo prueba</w:t>
-            </w:r>
-            <w:r>
-              <w:t xml:space="preserve"> (no se cobra dinero real). Si el registro en Stripe se complica, existe un respaldo: </w:t>
+            <w:shd w:fill="F1F5F9" w:color="auto" w:val="clear"/>
+            <w:tcMar>
+              <w:top w:type="dxa" w:w="70"/>
+              <w:left w:type="dxa" w:w="110"/>
+              <w:bottom w:type="dxa" w:w="70"/>
+              <w:right w:type="dxa" w:w="110"/>
+            </w:tcMar>
+          </w:tcPr>
+          <w:p>
+            <w:pPr>
+              <w:spacing w:after="40"/>
+            </w:pPr>
+            <w:r>
+              <w:t xml:space="preserve">Para obtener el token de Expo Push se necesita un proyecto de EAS. Brayan ejecuta </w:t>
             </w:r>
             <w:r>
               <w:rPr>
@@ -809,66 +985,10 @@
                 <w:sz w:val="19"/>
                 <w:szCs w:val="19"/>
               </w:rPr>
-              <w:t xml:space="preserve">PAGOS_MODO=simulado</w:t>
-            </w:r>
-            <w:r>
-              <w:t xml:space="preserve"> acredita los créditos sin pasarela, sin cambiar la app.</w:t>
-            </w:r>
-          </w:p>
-        </w:tc>
-      </w:tr>
-      <w:tr>
-        <w:tc>
-          <w:tcPr>
-            <w:tcW w:type="dxa" w:w="2400"/>
-            <w:gridSpan w:val="1"/>
-            <w:tcBorders>
-              <w:top w:val="single" w:color="CBD5E1" w:sz="4"/>
-              <w:left w:val="single" w:color="CBD5E1" w:sz="4"/>
-              <w:bottom w:val="single" w:color="CBD5E1" w:sz="4"/>
-              <w:right w:val="single" w:color="CBD5E1" w:sz="4"/>
-            </w:tcBorders>
-            <w:shd w:fill="F1F5F9" w:color="auto" w:val="clear"/>
-            <w:tcMar>
-              <w:top w:type="dxa" w:w="70"/>
-              <w:left w:type="dxa" w:w="110"/>
-              <w:bottom w:type="dxa" w:w="70"/>
-              <w:right w:type="dxa" w:w="110"/>
-            </w:tcMar>
-          </w:tcPr>
-          <w:p>
-            <w:pPr>
-              <w:spacing w:after="40"/>
-            </w:pPr>
-            <w:r>
-              <w:t xml:space="preserve">Push requiere projectId</w:t>
-            </w:r>
-          </w:p>
-        </w:tc>
-        <w:tc>
-          <w:tcPr>
-            <w:tcW w:type="dxa" w:w="6960"/>
-            <w:gridSpan w:val="1"/>
-            <w:tcBorders>
-              <w:top w:val="single" w:color="CBD5E1" w:sz="4"/>
-              <w:left w:val="single" w:color="CBD5E1" w:sz="4"/>
-              <w:bottom w:val="single" w:color="CBD5E1" w:sz="4"/>
-              <w:right w:val="single" w:color="CBD5E1" w:sz="4"/>
-            </w:tcBorders>
-            <w:shd w:fill="F1F5F9" w:color="auto" w:val="clear"/>
-            <w:tcMar>
-              <w:top w:type="dxa" w:w="70"/>
-              <w:left w:type="dxa" w:w="110"/>
-              <w:bottom w:type="dxa" w:w="70"/>
-              <w:right w:type="dxa" w:w="110"/>
-            </w:tcMar>
-          </w:tcPr>
-          <w:p>
-            <w:pPr>
-              <w:spacing w:after="40"/>
-            </w:pPr>
-            <w:r>
-              <w:t xml:space="preserve">Para obtener el token de Expo Push se necesita un proyecto de EAS. El Integrante 5 ejecuta </w:t>
+              <w:t xml:space="preserve">npx eas init</w:t>
+            </w:r>
+            <w:r>
+              <w:t xml:space="preserve"> el día 1 y sube el </w:t>
             </w:r>
             <w:r>
               <w:rPr>
@@ -877,10 +997,10 @@
                 <w:sz w:val="19"/>
                 <w:szCs w:val="19"/>
               </w:rPr>
-              <w:t xml:space="preserve">npx eas init</w:t>
-            </w:r>
-            <w:r>
-              <w:t xml:space="preserve"> el día 1 y sube el </w:t>
+              <w:t xml:space="preserve">projectId</w:t>
+            </w:r>
+            <w:r>
+              <w:t xml:space="preserve"> en </w:t>
             </w:r>
             <w:r>
               <w:rPr>
@@ -889,10 +1009,64 @@
                 <w:sz w:val="19"/>
                 <w:szCs w:val="19"/>
               </w:rPr>
-              <w:t xml:space="preserve">projectId</w:t>
-            </w:r>
-            <w:r>
-              <w:t xml:space="preserve"> en </w:t>
+              <w:t xml:space="preserve">app.json</w:t>
+            </w:r>
+            <w:r>
+              <w:t xml:space="preserve">.</w:t>
+            </w:r>
+          </w:p>
+        </w:tc>
+      </w:tr>
+      <w:tr>
+        <w:tc>
+          <w:tcPr>
+            <w:tcW w:type="dxa" w:w="2400"/>
+            <w:gridSpan w:val="1"/>
+            <w:tcBorders>
+              <w:top w:val="single" w:color="CBD5E1" w:sz="4"/>
+              <w:left w:val="single" w:color="CBD5E1" w:sz="4"/>
+              <w:bottom w:val="single" w:color="CBD5E1" w:sz="4"/>
+              <w:right w:val="single" w:color="CBD5E1" w:sz="4"/>
+            </w:tcBorders>
+            <w:tcMar>
+              <w:top w:type="dxa" w:w="70"/>
+              <w:left w:type="dxa" w:w="110"/>
+              <w:bottom w:type="dxa" w:w="70"/>
+              <w:right w:type="dxa" w:w="110"/>
+            </w:tcMar>
+          </w:tcPr>
+          <w:p>
+            <w:pPr>
+              <w:spacing w:after="40"/>
+            </w:pPr>
+            <w:r>
+              <w:t xml:space="preserve">Red de la escuela</w:t>
+            </w:r>
+          </w:p>
+        </w:tc>
+        <w:tc>
+          <w:tcPr>
+            <w:tcW w:type="dxa" w:w="6960"/>
+            <w:gridSpan w:val="1"/>
+            <w:tcBorders>
+              <w:top w:val="single" w:color="CBD5E1" w:sz="4"/>
+              <w:left w:val="single" w:color="CBD5E1" w:sz="4"/>
+              <w:bottom w:val="single" w:color="CBD5E1" w:sz="4"/>
+              <w:right w:val="single" w:color="CBD5E1" w:sz="4"/>
+            </w:tcBorders>
+            <w:tcMar>
+              <w:top w:type="dxa" w:w="70"/>
+              <w:left w:type="dxa" w:w="110"/>
+              <w:bottom w:type="dxa" w:w="70"/>
+              <w:right w:type="dxa" w:w="110"/>
+            </w:tcMar>
+          </w:tcPr>
+          <w:p>
+            <w:pPr>
+              <w:spacing w:after="40"/>
+            </w:pPr>
+            <w:r>
+              <w:t xml:space="preserve">Si los celulares no se conectan al servidor de desarrollo (redes con aislamiento de clientes), usar </w:t>
             </w:r>
             <w:r>
               <w:rPr>
@@ -901,76 +1075,10 @@
                 <w:sz w:val="19"/>
                 <w:szCs w:val="19"/>
               </w:rPr>
-              <w:t xml:space="preserve">app.json</w:t>
-            </w:r>
-            <w:r>
-              <w:t xml:space="preserve">.</w:t>
-            </w:r>
-          </w:p>
-        </w:tc>
-      </w:tr>
-      <w:tr>
-        <w:tc>
-          <w:tcPr>
-            <w:tcW w:type="dxa" w:w="2400"/>
-            <w:gridSpan w:val="1"/>
-            <w:tcBorders>
-              <w:top w:val="single" w:color="CBD5E1" w:sz="4"/>
-              <w:left w:val="single" w:color="CBD5E1" w:sz="4"/>
-              <w:bottom w:val="single" w:color="CBD5E1" w:sz="4"/>
-              <w:right w:val="single" w:color="CBD5E1" w:sz="4"/>
-            </w:tcBorders>
-            <w:tcMar>
-              <w:top w:type="dxa" w:w="70"/>
-              <w:left w:type="dxa" w:w="110"/>
-              <w:bottom w:type="dxa" w:w="70"/>
-              <w:right w:type="dxa" w:w="110"/>
-            </w:tcMar>
-          </w:tcPr>
-          <w:p>
-            <w:pPr>
-              <w:spacing w:after="40"/>
-            </w:pPr>
-            <w:r>
-              <w:t xml:space="preserve">Red de la escuela</w:t>
-            </w:r>
-          </w:p>
-        </w:tc>
-        <w:tc>
-          <w:tcPr>
-            <w:tcW w:type="dxa" w:w="6960"/>
-            <w:gridSpan w:val="1"/>
-            <w:tcBorders>
-              <w:top w:val="single" w:color="CBD5E1" w:sz="4"/>
-              <w:left w:val="single" w:color="CBD5E1" w:sz="4"/>
-              <w:bottom w:val="single" w:color="CBD5E1" w:sz="4"/>
-              <w:right w:val="single" w:color="CBD5E1" w:sz="4"/>
-            </w:tcBorders>
-            <w:tcMar>
-              <w:top w:type="dxa" w:w="70"/>
-              <w:left w:type="dxa" w:w="110"/>
-              <w:bottom w:type="dxa" w:w="70"/>
-              <w:right w:type="dxa" w:w="110"/>
-            </w:tcMar>
-          </w:tcPr>
-          <w:p>
-            <w:pPr>
-              <w:spacing w:after="40"/>
-            </w:pPr>
-            <w:r>
-              <w:t xml:space="preserve">Si los celulares no se conectan al servidor de desarrollo (redes con aislamiento de clientes), usar </w:t>
-            </w:r>
-            <w:r>
-              <w:rPr>
-                <w:rFonts w:ascii="Consolas" w:cs="Consolas" w:eastAsia="Consolas" w:hAnsi="Consolas"/>
-                <w:color w:val="0F172A"/>
-                <w:sz w:val="19"/>
-                <w:szCs w:val="19"/>
-              </w:rPr>
               <w:t xml:space="preserve">npm run start:tunnel</w:t>
             </w:r>
             <w:r>
-              <w:t xml:space="preserve">.</w:t>
+              <w:t xml:space="preserve">. El emulador no tiene este problema porque corre en la misma PC.</w:t>
             </w:r>
           </w:p>
         </w:tc>
@@ -1193,7 +1301,7 @@
       <w:r>
         <w:drawing>
           <wp:inline distT="0" distB="0" distL="0" distR="0">
-            <wp:extent cx="5943600" cy="2235517"/>
+            <wp:extent cx="5943600" cy="2192953"/>
             <wp:effectExtent t="0" r="0" b="0" l="0"/>
             <wp:docPr id="1" name="Figura 1. Arquitectura general de la plataforma" descr="Figura 1. Arquitectura general de la plataforma" title="Figura 1. Arquitectura general de la plataforma"/>
             <wp:cNvGraphicFramePr>
@@ -1218,7 +1326,7 @@
                   <pic:spPr bwMode="auto">
                     <a:xfrm>
                       <a:off x="0" y="0"/>
-                      <a:ext cx="5943600" cy="2235517"/>
+                      <a:ext cx="5943600" cy="2192953"/>
                     </a:xfrm>
                     <a:prstGeom prst="rect">
                       <a:avLst/>
@@ -1448,7 +1556,7 @@
               <w:spacing w:after="40"/>
             </w:pPr>
             <w:r>
-              <w:t xml:space="preserve">Una sola base de código para Android e iOS.</w:t>
+              <w:t xml:space="preserve">App Android con development build (incluye módulos nativos).</w:t>
             </w:r>
           </w:p>
         </w:tc>
@@ -2454,7 +2562,7 @@
         <w:pStyle w:val="Heading1"/>
       </w:pPr>
       <w:r>
-        <w:t xml:space="preserve">4. Estrategia de desarrollo Android / iOS</w:t>
+        <w:t xml:space="preserve">4. Estrategia de desarrollo en Android</w:t>
       </w:r>
     </w:p>
     <w:p>
@@ -2462,7 +2570,29 @@
         <w:spacing w:after="120" w:line="276"/>
       </w:pPr>
       <w:r>
-        <w:t xml:space="preserve">El equipo tiene dos celulares Android en modo desarrollador y tres iPhone. Se trabaja con un único proyecto y dos formas de ejecutarlo:</w:t>
+        <w:t xml:space="preserve">La app se entrega solo para Android. Todo el equipo usa el mismo </w:t>
+      </w:r>
+      <w:r>
+        <w:rPr>
+          <w:b/>
+          <w:bCs/>
+        </w:rPr>
+        <w:t xml:space="preserve">development build</w:t>
+      </w:r>
+      <w:r>
+        <w:t xml:space="preserve">: una versión de la app con los módulos nativos ya incluidos que se conecta al servidor de desarrollo de cada quien (</w:t>
+      </w:r>
+      <w:r>
+        <w:rPr>
+          <w:rFonts w:ascii="Consolas" w:cs="Consolas" w:eastAsia="Consolas" w:hAnsi="Consolas"/>
+          <w:color w:val="0F172A"/>
+          <w:sz w:val="19"/>
+          <w:szCs w:val="19"/>
+        </w:rPr>
+        <w:t xml:space="preserve">npm start</w:t>
+      </w:r>
+      <w:r>
+        <w:t xml:space="preserve">) y recarga los cambios al instante.</w:t>
       </w:r>
     </w:p>
     <w:tbl>
@@ -2546,7 +2676,7 @@
                 <w:bCs/>
                 <w:color w:val="FFFFFF"/>
               </w:rPr>
-              <w:t xml:space="preserve">Android (2 integrantes)</w:t>
+              <w:t xml:space="preserve">Isabel y Brayan (celular físico)</w:t>
             </w:r>
           </w:p>
         </w:tc>
@@ -2578,7 +2708,7 @@
                 <w:bCs/>
                 <w:color w:val="FFFFFF"/>
               </w:rPr>
-              <w:t xml:space="preserve">iOS (3 integrantes)</w:t>
+              <w:t xml:space="preserve">Kassie, Jorge y Jeshua (emulador)</w:t>
             </w:r>
           </w:p>
         </w:tc>
@@ -2606,7 +2736,7 @@
               <w:spacing w:after="40"/>
             </w:pPr>
             <w:r>
-              <w:t xml:space="preserve">Cómo se ejecuta</w:t>
+              <w:t xml:space="preserve">Dispositivo</w:t>
             </w:r>
           </w:p>
         </w:tc>
@@ -2632,8 +2762,87 @@
               <w:spacing w:after="40"/>
             </w:pPr>
             <w:r>
-              <w:t xml:space="preserve">Development build: </w:t>
-            </w:r>
+              <w:t xml:space="preserve">Celular Android en modo desarrollador, conectado por USB o WiFi.</w:t>
+            </w:r>
+          </w:p>
+        </w:tc>
+        <w:tc>
+          <w:tcPr>
+            <w:tcW w:type="dxa" w:w="3680"/>
+            <w:gridSpan w:val="1"/>
+            <w:tcBorders>
+              <w:top w:val="single" w:color="CBD5E1" w:sz="4"/>
+              <w:left w:val="single" w:color="CBD5E1" w:sz="4"/>
+              <w:bottom w:val="single" w:color="CBD5E1" w:sz="4"/>
+              <w:right w:val="single" w:color="CBD5E1" w:sz="4"/>
+            </w:tcBorders>
+            <w:tcMar>
+              <w:top w:type="dxa" w:w="70"/>
+              <w:left w:type="dxa" w:w="110"/>
+              <w:bottom w:type="dxa" w:w="70"/>
+              <w:right w:type="dxa" w:w="110"/>
+            </w:tcMar>
+          </w:tcPr>
+          <w:p>
+            <w:pPr>
+              <w:spacing w:after="40"/>
+            </w:pPr>
+            <w:r>
+              <w:t xml:space="preserve">Emulador de Android Studio (imagen con Google Play, API 35 o superior).</w:t>
+            </w:r>
+          </w:p>
+        </w:tc>
+      </w:tr>
+      <w:tr>
+        <w:tc>
+          <w:tcPr>
+            <w:tcW w:type="dxa" w:w="2000"/>
+            <w:gridSpan w:val="1"/>
+            <w:tcBorders>
+              <w:top w:val="single" w:color="CBD5E1" w:sz="4"/>
+              <w:left w:val="single" w:color="CBD5E1" w:sz="4"/>
+              <w:bottom w:val="single" w:color="CBD5E1" w:sz="4"/>
+              <w:right w:val="single" w:color="CBD5E1" w:sz="4"/>
+            </w:tcBorders>
+            <w:shd w:fill="F1F5F9" w:color="auto" w:val="clear"/>
+            <w:tcMar>
+              <w:top w:type="dxa" w:w="70"/>
+              <w:left w:type="dxa" w:w="110"/>
+              <w:bottom w:type="dxa" w:w="70"/>
+              <w:right w:type="dxa" w:w="110"/>
+            </w:tcMar>
+          </w:tcPr>
+          <w:p>
+            <w:pPr>
+              <w:spacing w:after="40"/>
+            </w:pPr>
+            <w:r>
+              <w:t xml:space="preserve">Instalación de la app</w:t>
+            </w:r>
+          </w:p>
+        </w:tc>
+        <w:tc>
+          <w:tcPr>
+            <w:tcW w:type="dxa" w:w="3680"/>
+            <w:gridSpan w:val="1"/>
+            <w:tcBorders>
+              <w:top w:val="single" w:color="CBD5E1" w:sz="4"/>
+              <w:left w:val="single" w:color="CBD5E1" w:sz="4"/>
+              <w:bottom w:val="single" w:color="CBD5E1" w:sz="4"/>
+              <w:right w:val="single" w:color="CBD5E1" w:sz="4"/>
+            </w:tcBorders>
+            <w:shd w:fill="F1F5F9" w:color="auto" w:val="clear"/>
+            <w:tcMar>
+              <w:top w:type="dxa" w:w="70"/>
+              <w:left w:type="dxa" w:w="110"/>
+              <w:bottom w:type="dxa" w:w="70"/>
+              <w:right w:type="dxa" w:w="110"/>
+            </w:tcMar>
+          </w:tcPr>
+          <w:p>
+            <w:pPr>
+              <w:spacing w:after="40"/>
+            </w:pPr>
             <w:r>
               <w:rPr>
                 <w:rFonts w:ascii="Consolas" w:cs="Consolas" w:eastAsia="Consolas" w:hAnsi="Consolas"/>
@@ -2644,8 +2853,86 @@
               <w:t xml:space="preserve">npm run android</w:t>
             </w:r>
             <w:r>
-              <w:t xml:space="preserve"> compila e instala la app por USB. Después solo </w:t>
-            </w:r>
+              <w:t xml:space="preserve"> compila e instala el development build.</w:t>
+            </w:r>
+          </w:p>
+        </w:tc>
+        <w:tc>
+          <w:tcPr>
+            <w:tcW w:type="dxa" w:w="3680"/>
+            <w:gridSpan w:val="1"/>
+            <w:tcBorders>
+              <w:top w:val="single" w:color="CBD5E1" w:sz="4"/>
+              <w:left w:val="single" w:color="CBD5E1" w:sz="4"/>
+              <w:bottom w:val="single" w:color="CBD5E1" w:sz="4"/>
+              <w:right w:val="single" w:color="CBD5E1" w:sz="4"/>
+            </w:tcBorders>
+            <w:shd w:fill="F1F5F9" w:color="auto" w:val="clear"/>
+            <w:tcMar>
+              <w:top w:type="dxa" w:w="70"/>
+              <w:left w:type="dxa" w:w="110"/>
+              <w:bottom w:type="dxa" w:w="70"/>
+              <w:right w:type="dxa" w:w="110"/>
+            </w:tcMar>
+          </w:tcPr>
+          <w:p>
+            <w:pPr>
+              <w:spacing w:after="40"/>
+            </w:pPr>
+            <w:r>
+              <w:t xml:space="preserve">Arrastrar al emulador el APK de desarrollo que comparte Isabel.</w:t>
+            </w:r>
+          </w:p>
+        </w:tc>
+      </w:tr>
+      <w:tr>
+        <w:tc>
+          <w:tcPr>
+            <w:tcW w:type="dxa" w:w="2000"/>
+            <w:gridSpan w:val="1"/>
+            <w:tcBorders>
+              <w:top w:val="single" w:color="CBD5E1" w:sz="4"/>
+              <w:left w:val="single" w:color="CBD5E1" w:sz="4"/>
+              <w:bottom w:val="single" w:color="CBD5E1" w:sz="4"/>
+              <w:right w:val="single" w:color="CBD5E1" w:sz="4"/>
+            </w:tcBorders>
+            <w:tcMar>
+              <w:top w:type="dxa" w:w="70"/>
+              <w:left w:type="dxa" w:w="110"/>
+              <w:bottom w:type="dxa" w:w="70"/>
+              <w:right w:type="dxa" w:w="110"/>
+            </w:tcMar>
+          </w:tcPr>
+          <w:p>
+            <w:pPr>
+              <w:spacing w:after="40"/>
+            </w:pPr>
+            <w:r>
+              <w:t xml:space="preserve">Uso diario</w:t>
+            </w:r>
+          </w:p>
+        </w:tc>
+        <w:tc>
+          <w:tcPr>
+            <w:tcW w:type="dxa" w:w="3680"/>
+            <w:gridSpan w:val="1"/>
+            <w:tcBorders>
+              <w:top w:val="single" w:color="CBD5E1" w:sz="4"/>
+              <w:left w:val="single" w:color="CBD5E1" w:sz="4"/>
+              <w:bottom w:val="single" w:color="CBD5E1" w:sz="4"/>
+              <w:right w:val="single" w:color="CBD5E1" w:sz="4"/>
+            </w:tcBorders>
+            <w:tcMar>
+              <w:top w:type="dxa" w:w="70"/>
+              <w:left w:type="dxa" w:w="110"/>
+              <w:bottom w:type="dxa" w:w="70"/>
+              <w:right w:type="dxa" w:w="110"/>
+            </w:tcMar>
+          </w:tcPr>
+          <w:p>
+            <w:pPr>
+              <w:spacing w:after="40"/>
+            </w:pPr>
             <w:r>
               <w:rPr>
                 <w:rFonts w:ascii="Consolas" w:cs="Consolas" w:eastAsia="Consolas" w:hAnsi="Consolas"/>
@@ -2656,7 +2943,7 @@
               <w:t xml:space="preserve">npm start</w:t>
             </w:r>
             <w:r>
-              <w:t xml:space="preserve">.</w:t>
+              <w:t xml:space="preserve"> y abrir la app.</w:t>
             </w:r>
           </w:p>
         </w:tc>
@@ -2681,9 +2968,6 @@
             <w:pPr>
               <w:spacing w:after="40"/>
             </w:pPr>
-            <w:r>
-              <w:t xml:space="preserve">Expo Go: </w:t>
-            </w:r>
             <w:r>
               <w:rPr>
                 <w:rFonts w:ascii="Consolas" w:cs="Consolas" w:eastAsia="Consolas" w:hAnsi="Consolas"/>
@@ -2694,387 +2978,8 @@
               <w:t xml:space="preserve">npm start</w:t>
             </w:r>
             <w:r>
-              <w:t xml:space="preserve"> y escanear el QR con la cámara del iPhone.</w:t>
-            </w:r>
-          </w:p>
-        </w:tc>
-      </w:tr>
-      <w:tr>
-        <w:tc>
-          <w:tcPr>
-            <w:tcW w:type="dxa" w:w="2000"/>
-            <w:gridSpan w:val="1"/>
-            <w:tcBorders>
-              <w:top w:val="single" w:color="CBD5E1" w:sz="4"/>
-              <w:left w:val="single" w:color="CBD5E1" w:sz="4"/>
-              <w:bottom w:val="single" w:color="CBD5E1" w:sz="4"/>
-              <w:right w:val="single" w:color="CBD5E1" w:sz="4"/>
-            </w:tcBorders>
-            <w:shd w:fill="F1F5F9" w:color="auto" w:val="clear"/>
-            <w:tcMar>
-              <w:top w:type="dxa" w:w="70"/>
-              <w:left w:type="dxa" w:w="110"/>
-              <w:bottom w:type="dxa" w:w="70"/>
-              <w:right w:type="dxa" w:w="110"/>
-            </w:tcMar>
-          </w:tcPr>
-          <w:p>
-            <w:pPr>
-              <w:spacing w:after="40"/>
-            </w:pPr>
-            <w:r>
-              <w:t xml:space="preserve">Requisitos</w:t>
-            </w:r>
-          </w:p>
-        </w:tc>
-        <w:tc>
-          <w:tcPr>
-            <w:tcW w:type="dxa" w:w="3680"/>
-            <w:gridSpan w:val="1"/>
-            <w:tcBorders>
-              <w:top w:val="single" w:color="CBD5E1" w:sz="4"/>
-              <w:left w:val="single" w:color="CBD5E1" w:sz="4"/>
-              <w:bottom w:val="single" w:color="CBD5E1" w:sz="4"/>
-              <w:right w:val="single" w:color="CBD5E1" w:sz="4"/>
-            </w:tcBorders>
-            <w:shd w:fill="F1F5F9" w:color="auto" w:val="clear"/>
-            <w:tcMar>
-              <w:top w:type="dxa" w:w="70"/>
-              <w:left w:type="dxa" w:w="110"/>
-              <w:bottom w:type="dxa" w:w="70"/>
-              <w:right w:type="dxa" w:w="110"/>
-            </w:tcMar>
-          </w:tcPr>
-          <w:p>
-            <w:pPr>
-              <w:spacing w:after="40"/>
-            </w:pPr>
-            <w:r>
-              <w:t xml:space="preserve">Android Studio (SDK), depuración USB activa.</w:t>
-            </w:r>
-          </w:p>
-        </w:tc>
-        <w:tc>
-          <w:tcPr>
-            <w:tcW w:type="dxa" w:w="3680"/>
-            <w:gridSpan w:val="1"/>
-            <w:tcBorders>
-              <w:top w:val="single" w:color="CBD5E1" w:sz="4"/>
-              <w:left w:val="single" w:color="CBD5E1" w:sz="4"/>
-              <w:bottom w:val="single" w:color="CBD5E1" w:sz="4"/>
-              <w:right w:val="single" w:color="CBD5E1" w:sz="4"/>
-            </w:tcBorders>
-            <w:shd w:fill="F1F5F9" w:color="auto" w:val="clear"/>
-            <w:tcMar>
-              <w:top w:type="dxa" w:w="70"/>
-              <w:left w:type="dxa" w:w="110"/>
-              <w:bottom w:type="dxa" w:w="70"/>
-              <w:right w:type="dxa" w:w="110"/>
-            </w:tcMar>
-          </w:tcPr>
-          <w:p>
-            <w:pPr>
-              <w:spacing w:after="40"/>
-            </w:pPr>
-            <w:r>
-              <w:t xml:space="preserve">Expo Go actualizado (SDK 57).</w:t>
-            </w:r>
-          </w:p>
-        </w:tc>
-      </w:tr>
-      <w:tr>
-        <w:tc>
-          <w:tcPr>
-            <w:tcW w:type="dxa" w:w="2000"/>
-            <w:gridSpan w:val="1"/>
-            <w:tcBorders>
-              <w:top w:val="single" w:color="CBD5E1" w:sz="4"/>
-              <w:left w:val="single" w:color="CBD5E1" w:sz="4"/>
-              <w:bottom w:val="single" w:color="CBD5E1" w:sz="4"/>
-              <w:right w:val="single" w:color="CBD5E1" w:sz="4"/>
-            </w:tcBorders>
-            <w:tcMar>
-              <w:top w:type="dxa" w:w="70"/>
-              <w:left w:type="dxa" w:w="110"/>
-              <w:bottom w:type="dxa" w:w="70"/>
-              <w:right w:type="dxa" w:w="110"/>
-            </w:tcMar>
-          </w:tcPr>
-          <w:p>
-            <w:pPr>
-              <w:spacing w:after="40"/>
-            </w:pPr>
-            <w:r>
-              <w:t xml:space="preserve">Cámara, GPS, sensores</w:t>
-            </w:r>
-          </w:p>
-        </w:tc>
-        <w:tc>
-          <w:tcPr>
-            <w:tcW w:type="dxa" w:w="3680"/>
-            <w:gridSpan w:val="1"/>
-            <w:tcBorders>
-              <w:top w:val="single" w:color="CBD5E1" w:sz="4"/>
-              <w:left w:val="single" w:color="CBD5E1" w:sz="4"/>
-              <w:bottom w:val="single" w:color="CBD5E1" w:sz="4"/>
-              <w:right w:val="single" w:color="CBD5E1" w:sz="4"/>
-            </w:tcBorders>
-            <w:tcMar>
-              <w:top w:type="dxa" w:w="70"/>
-              <w:left w:type="dxa" w:w="110"/>
-              <w:bottom w:type="dxa" w:w="70"/>
-              <w:right w:type="dxa" w:w="110"/>
-            </w:tcMar>
-          </w:tcPr>
-          <w:p>
-            <w:pPr>
-              <w:spacing w:after="40"/>
-            </w:pPr>
-            <w:r>
-              <w:t xml:space="preserve">Sí</w:t>
-            </w:r>
-          </w:p>
-        </w:tc>
-        <w:tc>
-          <w:tcPr>
-            <w:tcW w:type="dxa" w:w="3680"/>
-            <w:gridSpan w:val="1"/>
-            <w:tcBorders>
-              <w:top w:val="single" w:color="CBD5E1" w:sz="4"/>
-              <w:left w:val="single" w:color="CBD5E1" w:sz="4"/>
-              <w:bottom w:val="single" w:color="CBD5E1" w:sz="4"/>
-              <w:right w:val="single" w:color="CBD5E1" w:sz="4"/>
-            </w:tcBorders>
-            <w:tcMar>
-              <w:top w:type="dxa" w:w="70"/>
-              <w:left w:type="dxa" w:w="110"/>
-              <w:bottom w:type="dxa" w:w="70"/>
-              <w:right w:type="dxa" w:w="110"/>
-            </w:tcMar>
-          </w:tcPr>
-          <w:p>
-            <w:pPr>
-              <w:spacing w:after="40"/>
-            </w:pPr>
-            <w:r>
-              <w:t xml:space="preserve">Sí</w:t>
-            </w:r>
-          </w:p>
-        </w:tc>
-      </w:tr>
-      <w:tr>
-        <w:tc>
-          <w:tcPr>
-            <w:tcW w:type="dxa" w:w="2000"/>
-            <w:gridSpan w:val="1"/>
-            <w:tcBorders>
-              <w:top w:val="single" w:color="CBD5E1" w:sz="4"/>
-              <w:left w:val="single" w:color="CBD5E1" w:sz="4"/>
-              <w:bottom w:val="single" w:color="CBD5E1" w:sz="4"/>
-              <w:right w:val="single" w:color="CBD5E1" w:sz="4"/>
-            </w:tcBorders>
-            <w:shd w:fill="F1F5F9" w:color="auto" w:val="clear"/>
-            <w:tcMar>
-              <w:top w:type="dxa" w:w="70"/>
-              <w:left w:type="dxa" w:w="110"/>
-              <w:bottom w:type="dxa" w:w="70"/>
-              <w:right w:type="dxa" w:w="110"/>
-            </w:tcMar>
-          </w:tcPr>
-          <w:p>
-            <w:pPr>
-              <w:spacing w:after="40"/>
-            </w:pPr>
-            <w:r>
-              <w:t xml:space="preserve">Tiempo real y pagos</w:t>
-            </w:r>
-          </w:p>
-        </w:tc>
-        <w:tc>
-          <w:tcPr>
-            <w:tcW w:type="dxa" w:w="3680"/>
-            <w:gridSpan w:val="1"/>
-            <w:tcBorders>
-              <w:top w:val="single" w:color="CBD5E1" w:sz="4"/>
-              <w:left w:val="single" w:color="CBD5E1" w:sz="4"/>
-              <w:bottom w:val="single" w:color="CBD5E1" w:sz="4"/>
-              <w:right w:val="single" w:color="CBD5E1" w:sz="4"/>
-            </w:tcBorders>
-            <w:shd w:fill="F1F5F9" w:color="auto" w:val="clear"/>
-            <w:tcMar>
-              <w:top w:type="dxa" w:w="70"/>
-              <w:left w:type="dxa" w:w="110"/>
-              <w:bottom w:type="dxa" w:w="70"/>
-              <w:right w:type="dxa" w:w="110"/>
-            </w:tcMar>
-          </w:tcPr>
-          <w:p>
-            <w:pPr>
-              <w:spacing w:after="40"/>
-            </w:pPr>
-            <w:r>
-              <w:t xml:space="preserve">Sí</w:t>
-            </w:r>
-          </w:p>
-        </w:tc>
-        <w:tc>
-          <w:tcPr>
-            <w:tcW w:type="dxa" w:w="3680"/>
-            <w:gridSpan w:val="1"/>
-            <w:tcBorders>
-              <w:top w:val="single" w:color="CBD5E1" w:sz="4"/>
-              <w:left w:val="single" w:color="CBD5E1" w:sz="4"/>
-              <w:bottom w:val="single" w:color="CBD5E1" w:sz="4"/>
-              <w:right w:val="single" w:color="CBD5E1" w:sz="4"/>
-            </w:tcBorders>
-            <w:shd w:fill="F1F5F9" w:color="auto" w:val="clear"/>
-            <w:tcMar>
-              <w:top w:type="dxa" w:w="70"/>
-              <w:left w:type="dxa" w:w="110"/>
-              <w:bottom w:type="dxa" w:w="70"/>
-              <w:right w:type="dxa" w:w="110"/>
-            </w:tcMar>
-          </w:tcPr>
-          <w:p>
-            <w:pPr>
-              <w:spacing w:after="40"/>
-            </w:pPr>
-            <w:r>
-              <w:t xml:space="preserve">Sí</w:t>
-            </w:r>
-          </w:p>
-        </w:tc>
-      </w:tr>
-      <w:tr>
-        <w:tc>
-          <w:tcPr>
-            <w:tcW w:type="dxa" w:w="2000"/>
-            <w:gridSpan w:val="1"/>
-            <w:tcBorders>
-              <w:top w:val="single" w:color="CBD5E1" w:sz="4"/>
-              <w:left w:val="single" w:color="CBD5E1" w:sz="4"/>
-              <w:bottom w:val="single" w:color="CBD5E1" w:sz="4"/>
-              <w:right w:val="single" w:color="CBD5E1" w:sz="4"/>
-            </w:tcBorders>
-            <w:tcMar>
-              <w:top w:type="dxa" w:w="70"/>
-              <w:left w:type="dxa" w:w="110"/>
-              <w:bottom w:type="dxa" w:w="70"/>
-              <w:right w:type="dxa" w:w="110"/>
-            </w:tcMar>
-          </w:tcPr>
-          <w:p>
-            <w:pPr>
-              <w:spacing w:after="40"/>
-            </w:pPr>
-            <w:r>
-              <w:t xml:space="preserve">Push remoto</w:t>
-            </w:r>
-          </w:p>
-        </w:tc>
-        <w:tc>
-          <w:tcPr>
-            <w:tcW w:type="dxa" w:w="3680"/>
-            <w:gridSpan w:val="1"/>
-            <w:tcBorders>
-              <w:top w:val="single" w:color="CBD5E1" w:sz="4"/>
-              <w:left w:val="single" w:color="CBD5E1" w:sz="4"/>
-              <w:bottom w:val="single" w:color="CBD5E1" w:sz="4"/>
-              <w:right w:val="single" w:color="CBD5E1" w:sz="4"/>
-            </w:tcBorders>
-            <w:tcMar>
-              <w:top w:type="dxa" w:w="70"/>
-              <w:left w:type="dxa" w:w="110"/>
-              <w:bottom w:type="dxa" w:w="70"/>
-              <w:right w:type="dxa" w:w="110"/>
-            </w:tcMar>
-          </w:tcPr>
-          <w:p>
-            <w:pPr>
-              <w:spacing w:after="40"/>
-            </w:pPr>
-            <w:r>
-              <w:t xml:space="preserve">Sí (development build)</w:t>
-            </w:r>
-          </w:p>
-        </w:tc>
-        <w:tc>
-          <w:tcPr>
-            <w:tcW w:type="dxa" w:w="3680"/>
-            <w:gridSpan w:val="1"/>
-            <w:tcBorders>
-              <w:top w:val="single" w:color="CBD5E1" w:sz="4"/>
-              <w:left w:val="single" w:color="CBD5E1" w:sz="4"/>
-              <w:bottom w:val="single" w:color="CBD5E1" w:sz="4"/>
-              <w:right w:val="single" w:color="CBD5E1" w:sz="4"/>
-            </w:tcBorders>
-            <w:tcMar>
-              <w:top w:type="dxa" w:w="70"/>
-              <w:left w:type="dxa" w:w="110"/>
-              <w:bottom w:type="dxa" w:w="70"/>
-              <w:right w:type="dxa" w:w="110"/>
-            </w:tcMar>
-          </w:tcPr>
-          <w:p>
-            <w:pPr>
-              <w:spacing w:after="40"/>
-            </w:pPr>
-            <w:r>
-              <w:t xml:space="preserve">Sí (Expo Go en iOS)</w:t>
-            </w:r>
-          </w:p>
-        </w:tc>
-      </w:tr>
-      <w:tr>
-        <w:tc>
-          <w:tcPr>
-            <w:tcW w:type="dxa" w:w="2000"/>
-            <w:gridSpan w:val="1"/>
-            <w:tcBorders>
-              <w:top w:val="single" w:color="CBD5E1" w:sz="4"/>
-              <w:left w:val="single" w:color="CBD5E1" w:sz="4"/>
-              <w:bottom w:val="single" w:color="CBD5E1" w:sz="4"/>
-              <w:right w:val="single" w:color="CBD5E1" w:sz="4"/>
-            </w:tcBorders>
-            <w:shd w:fill="F1F5F9" w:color="auto" w:val="clear"/>
-            <w:tcMar>
-              <w:top w:type="dxa" w:w="70"/>
-              <w:left w:type="dxa" w:w="110"/>
-              <w:bottom w:type="dxa" w:w="70"/>
-              <w:right w:type="dxa" w:w="110"/>
-            </w:tcMar>
-          </w:tcPr>
-          <w:p>
-            <w:pPr>
-              <w:spacing w:after="40"/>
-            </w:pPr>
-            <w:r>
-              <w:t xml:space="preserve">APK para la demo</w:t>
-            </w:r>
-          </w:p>
-        </w:tc>
-        <w:tc>
-          <w:tcPr>
-            <w:tcW w:type="dxa" w:w="3680"/>
-            <w:gridSpan w:val="1"/>
-            <w:tcBorders>
-              <w:top w:val="single" w:color="CBD5E1" w:sz="4"/>
-              <w:left w:val="single" w:color="CBD5E1" w:sz="4"/>
-              <w:bottom w:val="single" w:color="CBD5E1" w:sz="4"/>
-              <w:right w:val="single" w:color="CBD5E1" w:sz="4"/>
-            </w:tcBorders>
-            <w:shd w:fill="F1F5F9" w:color="auto" w:val="clear"/>
-            <w:tcMar>
-              <w:top w:type="dxa" w:w="70"/>
-              <w:left w:type="dxa" w:w="110"/>
-              <w:bottom w:type="dxa" w:w="70"/>
-              <w:right w:type="dxa" w:w="110"/>
-            </w:tcMar>
-          </w:tcPr>
-          <w:p>
-            <w:pPr>
-              <w:spacing w:after="40"/>
-            </w:pPr>
+              <w:t xml:space="preserve"> y presionar </w:t>
+            </w:r>
             <w:r>
               <w:rPr>
                 <w:rFonts w:ascii="Consolas" w:cs="Consolas" w:eastAsia="Consolas" w:hAnsi="Consolas"/>
@@ -3082,10 +2987,39 @@
                 <w:sz w:val="19"/>
                 <w:szCs w:val="19"/>
               </w:rPr>
-              <w:t xml:space="preserve">eas build --profile preview -p android</w:t>
-            </w:r>
-            <w:r>
-              <w:t xml:space="preserve"> genera un APK instalable.</w:t>
+              <w:t xml:space="preserve">a</w:t>
+            </w:r>
+            <w:r>
+              <w:t xml:space="preserve"> para abrir en el emulador.</w:t>
+            </w:r>
+          </w:p>
+        </w:tc>
+      </w:tr>
+      <w:tr>
+        <w:tc>
+          <w:tcPr>
+            <w:tcW w:type="dxa" w:w="2000"/>
+            <w:gridSpan w:val="1"/>
+            <w:tcBorders>
+              <w:top w:val="single" w:color="CBD5E1" w:sz="4"/>
+              <w:left w:val="single" w:color="CBD5E1" w:sz="4"/>
+              <w:bottom w:val="single" w:color="CBD5E1" w:sz="4"/>
+              <w:right w:val="single" w:color="CBD5E1" w:sz="4"/>
+            </w:tcBorders>
+            <w:shd w:fill="F1F5F9" w:color="auto" w:val="clear"/>
+            <w:tcMar>
+              <w:top w:type="dxa" w:w="70"/>
+              <w:left w:type="dxa" w:w="110"/>
+              <w:bottom w:type="dxa" w:w="70"/>
+              <w:right w:type="dxa" w:w="110"/>
+            </w:tcMar>
+          </w:tcPr>
+          <w:p>
+            <w:pPr>
+              <w:spacing w:after="40"/>
+            </w:pPr>
+            <w:r>
+              <w:t xml:space="preserve">Cámara</w:t>
             </w:r>
           </w:p>
         </w:tc>
@@ -3112,7 +3046,277 @@
               <w:spacing w:after="40"/>
             </w:pPr>
             <w:r>
-              <w:t xml:space="preserve">Se presenta desde Expo Go.</w:t>
+              <w:t xml:space="preserve">Real</w:t>
+            </w:r>
+          </w:p>
+        </w:tc>
+        <w:tc>
+          <w:tcPr>
+            <w:tcW w:type="dxa" w:w="3680"/>
+            <w:gridSpan w:val="1"/>
+            <w:tcBorders>
+              <w:top w:val="single" w:color="CBD5E1" w:sz="4"/>
+              <w:left w:val="single" w:color="CBD5E1" w:sz="4"/>
+              <w:bottom w:val="single" w:color="CBD5E1" w:sz="4"/>
+              <w:right w:val="single" w:color="CBD5E1" w:sz="4"/>
+            </w:tcBorders>
+            <w:shd w:fill="F1F5F9" w:color="auto" w:val="clear"/>
+            <w:tcMar>
+              <w:top w:type="dxa" w:w="70"/>
+              <w:left w:type="dxa" w:w="110"/>
+              <w:bottom w:type="dxa" w:w="70"/>
+              <w:right w:type="dxa" w:w="110"/>
+            </w:tcMar>
+          </w:tcPr>
+          <w:p>
+            <w:pPr>
+              <w:spacing w:after="40"/>
+            </w:pPr>
+            <w:r>
+              <w:t xml:space="preserve">Webcam de la PC o escena virtual</w:t>
+            </w:r>
+          </w:p>
+        </w:tc>
+      </w:tr>
+      <w:tr>
+        <w:tc>
+          <w:tcPr>
+            <w:tcW w:type="dxa" w:w="2000"/>
+            <w:gridSpan w:val="1"/>
+            <w:tcBorders>
+              <w:top w:val="single" w:color="CBD5E1" w:sz="4"/>
+              <w:left w:val="single" w:color="CBD5E1" w:sz="4"/>
+              <w:bottom w:val="single" w:color="CBD5E1" w:sz="4"/>
+              <w:right w:val="single" w:color="CBD5E1" w:sz="4"/>
+            </w:tcBorders>
+            <w:tcMar>
+              <w:top w:type="dxa" w:w="70"/>
+              <w:left w:type="dxa" w:w="110"/>
+              <w:bottom w:type="dxa" w:w="70"/>
+              <w:right w:type="dxa" w:w="110"/>
+            </w:tcMar>
+          </w:tcPr>
+          <w:p>
+            <w:pPr>
+              <w:spacing w:after="40"/>
+            </w:pPr>
+            <w:r>
+              <w:t xml:space="preserve">GPS</w:t>
+            </w:r>
+          </w:p>
+        </w:tc>
+        <w:tc>
+          <w:tcPr>
+            <w:tcW w:type="dxa" w:w="3680"/>
+            <w:gridSpan w:val="1"/>
+            <w:tcBorders>
+              <w:top w:val="single" w:color="CBD5E1" w:sz="4"/>
+              <w:left w:val="single" w:color="CBD5E1" w:sz="4"/>
+              <w:bottom w:val="single" w:color="CBD5E1" w:sz="4"/>
+              <w:right w:val="single" w:color="CBD5E1" w:sz="4"/>
+            </w:tcBorders>
+            <w:tcMar>
+              <w:top w:type="dxa" w:w="70"/>
+              <w:left w:type="dxa" w:w="110"/>
+              <w:bottom w:type="dxa" w:w="70"/>
+              <w:right w:type="dxa" w:w="110"/>
+            </w:tcMar>
+          </w:tcPr>
+          <w:p>
+            <w:pPr>
+              <w:spacing w:after="40"/>
+            </w:pPr>
+            <w:r>
+              <w:t xml:space="preserve">Real</w:t>
+            </w:r>
+          </w:p>
+        </w:tc>
+        <w:tc>
+          <w:tcPr>
+            <w:tcW w:type="dxa" w:w="3680"/>
+            <w:gridSpan w:val="1"/>
+            <w:tcBorders>
+              <w:top w:val="single" w:color="CBD5E1" w:sz="4"/>
+              <w:left w:val="single" w:color="CBD5E1" w:sz="4"/>
+              <w:bottom w:val="single" w:color="CBD5E1" w:sz="4"/>
+              <w:right w:val="single" w:color="CBD5E1" w:sz="4"/>
+            </w:tcBorders>
+            <w:tcMar>
+              <w:top w:type="dxa" w:w="70"/>
+              <w:left w:type="dxa" w:w="110"/>
+              <w:bottom w:type="dxa" w:w="70"/>
+              <w:right w:type="dxa" w:w="110"/>
+            </w:tcMar>
+          </w:tcPr>
+          <w:p>
+            <w:pPr>
+              <w:spacing w:after="40"/>
+            </w:pPr>
+            <w:r>
+              <w:t xml:space="preserve">Ubicación simulada (Extended controls &gt; Location)</w:t>
+            </w:r>
+          </w:p>
+        </w:tc>
+      </w:tr>
+      <w:tr>
+        <w:tc>
+          <w:tcPr>
+            <w:tcW w:type="dxa" w:w="2000"/>
+            <w:gridSpan w:val="1"/>
+            <w:tcBorders>
+              <w:top w:val="single" w:color="CBD5E1" w:sz="4"/>
+              <w:left w:val="single" w:color="CBD5E1" w:sz="4"/>
+              <w:bottom w:val="single" w:color="CBD5E1" w:sz="4"/>
+              <w:right w:val="single" w:color="CBD5E1" w:sz="4"/>
+            </w:tcBorders>
+            <w:shd w:fill="F1F5F9" w:color="auto" w:val="clear"/>
+            <w:tcMar>
+              <w:top w:type="dxa" w:w="70"/>
+              <w:left w:type="dxa" w:w="110"/>
+              <w:bottom w:type="dxa" w:w="70"/>
+              <w:right w:type="dxa" w:w="110"/>
+            </w:tcMar>
+          </w:tcPr>
+          <w:p>
+            <w:pPr>
+              <w:spacing w:after="40"/>
+            </w:pPr>
+            <w:r>
+              <w:t xml:space="preserve">Acelerómetro y giroscopio</w:t>
+            </w:r>
+          </w:p>
+        </w:tc>
+        <w:tc>
+          <w:tcPr>
+            <w:tcW w:type="dxa" w:w="3680"/>
+            <w:gridSpan w:val="1"/>
+            <w:tcBorders>
+              <w:top w:val="single" w:color="CBD5E1" w:sz="4"/>
+              <w:left w:val="single" w:color="CBD5E1" w:sz="4"/>
+              <w:bottom w:val="single" w:color="CBD5E1" w:sz="4"/>
+              <w:right w:val="single" w:color="CBD5E1" w:sz="4"/>
+            </w:tcBorders>
+            <w:shd w:fill="F1F5F9" w:color="auto" w:val="clear"/>
+            <w:tcMar>
+              <w:top w:type="dxa" w:w="70"/>
+              <w:left w:type="dxa" w:w="110"/>
+              <w:bottom w:type="dxa" w:w="70"/>
+              <w:right w:type="dxa" w:w="110"/>
+            </w:tcMar>
+          </w:tcPr>
+          <w:p>
+            <w:pPr>
+              <w:spacing w:after="40"/>
+            </w:pPr>
+            <w:r>
+              <w:t xml:space="preserve">Reales (validación final)</w:t>
+            </w:r>
+          </w:p>
+        </w:tc>
+        <w:tc>
+          <w:tcPr>
+            <w:tcW w:type="dxa" w:w="3680"/>
+            <w:gridSpan w:val="1"/>
+            <w:tcBorders>
+              <w:top w:val="single" w:color="CBD5E1" w:sz="4"/>
+              <w:left w:val="single" w:color="CBD5E1" w:sz="4"/>
+              <w:bottom w:val="single" w:color="CBD5E1" w:sz="4"/>
+              <w:right w:val="single" w:color="CBD5E1" w:sz="4"/>
+            </w:tcBorders>
+            <w:shd w:fill="F1F5F9" w:color="auto" w:val="clear"/>
+            <w:tcMar>
+              <w:top w:type="dxa" w:w="70"/>
+              <w:left w:type="dxa" w:w="110"/>
+              <w:bottom w:type="dxa" w:w="70"/>
+              <w:right w:type="dxa" w:w="110"/>
+            </w:tcMar>
+          </w:tcPr>
+          <w:p>
+            <w:pPr>
+              <w:spacing w:after="40"/>
+            </w:pPr>
+            <w:r>
+              <w:t xml:space="preserve">Virtual sensors (Extended controls)</w:t>
+            </w:r>
+          </w:p>
+        </w:tc>
+      </w:tr>
+      <w:tr>
+        <w:tc>
+          <w:tcPr>
+            <w:tcW w:type="dxa" w:w="2000"/>
+            <w:gridSpan w:val="1"/>
+            <w:tcBorders>
+              <w:top w:val="single" w:color="CBD5E1" w:sz="4"/>
+              <w:left w:val="single" w:color="CBD5E1" w:sz="4"/>
+              <w:bottom w:val="single" w:color="CBD5E1" w:sz="4"/>
+              <w:right w:val="single" w:color="CBD5E1" w:sz="4"/>
+            </w:tcBorders>
+            <w:tcMar>
+              <w:top w:type="dxa" w:w="70"/>
+              <w:left w:type="dxa" w:w="110"/>
+              <w:bottom w:type="dxa" w:w="70"/>
+              <w:right w:type="dxa" w:w="110"/>
+            </w:tcMar>
+          </w:tcPr>
+          <w:p>
+            <w:pPr>
+              <w:spacing w:after="40"/>
+            </w:pPr>
+            <w:r>
+              <w:t xml:space="preserve">Push, pagos, tiempo real</w:t>
+            </w:r>
+          </w:p>
+        </w:tc>
+        <w:tc>
+          <w:tcPr>
+            <w:tcW w:type="dxa" w:w="3680"/>
+            <w:gridSpan w:val="1"/>
+            <w:tcBorders>
+              <w:top w:val="single" w:color="CBD5E1" w:sz="4"/>
+              <w:left w:val="single" w:color="CBD5E1" w:sz="4"/>
+              <w:bottom w:val="single" w:color="CBD5E1" w:sz="4"/>
+              <w:right w:val="single" w:color="CBD5E1" w:sz="4"/>
+            </w:tcBorders>
+            <w:tcMar>
+              <w:top w:type="dxa" w:w="70"/>
+              <w:left w:type="dxa" w:w="110"/>
+              <w:bottom w:type="dxa" w:w="70"/>
+              <w:right w:type="dxa" w:w="110"/>
+            </w:tcMar>
+          </w:tcPr>
+          <w:p>
+            <w:pPr>
+              <w:spacing w:after="40"/>
+            </w:pPr>
+            <w:r>
+              <w:t xml:space="preserve">Sí</w:t>
+            </w:r>
+          </w:p>
+        </w:tc>
+        <w:tc>
+          <w:tcPr>
+            <w:tcW w:type="dxa" w:w="3680"/>
+            <w:gridSpan w:val="1"/>
+            <w:tcBorders>
+              <w:top w:val="single" w:color="CBD5E1" w:sz="4"/>
+              <w:left w:val="single" w:color="CBD5E1" w:sz="4"/>
+              <w:bottom w:val="single" w:color="CBD5E1" w:sz="4"/>
+              <w:right w:val="single" w:color="CBD5E1" w:sz="4"/>
+            </w:tcBorders>
+            <w:tcMar>
+              <w:top w:type="dxa" w:w="70"/>
+              <w:left w:type="dxa" w:w="110"/>
+              <w:bottom w:type="dxa" w:w="70"/>
+              <w:right w:type="dxa" w:w="110"/>
+            </w:tcMar>
+          </w:tcPr>
+          <w:p>
+            <w:pPr>
+              <w:spacing w:after="40"/>
+            </w:pPr>
+            <w:r>
+              <w:t xml:space="preserve">Sí</w:t>
             </w:r>
           </w:p>
         </w:tc>
@@ -3122,6 +3326,86 @@
       <w:pPr>
         <w:spacing w:after="80"/>
       </w:pPr>
+    </w:p>
+    <w:p>
+      <w:pPr>
+        <w:pStyle w:val="Heading2"/>
+      </w:pPr>
+      <w:r>
+        <w:t xml:space="preserve">4.1 APK de desarrollo compartido</w:t>
+      </w:r>
+    </w:p>
+    <w:p>
+      <w:pPr>
+        <w:spacing w:after="120" w:line="276"/>
+      </w:pPr>
+      <w:r>
+        <w:t xml:space="preserve">Isabel compila el development build una vez (</w:t>
+      </w:r>
+      <w:r>
+        <w:rPr>
+          <w:rFonts w:ascii="Consolas" w:cs="Consolas" w:eastAsia="Consolas" w:hAnsi="Consolas"/>
+          <w:color w:val="0F172A"/>
+          <w:sz w:val="19"/>
+          <w:szCs w:val="19"/>
+        </w:rPr>
+        <w:t xml:space="preserve">npm run android</w:t>
+      </w:r>
+      <w:r>
+        <w:t xml:space="preserve">) y comparte el archivo </w:t>
+      </w:r>
+      <w:r>
+        <w:rPr>
+          <w:rFonts w:ascii="Consolas" w:cs="Consolas" w:eastAsia="Consolas" w:hAnsi="Consolas"/>
+          <w:color w:val="0F172A"/>
+          <w:sz w:val="19"/>
+          <w:szCs w:val="19"/>
+        </w:rPr>
+        <w:t xml:space="preserve">android/app/build/outputs/apk/debug/app-debug.apk</w:t>
+      </w:r>
+      <w:r>
+        <w:t xml:space="preserve"> por Drive o WhatsApp. Ese APK sirve para cualquier integrante porque solo contiene la parte nativa; el código de cada quien se carga desde su propia PC. Se vuelve a generar únicamente cuando se agrega una librería nativa o se cambian permisos o plugins en </w:t>
+      </w:r>
+      <w:r>
+        <w:rPr>
+          <w:rFonts w:ascii="Consolas" w:cs="Consolas" w:eastAsia="Consolas" w:hAnsi="Consolas"/>
+          <w:color w:val="0F172A"/>
+          <w:sz w:val="19"/>
+          <w:szCs w:val="19"/>
+        </w:rPr>
+        <w:t xml:space="preserve">app.json</w:t>
+      </w:r>
+      <w:r>
+        <w:t xml:space="preserve">.</w:t>
+      </w:r>
+    </w:p>
+    <w:p>
+      <w:pPr>
+        <w:pStyle w:val="Heading2"/>
+      </w:pPr>
+      <w:r>
+        <w:t xml:space="preserve">4.2 APK final para la demo</w:t>
+      </w:r>
+    </w:p>
+    <w:p>
+      <w:pPr>
+        <w:spacing w:after="120" w:line="276"/>
+      </w:pPr>
+      <w:r>
+        <w:t xml:space="preserve">Brayan genera el APK independiente con </w:t>
+      </w:r>
+      <w:r>
+        <w:rPr>
+          <w:rFonts w:ascii="Consolas" w:cs="Consolas" w:eastAsia="Consolas" w:hAnsi="Consolas"/>
+          <w:color w:val="0F172A"/>
+          <w:sz w:val="19"/>
+          <w:szCs w:val="19"/>
+        </w:rPr>
+        <w:t xml:space="preserve">eas build --profile preview -p android</w:t>
+      </w:r>
+      <w:r>
+        <w:t xml:space="preserve">. Ese APK ya no necesita una PC conectada y es el que se instala en los celulares de la presentación.</w:t>
+      </w:r>
     </w:p>
     <w:tbl>
       <w:tblPr>
@@ -3174,7 +3458,7 @@
               <w:spacing w:after="0"/>
             </w:pPr>
             <w:r>
-              <w:t xml:space="preserve">Si una función no se puede probar en un iPhone con Expo Go, no entra al proyecto. Así los cinco integrantes pueden probar todo y nadie se queda bloqueado.</w:t>
+              <w:t xml:space="preserve">Nada se da por terminado hasta probarse en un celular Android físico (Isabel o Brayan). El emulador sirve para desarrollar, pero los sensores y las notificaciones se validan en hardware real.</w:t>
             </w:r>
           </w:p>
         </w:tc>
@@ -8287,6 +8571,14 @@
         <w:t xml:space="preserve">9.1 Responsables por carpeta</w:t>
       </w:r>
     </w:p>
+    <w:p>
+      <w:pPr>
+        <w:spacing w:after="120" w:line="276"/>
+      </w:pPr>
+      <w:r>
+        <w:t xml:space="preserve">Isabel y Brayan, que tienen celular Android, toman los módulos que dependen del hardware y de la configuración nativa: sensores y notificaciones push. Isabel genera el APK de desarrollo y Brayan el APK final de la demo.</w:t>
+      </w:r>
+    </w:p>
     <w:tbl>
       <w:tblPr>
         <w:tblW w:type="dxa" w:w="9360"/>
@@ -8300,9 +8592,9 @@
         </w:tblBorders>
       </w:tblPr>
       <w:tblGrid>
-        <w:gridCol w:w="1300"/>
-        <w:gridCol w:w="1900"/>
-        <w:gridCol w:w="6160"/>
+        <w:gridCol w:w="2100"/>
+        <w:gridCol w:w="1700"/>
+        <w:gridCol w:w="5560"/>
       </w:tblGrid>
       <w:tr>
         <w:trPr>
@@ -8310,7 +8602,7 @@
         </w:trPr>
         <w:tc>
           <w:tcPr>
-            <w:tcW w:type="dxa" w:w="1300"/>
+            <w:tcW w:type="dxa" w:w="2100"/>
             <w:gridSpan w:val="1"/>
             <w:tcBorders>
               <w:top w:val="single" w:color="CBD5E1" w:sz="4"/>
@@ -8342,7 +8634,7 @@
         </w:tc>
         <w:tc>
           <w:tcPr>
-            <w:tcW w:type="dxa" w:w="1900"/>
+            <w:tcW w:type="dxa" w:w="1700"/>
             <w:gridSpan w:val="1"/>
             <w:tcBorders>
               <w:top w:val="single" w:color="CBD5E1" w:sz="4"/>
@@ -8374,7 +8666,7 @@
         </w:tc>
         <w:tc>
           <w:tcPr>
-            <w:tcW w:type="dxa" w:w="6160"/>
+            <w:tcW w:type="dxa" w:w="5560"/>
             <w:gridSpan w:val="1"/>
             <w:tcBorders>
               <w:top w:val="single" w:color="CBD5E1" w:sz="4"/>
@@ -8408,33 +8700,33 @@
       <w:tr>
         <w:tc>
           <w:tcPr>
-            <w:tcW w:type="dxa" w:w="1300"/>
-            <w:gridSpan w:val="1"/>
-            <w:tcBorders>
-              <w:top w:val="single" w:color="CBD5E1" w:sz="4"/>
-              <w:left w:val="single" w:color="CBD5E1" w:sz="4"/>
-              <w:bottom w:val="single" w:color="CBD5E1" w:sz="4"/>
-              <w:right w:val="single" w:color="CBD5E1" w:sz="4"/>
-            </w:tcBorders>
-            <w:tcMar>
-              <w:top w:type="dxa" w:w="70"/>
-              <w:left w:type="dxa" w:w="110"/>
-              <w:bottom w:type="dxa" w:w="70"/>
-              <w:right w:type="dxa" w:w="110"/>
-            </w:tcMar>
-          </w:tcPr>
-          <w:p>
-            <w:pPr>
-              <w:spacing w:after="40"/>
-            </w:pPr>
-            <w:r>
-              <w:t xml:space="preserve">1</w:t>
-            </w:r>
-          </w:p>
-        </w:tc>
-        <w:tc>
-          <w:tcPr>
-            <w:tcW w:type="dxa" w:w="1900"/>
+            <w:tcW w:type="dxa" w:w="2100"/>
+            <w:gridSpan w:val="1"/>
+            <w:tcBorders>
+              <w:top w:val="single" w:color="CBD5E1" w:sz="4"/>
+              <w:left w:val="single" w:color="CBD5E1" w:sz="4"/>
+              <w:bottom w:val="single" w:color="CBD5E1" w:sz="4"/>
+              <w:right w:val="single" w:color="CBD5E1" w:sz="4"/>
+            </w:tcBorders>
+            <w:tcMar>
+              <w:top w:type="dxa" w:w="70"/>
+              <w:left w:type="dxa" w:w="110"/>
+              <w:bottom w:type="dxa" w:w="70"/>
+              <w:right w:type="dxa" w:w="110"/>
+            </w:tcMar>
+          </w:tcPr>
+          <w:p>
+            <w:pPr>
+              <w:spacing w:after="40"/>
+            </w:pPr>
+            <w:r>
+              <w:t xml:space="preserve">1. Kassie (emulador)</w:t>
+            </w:r>
+          </w:p>
+        </w:tc>
+        <w:tc>
+          <w:tcPr>
+            <w:tcW w:type="dxa" w:w="1700"/>
             <w:gridSpan w:val="1"/>
             <w:tcBorders>
               <w:top w:val="single" w:color="CBD5E1" w:sz="4"/>
@@ -8460,7 +8752,7 @@
         </w:tc>
         <w:tc>
           <w:tcPr>
-            <w:tcW w:type="dxa" w:w="6160"/>
+            <w:tcW w:type="dxa" w:w="5560"/>
             <w:gridSpan w:val="1"/>
             <w:tcBorders>
               <w:top w:val="single" w:color="CBD5E1" w:sz="4"/>
@@ -8521,7 +8813,7 @@
       <w:tr>
         <w:tc>
           <w:tcPr>
-            <w:tcW w:type="dxa" w:w="1300"/>
+            <w:tcW w:type="dxa" w:w="2100"/>
             <w:gridSpan w:val="1"/>
             <w:tcBorders>
               <w:top w:val="single" w:color="CBD5E1" w:sz="4"/>
@@ -8542,13 +8834,13 @@
               <w:spacing w:after="40"/>
             </w:pPr>
             <w:r>
-              <w:t xml:space="preserve">2</w:t>
-            </w:r>
-          </w:p>
-        </w:tc>
-        <w:tc>
-          <w:tcPr>
-            <w:tcW w:type="dxa" w:w="1900"/>
+              <w:t xml:space="preserve">2. Jorge (emulador)</w:t>
+            </w:r>
+          </w:p>
+        </w:tc>
+        <w:tc>
+          <w:tcPr>
+            <w:tcW w:type="dxa" w:w="1700"/>
             <w:gridSpan w:val="1"/>
             <w:tcBorders>
               <w:top w:val="single" w:color="CBD5E1" w:sz="4"/>
@@ -8575,7 +8867,7 @@
         </w:tc>
         <w:tc>
           <w:tcPr>
-            <w:tcW w:type="dxa" w:w="6160"/>
+            <w:tcW w:type="dxa" w:w="5560"/>
             <w:gridSpan w:val="1"/>
             <w:tcBorders>
               <w:top w:val="single" w:color="CBD5E1" w:sz="4"/>
@@ -8646,33 +8938,33 @@
       <w:tr>
         <w:tc>
           <w:tcPr>
-            <w:tcW w:type="dxa" w:w="1300"/>
-            <w:gridSpan w:val="1"/>
-            <w:tcBorders>
-              <w:top w:val="single" w:color="CBD5E1" w:sz="4"/>
-              <w:left w:val="single" w:color="CBD5E1" w:sz="4"/>
-              <w:bottom w:val="single" w:color="CBD5E1" w:sz="4"/>
-              <w:right w:val="single" w:color="CBD5E1" w:sz="4"/>
-            </w:tcBorders>
-            <w:tcMar>
-              <w:top w:type="dxa" w:w="70"/>
-              <w:left w:type="dxa" w:w="110"/>
-              <w:bottom w:type="dxa" w:w="70"/>
-              <w:right w:type="dxa" w:w="110"/>
-            </w:tcMar>
-          </w:tcPr>
-          <w:p>
-            <w:pPr>
-              <w:spacing w:after="40"/>
-            </w:pPr>
-            <w:r>
-              <w:t xml:space="preserve">3</w:t>
-            </w:r>
-          </w:p>
-        </w:tc>
-        <w:tc>
-          <w:tcPr>
-            <w:tcW w:type="dxa" w:w="1900"/>
+            <w:tcW w:type="dxa" w:w="2100"/>
+            <w:gridSpan w:val="1"/>
+            <w:tcBorders>
+              <w:top w:val="single" w:color="CBD5E1" w:sz="4"/>
+              <w:left w:val="single" w:color="CBD5E1" w:sz="4"/>
+              <w:bottom w:val="single" w:color="CBD5E1" w:sz="4"/>
+              <w:right w:val="single" w:color="CBD5E1" w:sz="4"/>
+            </w:tcBorders>
+            <w:tcMar>
+              <w:top w:type="dxa" w:w="70"/>
+              <w:left w:type="dxa" w:w="110"/>
+              <w:bottom w:type="dxa" w:w="70"/>
+              <w:right w:type="dxa" w:w="110"/>
+            </w:tcMar>
+          </w:tcPr>
+          <w:p>
+            <w:pPr>
+              <w:spacing w:after="40"/>
+            </w:pPr>
+            <w:r>
+              <w:t xml:space="preserve">3. Jeshua (emulador)</w:t>
+            </w:r>
+          </w:p>
+        </w:tc>
+        <w:tc>
+          <w:tcPr>
+            <w:tcW w:type="dxa" w:w="1700"/>
             <w:gridSpan w:val="1"/>
             <w:tcBorders>
               <w:top w:val="single" w:color="CBD5E1" w:sz="4"/>
@@ -8698,7 +8990,7 @@
         </w:tc>
         <w:tc>
           <w:tcPr>
-            <w:tcW w:type="dxa" w:w="6160"/>
+            <w:tcW w:type="dxa" w:w="5560"/>
             <w:gridSpan w:val="1"/>
             <w:tcBorders>
               <w:top w:val="single" w:color="CBD5E1" w:sz="4"/>
@@ -8768,7 +9060,7 @@
       <w:tr>
         <w:tc>
           <w:tcPr>
-            <w:tcW w:type="dxa" w:w="1300"/>
+            <w:tcW w:type="dxa" w:w="2100"/>
             <w:gridSpan w:val="1"/>
             <w:tcBorders>
               <w:top w:val="single" w:color="CBD5E1" w:sz="4"/>
@@ -8789,13 +9081,13 @@
               <w:spacing w:after="40"/>
             </w:pPr>
             <w:r>
-              <w:t xml:space="preserve">4</w:t>
-            </w:r>
-          </w:p>
-        </w:tc>
-        <w:tc>
-          <w:tcPr>
-            <w:tcW w:type="dxa" w:w="1900"/>
+              <w:t xml:space="preserve">4. Isabel (celular)</w:t>
+            </w:r>
+          </w:p>
+        </w:tc>
+        <w:tc>
+          <w:tcPr>
+            <w:tcW w:type="dxa" w:w="1700"/>
             <w:gridSpan w:val="1"/>
             <w:tcBorders>
               <w:top w:val="single" w:color="CBD5E1" w:sz="4"/>
@@ -8822,7 +9114,7 @@
         </w:tc>
         <w:tc>
           <w:tcPr>
-            <w:tcW w:type="dxa" w:w="6160"/>
+            <w:tcW w:type="dxa" w:w="5560"/>
             <w:gridSpan w:val="1"/>
             <w:tcBorders>
               <w:top w:val="single" w:color="CBD5E1" w:sz="4"/>
@@ -8905,33 +9197,33 @@
       <w:tr>
         <w:tc>
           <w:tcPr>
-            <w:tcW w:type="dxa" w:w="1300"/>
-            <w:gridSpan w:val="1"/>
-            <w:tcBorders>
-              <w:top w:val="single" w:color="CBD5E1" w:sz="4"/>
-              <w:left w:val="single" w:color="CBD5E1" w:sz="4"/>
-              <w:bottom w:val="single" w:color="CBD5E1" w:sz="4"/>
-              <w:right w:val="single" w:color="CBD5E1" w:sz="4"/>
-            </w:tcBorders>
-            <w:tcMar>
-              <w:top w:type="dxa" w:w="70"/>
-              <w:left w:type="dxa" w:w="110"/>
-              <w:bottom w:type="dxa" w:w="70"/>
-              <w:right w:type="dxa" w:w="110"/>
-            </w:tcMar>
-          </w:tcPr>
-          <w:p>
-            <w:pPr>
-              <w:spacing w:after="40"/>
-            </w:pPr>
-            <w:r>
-              <w:t xml:space="preserve">5</w:t>
-            </w:r>
-          </w:p>
-        </w:tc>
-        <w:tc>
-          <w:tcPr>
-            <w:tcW w:type="dxa" w:w="1900"/>
+            <w:tcW w:type="dxa" w:w="2100"/>
+            <w:gridSpan w:val="1"/>
+            <w:tcBorders>
+              <w:top w:val="single" w:color="CBD5E1" w:sz="4"/>
+              <w:left w:val="single" w:color="CBD5E1" w:sz="4"/>
+              <w:bottom w:val="single" w:color="CBD5E1" w:sz="4"/>
+              <w:right w:val="single" w:color="CBD5E1" w:sz="4"/>
+            </w:tcBorders>
+            <w:tcMar>
+              <w:top w:type="dxa" w:w="70"/>
+              <w:left w:type="dxa" w:w="110"/>
+              <w:bottom w:type="dxa" w:w="70"/>
+              <w:right w:type="dxa" w:w="110"/>
+            </w:tcMar>
+          </w:tcPr>
+          <w:p>
+            <w:pPr>
+              <w:spacing w:after="40"/>
+            </w:pPr>
+            <w:r>
+              <w:t xml:space="preserve">5. Brayan (celular)</w:t>
+            </w:r>
+          </w:p>
+        </w:tc>
+        <w:tc>
+          <w:tcPr>
+            <w:tcW w:type="dxa" w:w="1700"/>
             <w:gridSpan w:val="1"/>
             <w:tcBorders>
               <w:top w:val="single" w:color="CBD5E1" w:sz="4"/>
@@ -8957,7 +9249,7 @@
         </w:tc>
         <w:tc>
           <w:tcPr>
-            <w:tcW w:type="dxa" w:w="6160"/>
+            <w:tcW w:type="dxa" w:w="5560"/>
             <w:gridSpan w:val="1"/>
             <w:tcBorders>
               <w:top w:val="single" w:color="CBD5E1" w:sz="4"/>
@@ -9051,7 +9343,7 @@
       <w:tr>
         <w:tc>
           <w:tcPr>
-            <w:tcW w:type="dxa" w:w="1300"/>
+            <w:tcW w:type="dxa" w:w="2100"/>
             <w:gridSpan w:val="1"/>
             <w:tcBorders>
               <w:top w:val="single" w:color="CBD5E1" w:sz="4"/>
@@ -9072,13 +9364,13 @@
               <w:spacing w:after="40"/>
             </w:pPr>
             <w:r>
-              <w:t xml:space="preserve">1, 3 y 4</w:t>
-            </w:r>
-          </w:p>
-        </w:tc>
-        <w:tc>
-          <w:tcPr>
-            <w:tcW w:type="dxa" w:w="1900"/>
+              <w:t xml:space="preserve">Kassie, Jeshua e Isabel</w:t>
+            </w:r>
+          </w:p>
+        </w:tc>
+        <w:tc>
+          <w:tcPr>
+            <w:tcW w:type="dxa" w:w="1700"/>
             <w:gridSpan w:val="1"/>
             <w:tcBorders>
               <w:top w:val="single" w:color="CBD5E1" w:sz="4"/>
@@ -9105,7 +9397,7 @@
         </w:tc>
         <w:tc>
           <w:tcPr>
-            <w:tcW w:type="dxa" w:w="6160"/>
+            <w:tcW w:type="dxa" w:w="5560"/>
             <w:gridSpan w:val="1"/>
             <w:tcBorders>
               <w:top w:val="single" w:color="CBD5E1" w:sz="4"/>
@@ -9684,7 +9976,7 @@
         <w:spacing w:after="60"/>
       </w:pPr>
       <w:r>
-        <w:t xml:space="preserve">Cada Pull Request lo revisa y prueba otro integrante en su celular (idealmente uno con el sistema operativo contrario).</w:t>
+        <w:t xml:space="preserve">Cada Pull Request lo revisa otro integrante. Si toca sensores, cámara o push, se valida en el celular de Isabel o Brayan antes de aprobarlo.</w:t>
       </w:r>
     </w:p>
     <w:p>
@@ -9807,7 +10099,7 @@
         <w:t xml:space="preserve">npx supabase migration new &lt;nombre&gt;</w:t>
       </w:r>
       <w:r>
-        <w:t xml:space="preserve">), revisada por el Integrante 2. Después, </w:t>
+        <w:t xml:space="preserve">), revisada por Jorge (Backend y BD). Después, </w:t>
       </w:r>
       <w:r>
         <w:rPr>
@@ -9922,7 +10214,7 @@
         <w:pStyle w:val="Heading2"/>
       </w:pPr>
       <w:r>
-        <w:t xml:space="preserve">11.1 Integrante 2: Supabase</w:t>
+        <w:t xml:space="preserve">11.1 Jorge (Integrante 2): Supabase</w:t>
       </w:r>
     </w:p>
     <w:p>
@@ -10092,7 +10384,7 @@
         <w:pStyle w:val="Heading2"/>
       </w:pPr>
       <w:r>
-        <w:t xml:space="preserve">11.2 Integrante 5: Stripe, push y funciones</w:t>
+        <w:t xml:space="preserve">11.2 Brayan (Integrante 5): Stripe, push y funciones</w:t>
       </w:r>
     </w:p>
     <w:p>
@@ -10191,6 +10483,117 @@
         <w:spacing w:after="60"/>
       </w:pPr>
       <w:r>
+        <w:t xml:space="preserve">Crear un proyecto en Firebase, agregar una app Android con el paquete </w:t>
+      </w:r>
+      <w:r>
+        <w:rPr>
+          <w:rFonts w:ascii="Consolas" w:cs="Consolas" w:eastAsia="Consolas" w:hAnsi="Consolas"/>
+          <w:color w:val="0F172A"/>
+          <w:sz w:val="19"/>
+          <w:szCs w:val="19"/>
+        </w:rPr>
+        <w:t xml:space="preserve">mx.utslrc.subasta</w:t>
+      </w:r>
+      <w:r>
+        <w:t xml:space="preserve"> y descargar </w:t>
+      </w:r>
+      <w:r>
+        <w:rPr>
+          <w:rFonts w:ascii="Consolas" w:cs="Consolas" w:eastAsia="Consolas" w:hAnsi="Consolas"/>
+          <w:color w:val="0F172A"/>
+          <w:sz w:val="19"/>
+          <w:szCs w:val="19"/>
+        </w:rPr>
+        <w:t xml:space="preserve">google-services.json</w:t>
+      </w:r>
+      <w:r>
+        <w:t xml:space="preserve"> a la raíz del repo. En </w:t>
+      </w:r>
+      <w:r>
+        <w:rPr>
+          <w:rFonts w:ascii="Consolas" w:cs="Consolas" w:eastAsia="Consolas" w:hAnsi="Consolas"/>
+          <w:color w:val="0F172A"/>
+          <w:sz w:val="19"/>
+          <w:szCs w:val="19"/>
+        </w:rPr>
+        <w:t xml:space="preserve">app.json</w:t>
+      </w:r>
+      <w:r>
+        <w:t xml:space="preserve">, dentro de </w:t>
+      </w:r>
+      <w:r>
+        <w:rPr>
+          <w:rFonts w:ascii="Consolas" w:cs="Consolas" w:eastAsia="Consolas" w:hAnsi="Consolas"/>
+          <w:color w:val="0F172A"/>
+          <w:sz w:val="19"/>
+          <w:szCs w:val="19"/>
+        </w:rPr>
+        <w:t xml:space="preserve">android</w:t>
+      </w:r>
+      <w:r>
+        <w:t xml:space="preserve">, agregar </w:t>
+      </w:r>
+      <w:r>
+        <w:rPr>
+          <w:rFonts w:ascii="Consolas" w:cs="Consolas" w:eastAsia="Consolas" w:hAnsi="Consolas"/>
+          <w:color w:val="0F172A"/>
+          <w:sz w:val="19"/>
+          <w:szCs w:val="19"/>
+        </w:rPr>
+        <w:t xml:space="preserve">"googleServicesFile": "./google-services.json"</w:t>
+      </w:r>
+      <w:r>
+        <w:t xml:space="preserve">.</w:t>
+      </w:r>
+    </w:p>
+    <w:p>
+      <w:pPr>
+        <w:pStyle w:val="ListParagraph"/>
+        <w:numPr>
+          <w:ilvl w:val="0"/>
+          <w:numId w:val="5"/>
+        </w:numPr>
+        <w:spacing w:after="60"/>
+      </w:pPr>
+      <w:r>
+        <w:t xml:space="preserve">En Firebase &gt; Configuración &gt; Cuentas de servicio, generar la llave privada y subirla con </w:t>
+      </w:r>
+      <w:r>
+        <w:rPr>
+          <w:rFonts w:ascii="Consolas" w:cs="Consolas" w:eastAsia="Consolas" w:hAnsi="Consolas"/>
+          <w:color w:val="0F172A"/>
+          <w:sz w:val="19"/>
+          <w:szCs w:val="19"/>
+        </w:rPr>
+        <w:t xml:space="preserve">npx eas credentials</w:t>
+      </w:r>
+      <w:r>
+        <w:t xml:space="preserve"> (opción FCM V1). Esta llave nunca va al repositorio.</w:t>
+      </w:r>
+    </w:p>
+    <w:p>
+      <w:pPr>
+        <w:pStyle w:val="ListParagraph"/>
+        <w:numPr>
+          <w:ilvl w:val="0"/>
+          <w:numId w:val="5"/>
+        </w:numPr>
+        <w:spacing w:after="60"/>
+      </w:pPr>
+      <w:r>
+        <w:t xml:space="preserve">Avisar a Isabel para que regenere el APK de desarrollo con la configuración de Firebase.</w:t>
+      </w:r>
+    </w:p>
+    <w:p>
+      <w:pPr>
+        <w:pStyle w:val="ListParagraph"/>
+        <w:numPr>
+          <w:ilvl w:val="0"/>
+          <w:numId w:val="5"/>
+        </w:numPr>
+        <w:spacing w:after="60"/>
+      </w:pPr>
+      <w:r>
         <w:t xml:space="preserve">Copiar </w:t>
       </w:r>
       <w:r>
@@ -10358,7 +10761,7 @@
         <w:pStyle w:val="Heading2"/>
       </w:pPr>
       <w:r>
-        <w:t xml:space="preserve">11.3 Integrante 3: cierre automático</w:t>
+        <w:t xml:space="preserve">11.3 Jeshua (Integrante 3): cierre automático</w:t>
       </w:r>
     </w:p>
     <w:p>
@@ -10415,7 +10818,159 @@
         <w:pStyle w:val="Heading2"/>
       </w:pPr>
       <w:r>
-        <w:t xml:space="preserve">11.4 Todos</w:t>
+        <w:t xml:space="preserve">11.4 Isabel: APK de desarrollo</w:t>
+      </w:r>
+    </w:p>
+    <w:p>
+      <w:pPr>
+        <w:pStyle w:val="ListParagraph"/>
+        <w:numPr>
+          <w:ilvl w:val="0"/>
+          <w:numId w:val="7"/>
+        </w:numPr>
+        <w:spacing w:after="60"/>
+      </w:pPr>
+      <w:r>
+        <w:t xml:space="preserve">Con el celular conectado, ejecutar </w:t>
+      </w:r>
+      <w:r>
+        <w:rPr>
+          <w:rFonts w:ascii="Consolas" w:cs="Consolas" w:eastAsia="Consolas" w:hAnsi="Consolas"/>
+          <w:color w:val="0F172A"/>
+          <w:sz w:val="19"/>
+          <w:szCs w:val="19"/>
+        </w:rPr>
+        <w:t xml:space="preserve">npm run android</w:t>
+      </w:r>
+      <w:r>
+        <w:t xml:space="preserve">.</w:t>
+      </w:r>
+    </w:p>
+    <w:p>
+      <w:pPr>
+        <w:pStyle w:val="ListParagraph"/>
+        <w:numPr>
+          <w:ilvl w:val="0"/>
+          <w:numId w:val="7"/>
+        </w:numPr>
+        <w:spacing w:after="60"/>
+      </w:pPr>
+      <w:r>
+        <w:t xml:space="preserve">Compartir </w:t>
+      </w:r>
+      <w:r>
+        <w:rPr>
+          <w:rFonts w:ascii="Consolas" w:cs="Consolas" w:eastAsia="Consolas" w:hAnsi="Consolas"/>
+          <w:color w:val="0F172A"/>
+          <w:sz w:val="19"/>
+          <w:szCs w:val="19"/>
+        </w:rPr>
+        <w:t xml:space="preserve">android/app/build/outputs/apk/debug/app-debug.apk</w:t>
+      </w:r>
+      <w:r>
+        <w:t xml:space="preserve"> con el equipo.</w:t>
+      </w:r>
+    </w:p>
+    <w:p>
+      <w:pPr>
+        <w:pStyle w:val="Heading2"/>
+      </w:pPr>
+      <w:r>
+        <w:t xml:space="preserve">11.5 Kassie, Jorge y Jeshua: emulador</w:t>
+      </w:r>
+    </w:p>
+    <w:p>
+      <w:pPr>
+        <w:pStyle w:val="ListParagraph"/>
+        <w:numPr>
+          <w:ilvl w:val="0"/>
+          <w:numId w:val="8"/>
+        </w:numPr>
+        <w:spacing w:after="60"/>
+      </w:pPr>
+      <w:r>
+        <w:t xml:space="preserve">Instalar Android Studio y, en Device Manager, crear un dispositivo Pixel con imagen </w:t>
+      </w:r>
+      <w:r>
+        <w:rPr>
+          <w:b/>
+          <w:bCs/>
+        </w:rPr>
+        <w:t xml:space="preserve">Google Play</w:t>
+      </w:r>
+      <w:r>
+        <w:t xml:space="preserve"> (API 35 o superior).</w:t>
+      </w:r>
+    </w:p>
+    <w:p>
+      <w:pPr>
+        <w:pStyle w:val="ListParagraph"/>
+        <w:numPr>
+          <w:ilvl w:val="0"/>
+          <w:numId w:val="8"/>
+        </w:numPr>
+        <w:spacing w:after="60"/>
+      </w:pPr>
+      <w:r>
+        <w:t xml:space="preserve">Iniciar el emulador y arrastrar el APK de desarrollo a la ventana para instalarlo.</w:t>
+      </w:r>
+    </w:p>
+    <w:p>
+      <w:pPr>
+        <w:pStyle w:val="ListParagraph"/>
+        <w:numPr>
+          <w:ilvl w:val="0"/>
+          <w:numId w:val="8"/>
+        </w:numPr>
+        <w:spacing w:after="60"/>
+      </w:pPr>
+      <w:r>
+        <w:t xml:space="preserve">En la PC: </w:t>
+      </w:r>
+      <w:r>
+        <w:rPr>
+          <w:rFonts w:ascii="Consolas" w:cs="Consolas" w:eastAsia="Consolas" w:hAnsi="Consolas"/>
+          <w:color w:val="0F172A"/>
+          <w:sz w:val="19"/>
+          <w:szCs w:val="19"/>
+        </w:rPr>
+        <w:t xml:space="preserve">npm start</w:t>
+      </w:r>
+      <w:r>
+        <w:t xml:space="preserve"> y presionar </w:t>
+      </w:r>
+      <w:r>
+        <w:rPr>
+          <w:rFonts w:ascii="Consolas" w:cs="Consolas" w:eastAsia="Consolas" w:hAnsi="Consolas"/>
+          <w:color w:val="0F172A"/>
+          <w:sz w:val="19"/>
+          <w:szCs w:val="19"/>
+        </w:rPr>
+        <w:t xml:space="preserve">a</w:t>
+      </w:r>
+      <w:r>
+        <w:t xml:space="preserve">. La app se abre en el emulador con el código local.</w:t>
+      </w:r>
+    </w:p>
+    <w:p>
+      <w:pPr>
+        <w:pStyle w:val="ListParagraph"/>
+        <w:numPr>
+          <w:ilvl w:val="0"/>
+          <w:numId w:val="8"/>
+        </w:numPr>
+        <w:spacing w:after="60"/>
+      </w:pPr>
+      <w:r>
+        <w:t xml:space="preserve">Iniciar sesión en Google dentro del emulador para recibir notificaciones push.</w:t>
+      </w:r>
+    </w:p>
+    <w:p>
+      <w:pPr>
+        <w:pStyle w:val="Heading2"/>
+      </w:pPr>
+      <w:r>
+        <w:t xml:space="preserve">11.6 Todos</w:t>
       </w:r>
     </w:p>
     <w:tbl>
@@ -10513,20 +11068,7 @@
                 <w:sz w:val="18"/>
                 <w:szCs w:val="18"/>
               </w:rPr>
-              <w:t xml:space="preserve">npm start                        # iOS: escanear QR con Expo Go</w:t>
-            </w:r>
-          </w:p>
-          <w:p>
-            <w:pPr>
-              <w:spacing w:after="0"/>
-            </w:pPr>
-            <w:r>
-              <w:rPr>
-                <w:rFonts w:ascii="Consolas" w:cs="Consolas" w:eastAsia="Consolas" w:hAnsi="Consolas"/>
-                <w:sz w:val="18"/>
-                <w:szCs w:val="18"/>
-              </w:rPr>
-              <w:t xml:space="preserve">npm run android                  # Android: compila el development build</w:t>
+              <w:t xml:space="preserve">npm start                        # luego 'a' para abrir en el emulador o celular</w:t>
             </w:r>
           </w:p>
         </w:tc>
@@ -10629,28 +11171,9 @@
                 <w:bCs/>
                 <w:color w:val="FFFFFF"/>
               </w:rPr>
-              <w:t xml:space="preserve">Int. 1 Frontend</w:t>
-            </w:r>
-          </w:p>
-        </w:tc>
-        <w:tc>
-          <w:tcPr>
-            <w:tcW w:type="dxa" w:w="1760"/>
-            <w:gridSpan w:val="1"/>
-            <w:tcBorders>
-              <w:top w:val="single" w:color="CBD5E1" w:sz="4"/>
-              <w:left w:val="single" w:color="CBD5E1" w:sz="4"/>
-              <w:bottom w:val="single" w:color="CBD5E1" w:sz="4"/>
-              <w:right w:val="single" w:color="CBD5E1" w:sz="4"/>
-            </w:tcBorders>
-            <w:shd w:fill="1D4ED8" w:color="auto" w:val="clear"/>
-            <w:tcMar>
-              <w:top w:type="dxa" w:w="70"/>
-              <w:left w:type="dxa" w:w="110"/>
-              <w:bottom w:type="dxa" w:w="70"/>
-              <w:right w:type="dxa" w:w="110"/>
-            </w:tcMar>
-          </w:tcPr>
+              <w:t xml:space="preserve">Kassie</w:t>
+            </w:r>
+          </w:p>
           <w:p>
             <w:pPr>
               <w:spacing w:after="40"/>
@@ -10661,7 +11184,7 @@
                 <w:bCs/>
                 <w:color w:val="FFFFFF"/>
               </w:rPr>
-              <w:t xml:space="preserve">Int. 2 Backend y BD</w:t>
+              <w:t xml:space="preserve">Frontend</w:t>
             </w:r>
           </w:p>
         </w:tc>
@@ -10693,28 +11216,9 @@
                 <w:bCs/>
                 <w:color w:val="FFFFFF"/>
               </w:rPr>
-              <w:t xml:space="preserve">Int. 3 Tiempo real</w:t>
-            </w:r>
-          </w:p>
-        </w:tc>
-        <w:tc>
-          <w:tcPr>
-            <w:tcW w:type="dxa" w:w="1720"/>
-            <w:gridSpan w:val="1"/>
-            <w:tcBorders>
-              <w:top w:val="single" w:color="CBD5E1" w:sz="4"/>
-              <w:left w:val="single" w:color="CBD5E1" w:sz="4"/>
-              <w:bottom w:val="single" w:color="CBD5E1" w:sz="4"/>
-              <w:right w:val="single" w:color="CBD5E1" w:sz="4"/>
-            </w:tcBorders>
-            <w:shd w:fill="1D4ED8" w:color="auto" w:val="clear"/>
-            <w:tcMar>
-              <w:top w:type="dxa" w:w="70"/>
-              <w:left w:type="dxa" w:w="110"/>
-              <w:bottom w:type="dxa" w:w="70"/>
-              <w:right w:type="dxa" w:w="110"/>
-            </w:tcMar>
-          </w:tcPr>
+              <w:t xml:space="preserve">Jorge</w:t>
+            </w:r>
+          </w:p>
           <w:p>
             <w:pPr>
               <w:spacing w:after="40"/>
@@ -10725,13 +11229,13 @@
                 <w:bCs/>
                 <w:color w:val="FFFFFF"/>
               </w:rPr>
-              <w:t xml:space="preserve">Int. 4 Sensores</w:t>
-            </w:r>
-          </w:p>
-        </w:tc>
-        <w:tc>
-          <w:tcPr>
-            <w:tcW w:type="dxa" w:w="1800"/>
+              <w:t xml:space="preserve">Backend y BD</w:t>
+            </w:r>
+          </w:p>
+        </w:tc>
+        <w:tc>
+          <w:tcPr>
+            <w:tcW w:type="dxa" w:w="1760"/>
             <w:gridSpan w:val="1"/>
             <w:tcBorders>
               <w:top w:val="single" w:color="CBD5E1" w:sz="4"/>
@@ -10757,7 +11261,110 @@
                 <w:bCs/>
                 <w:color w:val="FFFFFF"/>
               </w:rPr>
-              <w:t xml:space="preserve">Int. 5 Pagos, push, admin</w:t>
+              <w:t xml:space="preserve">Jeshua</w:t>
+            </w:r>
+          </w:p>
+          <w:p>
+            <w:pPr>
+              <w:spacing w:after="40"/>
+            </w:pPr>
+            <w:r>
+              <w:rPr>
+                <w:b/>
+                <w:bCs/>
+                <w:color w:val="FFFFFF"/>
+              </w:rPr>
+              <w:t xml:space="preserve">Tiempo real</w:t>
+            </w:r>
+          </w:p>
+        </w:tc>
+        <w:tc>
+          <w:tcPr>
+            <w:tcW w:type="dxa" w:w="1720"/>
+            <w:gridSpan w:val="1"/>
+            <w:tcBorders>
+              <w:top w:val="single" w:color="CBD5E1" w:sz="4"/>
+              <w:left w:val="single" w:color="CBD5E1" w:sz="4"/>
+              <w:bottom w:val="single" w:color="CBD5E1" w:sz="4"/>
+              <w:right w:val="single" w:color="CBD5E1" w:sz="4"/>
+            </w:tcBorders>
+            <w:shd w:fill="1D4ED8" w:color="auto" w:val="clear"/>
+            <w:tcMar>
+              <w:top w:type="dxa" w:w="70"/>
+              <w:left w:type="dxa" w:w="110"/>
+              <w:bottom w:type="dxa" w:w="70"/>
+              <w:right w:type="dxa" w:w="110"/>
+            </w:tcMar>
+          </w:tcPr>
+          <w:p>
+            <w:pPr>
+              <w:spacing w:after="40"/>
+            </w:pPr>
+            <w:r>
+              <w:rPr>
+                <w:b/>
+                <w:bCs/>
+                <w:color w:val="FFFFFF"/>
+              </w:rPr>
+              <w:t xml:space="preserve">Isabel</w:t>
+            </w:r>
+          </w:p>
+          <w:p>
+            <w:pPr>
+              <w:spacing w:after="40"/>
+            </w:pPr>
+            <w:r>
+              <w:rPr>
+                <w:b/>
+                <w:bCs/>
+                <w:color w:val="FFFFFF"/>
+              </w:rPr>
+              <w:t xml:space="preserve">Sensores</w:t>
+            </w:r>
+          </w:p>
+        </w:tc>
+        <w:tc>
+          <w:tcPr>
+            <w:tcW w:type="dxa" w:w="1800"/>
+            <w:gridSpan w:val="1"/>
+            <w:tcBorders>
+              <w:top w:val="single" w:color="CBD5E1" w:sz="4"/>
+              <w:left w:val="single" w:color="CBD5E1" w:sz="4"/>
+              <w:bottom w:val="single" w:color="CBD5E1" w:sz="4"/>
+              <w:right w:val="single" w:color="CBD5E1" w:sz="4"/>
+            </w:tcBorders>
+            <w:shd w:fill="1D4ED8" w:color="auto" w:val="clear"/>
+            <w:tcMar>
+              <w:top w:type="dxa" w:w="70"/>
+              <w:left w:type="dxa" w:w="110"/>
+              <w:bottom w:type="dxa" w:w="70"/>
+              <w:right w:type="dxa" w:w="110"/>
+            </w:tcMar>
+          </w:tcPr>
+          <w:p>
+            <w:pPr>
+              <w:spacing w:after="40"/>
+            </w:pPr>
+            <w:r>
+              <w:rPr>
+                <w:b/>
+                <w:bCs/>
+                <w:color w:val="FFFFFF"/>
+              </w:rPr>
+              <w:t xml:space="preserve">Brayan</w:t>
+            </w:r>
+          </w:p>
+          <w:p>
+            <w:pPr>
+              <w:spacing w:after="40"/>
+            </w:pPr>
+            <w:r>
+              <w:rPr>
+                <w:b/>
+                <w:bCs/>
+                <w:color w:val="FFFFFF"/>
+              </w:rPr>
+              <w:t xml:space="preserve">Pagos, push, admin</w:t>
             </w:r>
           </w:p>
         </w:tc>
@@ -10811,7 +11418,7 @@
               <w:spacing w:after="40"/>
             </w:pPr>
             <w:r>
-              <w:t xml:space="preserve">Clonar, correr app, guía de estilo</w:t>
+              <w:t xml:space="preserve">Emulador listo, correr app, guía de estilo</w:t>
             </w:r>
           </w:p>
         </w:tc>
@@ -10837,7 +11444,7 @@
               <w:spacing w:after="40"/>
             </w:pPr>
             <w:r>
-              <w:t xml:space="preserve">Proyecto Supabase, migración, seed, tipos</w:t>
+              <w:t xml:space="preserve">Emulador listo; proyecto Supabase, migración, seed, tipos</w:t>
             </w:r>
           </w:p>
         </w:tc>
@@ -10863,7 +11470,7 @@
               <w:spacing w:after="40"/>
             </w:pPr>
             <w:r>
-              <w:t xml:space="preserve">Probar canal Realtime con la subasta demo</w:t>
+              <w:t xml:space="preserve">Emulador listo; probar canal Realtime con la subasta demo</w:t>
             </w:r>
           </w:p>
         </w:tc>
@@ -10889,7 +11496,7 @@
               <w:spacing w:after="40"/>
             </w:pPr>
             <w:r>
-              <w:t xml:space="preserve">Permisos de cámara y ubicación en ambos SO</w:t>
+              <w:t xml:space="preserve">APK de desarrollo para el equipo; permisos de cámara y ubicación</w:t>
             </w:r>
           </w:p>
         </w:tc>
@@ -10915,7 +11522,7 @@
               <w:spacing w:after="40"/>
             </w:pPr>
             <w:r>
-              <w:t xml:space="preserve">Stripe, EAS init, secretos, deploy de funciones</w:t>
+              <w:t xml:space="preserve">Stripe, EAS init, Firebase, secretos, deploy de funciones</w:t>
             </w:r>
           </w:p>
         </w:tc>
@@ -11636,7 +12243,7 @@
               <w:spacing w:after="40"/>
             </w:pPr>
             <w:r>
-              <w:t xml:space="preserve">Todos: pruebas cruzadas Android / iOS y corrección de errores</w:t>
+              <w:t xml:space="preserve">Todos: pruebas en los celulares de Isabel y Brayan, corrección de errores</w:t>
             </w:r>
           </w:p>
         </w:tc>
@@ -11718,7 +12325,7 @@
         <w:t xml:space="preserve">develop</w:t>
       </w:r>
       <w:r>
-        <w:t xml:space="preserve"> y se prueba la app completa en un Android y un iPhone.</w:t>
+        <w:t xml:space="preserve"> y se prueba la app completa en un celular físico y en un emulador.</w:t>
       </w:r>
     </w:p>
     <w:p>
@@ -11734,7 +12341,7 @@
         <w:spacing w:after="120" w:line="276"/>
       </w:pPr>
       <w:r>
-        <w:t xml:space="preserve">Se recomienda presentar con dos celulares (uno Android y un iPhone) proyectados, para que el tiempo real se vea claramente.</w:t>
+        <w:t xml:space="preserve">Se recomienda presentar con los dos celulares Android (Isabel y Brayan) proyectados y el APK final instalado, para que el tiempo real se vea claramente.</w:t>
       </w:r>
     </w:p>
     <w:tbl>
@@ -12103,7 +12710,7 @@
               <w:spacing w:after="40"/>
             </w:pPr>
             <w:r>
-              <w:t xml:space="preserve">Agitar el iPhone propone una oferta rápida; inclinarlo la confirma. Se ve </w:t>
+              <w:t xml:space="preserve">Agitar el celular propone una oferta rápida; inclinarlo la confirma. Se ve </w:t>
             </w:r>
             <w:r>
               <w:rPr>
@@ -12171,7 +12778,7 @@
               <w:spacing w:after="40"/>
             </w:pPr>
             <w:r>
-              <w:t xml:space="preserve">El Android ve cambiar el precio en el instante en que el iPhone oferta.</w:t>
+              <w:t xml:space="preserve">El celular de Brayan ve cambiar el precio en el instante en que el de Isabel oferta.</w:t>
             </w:r>
           </w:p>
         </w:tc>
@@ -12597,7 +13204,7 @@
               <w:spacing w:after="40"/>
             </w:pPr>
             <w:r>
-              <w:t xml:space="preserve">Un integrante instala una librería incompatible con Expo Go</w:t>
+              <w:t xml:space="preserve">Una PC no soporta el emulador</w:t>
             </w:r>
           </w:p>
         </w:tc>
@@ -12624,7 +13231,7 @@
               <w:spacing w:after="40"/>
             </w:pPr>
             <w:r>
-              <w:t xml:space="preserve">Regla de oro de la sección 4 y revisión en Pull Request.</w:t>
+              <w:t xml:space="preserve">Detectarlo el día 1; ese integrante prueba en los celulares de Isabel o Brayan durante las sesiones de integración.</w:t>
             </w:r>
           </w:p>
         </w:tc>
@@ -12652,6 +13259,61 @@
               <w:spacing w:after="40"/>
             </w:pPr>
             <w:r>
+              <w:t xml:space="preserve">Alguien agrega una librería nativa sin avisar</w:t>
+            </w:r>
+          </w:p>
+        </w:tc>
+        <w:tc>
+          <w:tcPr>
+            <w:tcW w:type="dxa" w:w="5760"/>
+            <w:gridSpan w:val="1"/>
+            <w:tcBorders>
+              <w:top w:val="single" w:color="CBD5E1" w:sz="4"/>
+              <w:left w:val="single" w:color="CBD5E1" w:sz="4"/>
+              <w:bottom w:val="single" w:color="CBD5E1" w:sz="4"/>
+              <w:right w:val="single" w:color="CBD5E1" w:sz="4"/>
+            </w:tcBorders>
+            <w:tcMar>
+              <w:top w:type="dxa" w:w="70"/>
+              <w:left w:type="dxa" w:w="110"/>
+              <w:bottom w:type="dxa" w:w="70"/>
+              <w:right w:type="dxa" w:w="110"/>
+            </w:tcMar>
+          </w:tcPr>
+          <w:p>
+            <w:pPr>
+              <w:spacing w:after="40"/>
+            </w:pPr>
+            <w:r>
+              <w:t xml:space="preserve">El APK de desarrollo deja de funcionar para los demás. Solo Isabel o Brayan instalan librerías nativas y regeneran el APK.</w:t>
+            </w:r>
+          </w:p>
+        </w:tc>
+      </w:tr>
+      <w:tr>
+        <w:tc>
+          <w:tcPr>
+            <w:tcW w:type="dxa" w:w="3600"/>
+            <w:gridSpan w:val="1"/>
+            <w:tcBorders>
+              <w:top w:val="single" w:color="CBD5E1" w:sz="4"/>
+              <w:left w:val="single" w:color="CBD5E1" w:sz="4"/>
+              <w:bottom w:val="single" w:color="CBD5E1" w:sz="4"/>
+              <w:right w:val="single" w:color="CBD5E1" w:sz="4"/>
+            </w:tcBorders>
+            <w:shd w:fill="F1F5F9" w:color="auto" w:val="clear"/>
+            <w:tcMar>
+              <w:top w:type="dxa" w:w="70"/>
+              <w:left w:type="dxa" w:w="110"/>
+              <w:bottom w:type="dxa" w:w="70"/>
+              <w:right w:type="dxa" w:w="110"/>
+            </w:tcMar>
+          </w:tcPr>
+          <w:p>
+            <w:pPr>
+              <w:spacing w:after="40"/>
+            </w:pPr>
+            <w:r>
               <w:t xml:space="preserve">Red de la escuela bloquea la conexión al servidor de desarrollo</w:t>
             </w:r>
           </w:p>
@@ -12666,6 +13328,7 @@
               <w:bottom w:val="single" w:color="CBD5E1" w:sz="4"/>
               <w:right w:val="single" w:color="CBD5E1" w:sz="4"/>
             </w:tcBorders>
+            <w:shd w:fill="F1F5F9" w:color="auto" w:val="clear"/>
             <w:tcMar>
               <w:top w:type="dxa" w:w="70"/>
               <w:left w:type="dxa" w:w="110"/>
@@ -12687,7 +13350,7 @@
               <w:t xml:space="preserve">npm run start:tunnel</w:t>
             </w:r>
             <w:r>
-              <w:t xml:space="preserve"> o APK de preview para Android.</w:t>
+              <w:t xml:space="preserve"> o APK de preview.</w:t>
             </w:r>
           </w:p>
         </w:tc>
@@ -12703,7 +13366,6 @@
               <w:bottom w:val="single" w:color="CBD5E1" w:sz="4"/>
               <w:right w:val="single" w:color="CBD5E1" w:sz="4"/>
             </w:tcBorders>
-            <w:shd w:fill="F1F5F9" w:color="auto" w:val="clear"/>
             <w:tcMar>
               <w:top w:type="dxa" w:w="70"/>
               <w:left w:type="dxa" w:w="110"/>
@@ -12730,7 +13392,6 @@
               <w:bottom w:val="single" w:color="CBD5E1" w:sz="4"/>
               <w:right w:val="single" w:color="CBD5E1" w:sz="4"/>
             </w:tcBorders>
-            <w:shd w:fill="F1F5F9" w:color="auto" w:val="clear"/>
             <w:tcMar>
               <w:top w:type="dxa" w:w="70"/>
               <w:left w:type="dxa" w:w="110"/>
@@ -12771,6 +13432,7 @@
               <w:bottom w:val="single" w:color="CBD5E1" w:sz="4"/>
               <w:right w:val="single" w:color="CBD5E1" w:sz="4"/>
             </w:tcBorders>
+            <w:shd w:fill="F1F5F9" w:color="auto" w:val="clear"/>
             <w:tcMar>
               <w:top w:type="dxa" w:w="70"/>
               <w:left w:type="dxa" w:w="110"/>
@@ -12797,6 +13459,7 @@
               <w:bottom w:val="single" w:color="CBD5E1" w:sz="4"/>
               <w:right w:val="single" w:color="CBD5E1" w:sz="4"/>
             </w:tcBorders>
+            <w:shd w:fill="F1F5F9" w:color="auto" w:val="clear"/>
             <w:tcMar>
               <w:top w:type="dxa" w:w="70"/>
               <w:left w:type="dxa" w:w="110"/>
@@ -13088,6 +13751,30 @@
     </w:lvl>
   </w:abstractNum>
   <w:abstractNum w:abstractNumId="6" w15:restartNumberingAfterBreak="0">
+    <w:multiLevelType w:val="hybridMultilevel"/>
+    <w:lvl w:ilvl="0" w15:tentative="1">
+      <w:start w:val="1"/>
+      <w:numFmt w:val="decimal"/>
+      <w:lvlText w:val="%1."/>
+      <w:lvlJc w:val="left"/>
+      <w:pPr>
+        <w:ind w:left="540" w:hanging="360"/>
+      </w:pPr>
+    </w:lvl>
+  </w:abstractNum>
+  <w:abstractNum w:abstractNumId="7" w15:restartNumberingAfterBreak="0">
+    <w:multiLevelType w:val="hybridMultilevel"/>
+    <w:lvl w:ilvl="0" w15:tentative="1">
+      <w:start w:val="1"/>
+      <w:numFmt w:val="decimal"/>
+      <w:lvlText w:val="%1."/>
+      <w:lvlJc w:val="left"/>
+      <w:pPr>
+        <w:ind w:left="540" w:hanging="360"/>
+      </w:pPr>
+    </w:lvl>
+  </w:abstractNum>
+  <w:abstractNum w:abstractNumId="8" w15:restartNumberingAfterBreak="0">
     <w:multiLevelType w:val="hybridMultilevel"/>
     <w:lvl w:ilvl="0" w15:tentative="1">
       <w:start w:val="1"/>
@@ -13131,6 +13818,18 @@
   </w:num>
   <w:num w:numId="6">
     <w:abstractNumId w:val="6"/>
+    <w:lvlOverride w:ilvl="0">
+      <w:startOverride w:val="1"/>
+    </w:lvlOverride>
+  </w:num>
+  <w:num w:numId="7">
+    <w:abstractNumId w:val="7"/>
+    <w:lvlOverride w:ilvl="0">
+      <w:startOverride w:val="1"/>
+    </w:lvlOverride>
+  </w:num>
+  <w:num w:numId="8">
+    <w:abstractNumId w:val="8"/>
     <w:lvlOverride w:ilvl="0">
       <w:startOverride w:val="1"/>
     </w:lvlOverride>

</xml_diff>

<commit_message>
docs: Expo Go en iPhone para Kassie, Jorge y Jeshua
- app.json vuelve a incluir iOS para desarrollo con Expo Go
- Producto final sigue siendo solo Android (APK)
- README, CONTRIBUTING, plantilla de PR y documento actualizados
- Regla: toda libreria nativa debe ser compatible con Expo Go

Co-Authored-By: Claude Opus 5.5 <noreply@anthropic.com>
Claude-Session: https://claude.ai/code/session_019xLn7cYorBNSuBjLRXFLrS
</commit_message>
<xml_diff>
--- a/docs/Arquitectura_App_Subastas.docx
+++ b/docs/Arquitectura_App_Subastas.docx
@@ -85,10 +85,10 @@
           <w:b/>
           <w:bCs/>
         </w:rPr>
-        <w:t xml:space="preserve">Plataforma:</w:t>
-      </w:r>
-      <w:r>
-        <w:t xml:space="preserve"> Android (development build). Celulares físicos: Isabel y Brayan. Emulador: Kassie, Jorge y Jeshua.</w:t>
+        <w:t xml:space="preserve">Plataforma final:</w:t>
+      </w:r>
+      <w:r>
+        <w:t xml:space="preserve"> Android. Desarrollo: Isabel y Brayan con development build en su celular Android; Kassie, Jorge y Jeshua con Expo Go en iPhone.</w:t>
       </w:r>
     </w:p>
     <w:p>
@@ -304,7 +304,7 @@
               <w:spacing w:after="40"/>
             </w:pPr>
             <w:r>
-              <w:t xml:space="preserve">Plataforma única: Android</w:t>
+              <w:t xml:space="preserve">Plataforma final: Android</w:t>
             </w:r>
           </w:p>
         </w:tc>
@@ -330,7 +330,7 @@
               <w:spacing w:after="40"/>
             </w:pPr>
             <w:r>
-              <w:t xml:space="preserve">La app se desarrolla, prueba y presenta </w:t>
+              <w:t xml:space="preserve">La app se entrega y se presenta </w:t>
             </w:r>
             <w:r>
               <w:rPr>
@@ -340,7 +340,7 @@
               <w:t xml:space="preserve">solo en Android</w:t>
             </w:r>
             <w:r>
-              <w:t xml:space="preserve">. Todos ejecutan el mismo </w:t>
+              <w:t xml:space="preserve">. Isabel y Brayan usan el </w:t>
             </w:r>
             <w:r>
               <w:rPr>
@@ -350,7 +350,17 @@
               <w:t xml:space="preserve">development build</w:t>
             </w:r>
             <w:r>
-              <w:t xml:space="preserve"> (no Expo Go), así que funcionan push, pagos y sensores en cualquier dispositivo del equipo.</w:t>
+              <w:t xml:space="preserve"> en su celular (push, sensores y APK final). Kassie, Jorge y Jeshua desarrollan con </w:t>
+            </w:r>
+            <w:r>
+              <w:rPr>
+                <w:b/>
+                <w:bCs/>
+              </w:rPr>
+              <w:t xml:space="preserve">Expo Go en su iPhone</w:t>
+            </w:r>
+            <w:r>
+              <w:t xml:space="preserve">, que es suficiente para sus módulos.</w:t>
             </w:r>
           </w:p>
         </w:tc>
@@ -379,7 +389,7 @@
               <w:spacing w:after="40"/>
             </w:pPr>
             <w:r>
-              <w:t xml:space="preserve">Integrantes sin celular Android</w:t>
+              <w:t xml:space="preserve">Expo Go en iPhone</w:t>
             </w:r>
           </w:p>
         </w:tc>
@@ -406,17 +416,17 @@
               <w:spacing w:after="40"/>
             </w:pPr>
             <w:r>
-              <w:t xml:space="preserve">Kassie, Jorge y Jeshua trabajan con el </w:t>
+              <w:t xml:space="preserve">Funciona para pantallas, base de datos, ofertas, pagos y tiempo real. Solo sirve para </w:t>
             </w:r>
             <w:r>
               <w:rPr>
                 <w:b/>
                 <w:bCs/>
               </w:rPr>
-              <w:t xml:space="preserve">emulador de Android Studio</w:t>
-            </w:r>
-            <w:r>
-              <w:t xml:space="preserve"> e instalan el APK de desarrollo que genera Isabel. El emulador simula ubicación, acelerómetro y giroscopio (Extended controls &gt; Virtual sensors) y puede usar la webcam como cámara. La prueba final de sensores siempre se hace en el celular de Isabel o Brayan.</w:t>
+              <w:t xml:space="preserve">desarrollar</w:t>
+            </w:r>
+            <w:r>
+              <w:t xml:space="preserve">: el diseño final se confirma en un Android, porque botones, teclado y barra superior se ven distinto en iPhone.</w:t>
             </w:r>
           </w:p>
         </w:tc>
@@ -444,7 +454,7 @@
               <w:spacing w:after="40"/>
             </w:pPr>
             <w:r>
-              <w:t xml:space="preserve">Requisitos del emulador</w:t>
+              <w:t xml:space="preserve">Solo librerías compatibles con Expo Go</w:t>
             </w:r>
           </w:p>
         </w:tc>
@@ -470,17 +480,17 @@
               <w:spacing w:after="40"/>
             </w:pPr>
             <w:r>
-              <w:t xml:space="preserve">Virtualización activada en la BIOS, 8 GB de RAM o más y una imagen </w:t>
+              <w:t xml:space="preserve">Para que los iPhone sigan abriendo la app, </w:t>
             </w:r>
             <w:r>
               <w:rPr>
                 <w:b/>
                 <w:bCs/>
               </w:rPr>
-              <w:t xml:space="preserve">con Google Play</w:t>
-            </w:r>
-            <w:r>
-              <w:t xml:space="preserve"> (necesaria para push). Verificarlo el día 1: si una PC no lo soporta, ese integrante usa el celular de Isabel o Brayan en las sesiones de prueba.</w:t>
+              <w:t xml:space="preserve">toda librería nativa debe estar incluida en Expo Go</w:t>
+            </w:r>
+            <w:r>
+              <w:t xml:space="preserve">. Las actuales lo están (expo-camera, expo-location, expo-sensors, expo-notifications, expo-haptics, @stripe/stripe-react-native). Antes de instalar otra, revisar que su documentación diga "Expo Go: compatible".</w:t>
             </w:r>
           </w:p>
         </w:tc>
@@ -602,17 +612,17 @@
               <w:spacing w:after="40"/>
             </w:pPr>
             <w:r>
-              <w:t xml:space="preserve">Cada librería nativa nueva obliga a </w:t>
+              <w:t xml:space="preserve">Una librería nativa nueva obliga a </w:t>
             </w:r>
             <w:r>
               <w:rPr>
                 <w:b/>
                 <w:bCs/>
               </w:rPr>
-              <w:t xml:space="preserve">regenerar el APK de desarrollo</w:t>
-            </w:r>
-            <w:r>
-              <w:t xml:space="preserve"> y reinstalarlo en todos los dispositivos. Se agregan solo con aviso al equipo y las instala Isabel o Brayan. Los cambios de código JavaScript se ven al instante, sin recompilar.</w:t>
+              <w:t xml:space="preserve">regenerar el development build</w:t>
+            </w:r>
+            <w:r>
+              <w:t xml:space="preserve"> de Isabel y Brayan. Se agregan solo con aviso al equipo, las instala Isabel o Brayan y deben cumplir la regla anterior.</w:t>
             </w:r>
           </w:p>
         </w:tc>
@@ -678,7 +688,7 @@
               <w:t xml:space="preserve">Expo SDK 57</w:t>
             </w:r>
             <w:r>
-              <w:t xml:space="preserve">. No actualizar el SDK ni React Native durante la semana.</w:t>
+              <w:t xml:space="preserve">, la versión de Expo Go en la App Store. No actualizar el SDK durante la semana: si no coincide, los iPhone dejan de abrir la app.</w:t>
             </w:r>
           </w:p>
         </w:tc>
@@ -1078,7 +1088,7 @@
               <w:t xml:space="preserve">npm run start:tunnel</w:t>
             </w:r>
             <w:r>
-              <w:t xml:space="preserve">. El emulador no tiene este problema porque corre en la misma PC.</w:t>
+              <w:t xml:space="preserve">.</w:t>
             </w:r>
           </w:p>
         </w:tc>
@@ -2562,7 +2572,7 @@
         <w:pStyle w:val="Heading1"/>
       </w:pPr>
       <w:r>
-        <w:t xml:space="preserve">4. Estrategia de desarrollo en Android</w:t>
+        <w:t xml:space="preserve">4. Estrategia de desarrollo</w:t>
       </w:r>
     </w:p>
     <w:p>
@@ -2570,29 +2580,7 @@
         <w:spacing w:after="120" w:line="276"/>
       </w:pPr>
       <w:r>
-        <w:t xml:space="preserve">La app se entrega solo para Android. Todo el equipo usa el mismo </w:t>
-      </w:r>
-      <w:r>
-        <w:rPr>
-          <w:b/>
-          <w:bCs/>
-        </w:rPr>
-        <w:t xml:space="preserve">development build</w:t>
-      </w:r>
-      <w:r>
-        <w:t xml:space="preserve">: una versión de la app con los módulos nativos ya incluidos que se conecta al servidor de desarrollo de cada quien (</w:t>
-      </w:r>
-      <w:r>
-        <w:rPr>
-          <w:rFonts w:ascii="Consolas" w:cs="Consolas" w:eastAsia="Consolas" w:hAnsi="Consolas"/>
-          <w:color w:val="0F172A"/>
-          <w:sz w:val="19"/>
-          <w:szCs w:val="19"/>
-        </w:rPr>
-        <w:t xml:space="preserve">npm start</w:t>
-      </w:r>
-      <w:r>
-        <w:t xml:space="preserve">) y recarga los cambios al instante.</w:t>
+        <w:t xml:space="preserve">El producto final es una app Android. Para desarrollar se usan dos formas de ejecutar el mismo código, según el dispositivo de cada integrante:</w:t>
       </w:r>
     </w:p>
     <w:tbl>
@@ -2676,7 +2664,7 @@
                 <w:bCs/>
                 <w:color w:val="FFFFFF"/>
               </w:rPr>
-              <w:t xml:space="preserve">Isabel y Brayan (celular físico)</w:t>
+              <w:t xml:space="preserve">Isabel y Brayan (Android)</w:t>
             </w:r>
           </w:p>
         </w:tc>
@@ -2708,7 +2696,7 @@
                 <w:bCs/>
                 <w:color w:val="FFFFFF"/>
               </w:rPr>
-              <w:t xml:space="preserve">Kassie, Jorge y Jeshua (emulador)</w:t>
+              <w:t xml:space="preserve">Kassie, Jorge y Jeshua (iPhone)</w:t>
             </w:r>
           </w:p>
         </w:tc>
@@ -2736,7 +2724,7 @@
               <w:spacing w:after="40"/>
             </w:pPr>
             <w:r>
-              <w:t xml:space="preserve">Dispositivo</w:t>
+              <w:t xml:space="preserve">Cómo se ejecuta</w:t>
             </w:r>
           </w:p>
         </w:tc>
@@ -2762,87 +2750,8 @@
               <w:spacing w:after="40"/>
             </w:pPr>
             <w:r>
-              <w:t xml:space="preserve">Celular Android en modo desarrollador, conectado por USB o WiFi.</w:t>
-            </w:r>
-          </w:p>
-        </w:tc>
-        <w:tc>
-          <w:tcPr>
-            <w:tcW w:type="dxa" w:w="3680"/>
-            <w:gridSpan w:val="1"/>
-            <w:tcBorders>
-              <w:top w:val="single" w:color="CBD5E1" w:sz="4"/>
-              <w:left w:val="single" w:color="CBD5E1" w:sz="4"/>
-              <w:bottom w:val="single" w:color="CBD5E1" w:sz="4"/>
-              <w:right w:val="single" w:color="CBD5E1" w:sz="4"/>
-            </w:tcBorders>
-            <w:tcMar>
-              <w:top w:type="dxa" w:w="70"/>
-              <w:left w:type="dxa" w:w="110"/>
-              <w:bottom w:type="dxa" w:w="70"/>
-              <w:right w:type="dxa" w:w="110"/>
-            </w:tcMar>
-          </w:tcPr>
-          <w:p>
-            <w:pPr>
-              <w:spacing w:after="40"/>
-            </w:pPr>
-            <w:r>
-              <w:t xml:space="preserve">Emulador de Android Studio (imagen con Google Play, API 35 o superior).</w:t>
-            </w:r>
-          </w:p>
-        </w:tc>
-      </w:tr>
-      <w:tr>
-        <w:tc>
-          <w:tcPr>
-            <w:tcW w:type="dxa" w:w="2000"/>
-            <w:gridSpan w:val="1"/>
-            <w:tcBorders>
-              <w:top w:val="single" w:color="CBD5E1" w:sz="4"/>
-              <w:left w:val="single" w:color="CBD5E1" w:sz="4"/>
-              <w:bottom w:val="single" w:color="CBD5E1" w:sz="4"/>
-              <w:right w:val="single" w:color="CBD5E1" w:sz="4"/>
-            </w:tcBorders>
-            <w:shd w:fill="F1F5F9" w:color="auto" w:val="clear"/>
-            <w:tcMar>
-              <w:top w:type="dxa" w:w="70"/>
-              <w:left w:type="dxa" w:w="110"/>
-              <w:bottom w:type="dxa" w:w="70"/>
-              <w:right w:type="dxa" w:w="110"/>
-            </w:tcMar>
-          </w:tcPr>
-          <w:p>
-            <w:pPr>
-              <w:spacing w:after="40"/>
-            </w:pPr>
-            <w:r>
-              <w:t xml:space="preserve">Instalación de la app</w:t>
-            </w:r>
-          </w:p>
-        </w:tc>
-        <w:tc>
-          <w:tcPr>
-            <w:tcW w:type="dxa" w:w="3680"/>
-            <w:gridSpan w:val="1"/>
-            <w:tcBorders>
-              <w:top w:val="single" w:color="CBD5E1" w:sz="4"/>
-              <w:left w:val="single" w:color="CBD5E1" w:sz="4"/>
-              <w:bottom w:val="single" w:color="CBD5E1" w:sz="4"/>
-              <w:right w:val="single" w:color="CBD5E1" w:sz="4"/>
-            </w:tcBorders>
-            <w:shd w:fill="F1F5F9" w:color="auto" w:val="clear"/>
-            <w:tcMar>
-              <w:top w:type="dxa" w:w="70"/>
-              <w:left w:type="dxa" w:w="110"/>
-              <w:bottom w:type="dxa" w:w="70"/>
-              <w:right w:type="dxa" w:w="110"/>
-            </w:tcMar>
-          </w:tcPr>
-          <w:p>
-            <w:pPr>
-              <w:spacing w:after="40"/>
-            </w:pPr>
+              <w:t xml:space="preserve">Development build: </w:t>
+            </w:r>
             <w:r>
               <w:rPr>
                 <w:rFonts w:ascii="Consolas" w:cs="Consolas" w:eastAsia="Consolas" w:hAnsi="Consolas"/>
@@ -2853,86 +2762,8 @@
               <w:t xml:space="preserve">npm run android</w:t>
             </w:r>
             <w:r>
-              <w:t xml:space="preserve"> compila e instala el development build.</w:t>
-            </w:r>
-          </w:p>
-        </w:tc>
-        <w:tc>
-          <w:tcPr>
-            <w:tcW w:type="dxa" w:w="3680"/>
-            <w:gridSpan w:val="1"/>
-            <w:tcBorders>
-              <w:top w:val="single" w:color="CBD5E1" w:sz="4"/>
-              <w:left w:val="single" w:color="CBD5E1" w:sz="4"/>
-              <w:bottom w:val="single" w:color="CBD5E1" w:sz="4"/>
-              <w:right w:val="single" w:color="CBD5E1" w:sz="4"/>
-            </w:tcBorders>
-            <w:shd w:fill="F1F5F9" w:color="auto" w:val="clear"/>
-            <w:tcMar>
-              <w:top w:type="dxa" w:w="70"/>
-              <w:left w:type="dxa" w:w="110"/>
-              <w:bottom w:type="dxa" w:w="70"/>
-              <w:right w:type="dxa" w:w="110"/>
-            </w:tcMar>
-          </w:tcPr>
-          <w:p>
-            <w:pPr>
-              <w:spacing w:after="40"/>
-            </w:pPr>
-            <w:r>
-              <w:t xml:space="preserve">Arrastrar al emulador el APK de desarrollo que comparte Isabel.</w:t>
-            </w:r>
-          </w:p>
-        </w:tc>
-      </w:tr>
-      <w:tr>
-        <w:tc>
-          <w:tcPr>
-            <w:tcW w:type="dxa" w:w="2000"/>
-            <w:gridSpan w:val="1"/>
-            <w:tcBorders>
-              <w:top w:val="single" w:color="CBD5E1" w:sz="4"/>
-              <w:left w:val="single" w:color="CBD5E1" w:sz="4"/>
-              <w:bottom w:val="single" w:color="CBD5E1" w:sz="4"/>
-              <w:right w:val="single" w:color="CBD5E1" w:sz="4"/>
-            </w:tcBorders>
-            <w:tcMar>
-              <w:top w:type="dxa" w:w="70"/>
-              <w:left w:type="dxa" w:w="110"/>
-              <w:bottom w:type="dxa" w:w="70"/>
-              <w:right w:type="dxa" w:w="110"/>
-            </w:tcMar>
-          </w:tcPr>
-          <w:p>
-            <w:pPr>
-              <w:spacing w:after="40"/>
-            </w:pPr>
-            <w:r>
-              <w:t xml:space="preserve">Uso diario</w:t>
-            </w:r>
-          </w:p>
-        </w:tc>
-        <w:tc>
-          <w:tcPr>
-            <w:tcW w:type="dxa" w:w="3680"/>
-            <w:gridSpan w:val="1"/>
-            <w:tcBorders>
-              <w:top w:val="single" w:color="CBD5E1" w:sz="4"/>
-              <w:left w:val="single" w:color="CBD5E1" w:sz="4"/>
-              <w:bottom w:val="single" w:color="CBD5E1" w:sz="4"/>
-              <w:right w:val="single" w:color="CBD5E1" w:sz="4"/>
-            </w:tcBorders>
-            <w:tcMar>
-              <w:top w:type="dxa" w:w="70"/>
-              <w:left w:type="dxa" w:w="110"/>
-              <w:bottom w:type="dxa" w:w="70"/>
-              <w:right w:type="dxa" w:w="110"/>
-            </w:tcMar>
-          </w:tcPr>
-          <w:p>
-            <w:pPr>
-              <w:spacing w:after="40"/>
-            </w:pPr>
+              <w:t xml:space="preserve"> compila e instala la app. Después solo </w:t>
+            </w:r>
             <w:r>
               <w:rPr>
                 <w:rFonts w:ascii="Consolas" w:cs="Consolas" w:eastAsia="Consolas" w:hAnsi="Consolas"/>
@@ -2943,7 +2774,7 @@
               <w:t xml:space="preserve">npm start</w:t>
             </w:r>
             <w:r>
-              <w:t xml:space="preserve"> y abrir la app.</w:t>
+              <w:t xml:space="preserve">.</w:t>
             </w:r>
           </w:p>
         </w:tc>
@@ -2968,6 +2799,9 @@
             <w:pPr>
               <w:spacing w:after="40"/>
             </w:pPr>
+            <w:r>
+              <w:t xml:space="preserve">Expo Go: </w:t>
+            </w:r>
             <w:r>
               <w:rPr>
                 <w:rFonts w:ascii="Consolas" w:cs="Consolas" w:eastAsia="Consolas" w:hAnsi="Consolas"/>
@@ -2978,19 +2812,7 @@
               <w:t xml:space="preserve">npm start</w:t>
             </w:r>
             <w:r>
-              <w:t xml:space="preserve"> y presionar </w:t>
-            </w:r>
-            <w:r>
-              <w:rPr>
-                <w:rFonts w:ascii="Consolas" w:cs="Consolas" w:eastAsia="Consolas" w:hAnsi="Consolas"/>
-                <w:color w:val="0F172A"/>
-                <w:sz w:val="19"/>
-                <w:szCs w:val="19"/>
-              </w:rPr>
-              <w:t xml:space="preserve">a</w:t>
-            </w:r>
-            <w:r>
-              <w:t xml:space="preserve"> para abrir en el emulador.</w:t>
+              <w:t xml:space="preserve"> y escanear el QR con la cámara del iPhone.</w:t>
             </w:r>
           </w:p>
         </w:tc>
@@ -3019,7 +2841,7 @@
               <w:spacing w:after="40"/>
             </w:pPr>
             <w:r>
-              <w:t xml:space="preserve">Cámara</w:t>
+              <w:t xml:space="preserve">Requisitos</w:t>
             </w:r>
           </w:p>
         </w:tc>
@@ -3046,7 +2868,7 @@
               <w:spacing w:after="40"/>
             </w:pPr>
             <w:r>
-              <w:t xml:space="preserve">Real</w:t>
+              <w:t xml:space="preserve">Android Studio (SDK) y depuración USB activa.</w:t>
             </w:r>
           </w:p>
         </w:tc>
@@ -3073,7 +2895,7 @@
               <w:spacing w:after="40"/>
             </w:pPr>
             <w:r>
-              <w:t xml:space="preserve">Webcam de la PC o escena virtual</w:t>
+              <w:t xml:space="preserve">Expo Go actualizado (SDK 57).</w:t>
             </w:r>
           </w:p>
         </w:tc>
@@ -3101,7 +2923,7 @@
               <w:spacing w:after="40"/>
             </w:pPr>
             <w:r>
-              <w:t xml:space="preserve">GPS</w:t>
+              <w:t xml:space="preserve">Módulos</w:t>
             </w:r>
           </w:p>
         </w:tc>
@@ -3127,7 +2949,7 @@
               <w:spacing w:after="40"/>
             </w:pPr>
             <w:r>
-              <w:t xml:space="preserve">Real</w:t>
+              <w:t xml:space="preserve">Sensores, cámara, push, pagos y administrador.</w:t>
             </w:r>
           </w:p>
         </w:tc>
@@ -3153,7 +2975,7 @@
               <w:spacing w:after="40"/>
             </w:pPr>
             <w:r>
-              <w:t xml:space="preserve">Ubicación simulada (Extended controls &gt; Location)</w:t>
+              <w:t xml:space="preserve">Pantallas, base de datos y ofertas, tiempo real.</w:t>
             </w:r>
           </w:p>
         </w:tc>
@@ -3182,7 +3004,7 @@
               <w:spacing w:after="40"/>
             </w:pPr>
             <w:r>
-              <w:t xml:space="preserve">Acelerómetro y giroscopio</w:t>
+              <w:t xml:space="preserve">Push remoto</w:t>
             </w:r>
           </w:p>
         </w:tc>
@@ -3209,7 +3031,7 @@
               <w:spacing w:after="40"/>
             </w:pPr>
             <w:r>
-              <w:t xml:space="preserve">Reales (validación final)</w:t>
+              <w:t xml:space="preserve">Sí (con Firebase configurado)</w:t>
             </w:r>
           </w:p>
         </w:tc>
@@ -3236,7 +3058,7 @@
               <w:spacing w:after="40"/>
             </w:pPr>
             <w:r>
-              <w:t xml:space="preserve">Virtual sensors (Extended controls)</w:t>
+              <w:t xml:space="preserve">No se necesita para sus módulos</w:t>
             </w:r>
           </w:p>
         </w:tc>
@@ -3264,7 +3086,7 @@
               <w:spacing w:after="40"/>
             </w:pPr>
             <w:r>
-              <w:t xml:space="preserve">Push, pagos, tiempo real</w:t>
+              <w:t xml:space="preserve">Validación final</w:t>
             </w:r>
           </w:p>
         </w:tc>
@@ -3290,7 +3112,7 @@
               <w:spacing w:after="40"/>
             </w:pPr>
             <w:r>
-              <w:t xml:space="preserve">Sí</w:t>
+              <w:t xml:space="preserve">Sí: todo se da por terminado en un Android.</w:t>
             </w:r>
           </w:p>
         </w:tc>
@@ -3316,7 +3138,7 @@
               <w:spacing w:after="40"/>
             </w:pPr>
             <w:r>
-              <w:t xml:space="preserve">Sí</w:t>
+              <w:t xml:space="preserve">Solo desarrollo; el diseño final se revisa en Android.</w:t>
             </w:r>
           </w:p>
         </w:tc>
@@ -3332,7 +3154,7 @@
         <w:pStyle w:val="Heading2"/>
       </w:pPr>
       <w:r>
-        <w:t xml:space="preserve">4.1 APK de desarrollo compartido</w:t>
+        <w:t xml:space="preserve">4.1 APK final para la demo</w:t>
       </w:r>
     </w:p>
     <w:p>
@@ -3340,7 +3162,7 @@
         <w:spacing w:after="120" w:line="276"/>
       </w:pPr>
       <w:r>
-        <w:t xml:space="preserve">Isabel compila el development build una vez (</w:t>
+        <w:t xml:space="preserve">Brayan genera el APK independiente con </w:t>
       </w:r>
       <w:r>
         <w:rPr>
@@ -3349,10 +3171,26 @@
           <w:sz w:val="19"/>
           <w:szCs w:val="19"/>
         </w:rPr>
-        <w:t xml:space="preserve">npm run android</w:t>
-      </w:r>
-      <w:r>
-        <w:t xml:space="preserve">) y comparte el archivo </w:t>
+        <w:t xml:space="preserve">eas build --profile preview -p android</w:t>
+      </w:r>
+      <w:r>
+        <w:t xml:space="preserve">. Es el que se instala en los celulares de la presentación y no necesita una PC conectada.</w:t>
+      </w:r>
+    </w:p>
+    <w:p>
+      <w:pPr>
+        <w:pStyle w:val="Heading2"/>
+      </w:pPr>
+      <w:r>
+        <w:t xml:space="preserve">4.2 Opcional: emulador</w:t>
+      </w:r>
+    </w:p>
+    <w:p>
+      <w:pPr>
+        <w:spacing w:after="120" w:line="276"/>
+      </w:pPr>
+      <w:r>
+        <w:t xml:space="preserve">Si alguien con iPhone quiere ver la app tal como se verá en Android, puede usar el emulador de Android Studio con el APK de desarrollo que comparte Isabel (</w:t>
       </w:r>
       <w:r>
         <w:rPr>
@@ -3364,47 +3202,7 @@
         <w:t xml:space="preserve">android/app/build/outputs/apk/debug/app-debug.apk</w:t>
       </w:r>
       <w:r>
-        <w:t xml:space="preserve"> por Drive o WhatsApp. Ese APK sirve para cualquier integrante porque solo contiene la parte nativa; el código de cada quien se carga desde su propia PC. Se vuelve a generar únicamente cuando se agrega una librería nativa o se cambian permisos o plugins en </w:t>
-      </w:r>
-      <w:r>
-        <w:rPr>
-          <w:rFonts w:ascii="Consolas" w:cs="Consolas" w:eastAsia="Consolas" w:hAnsi="Consolas"/>
-          <w:color w:val="0F172A"/>
-          <w:sz w:val="19"/>
-          <w:szCs w:val="19"/>
-        </w:rPr>
-        <w:t xml:space="preserve">app.json</w:t>
-      </w:r>
-      <w:r>
-        <w:t xml:space="preserve">.</w:t>
-      </w:r>
-    </w:p>
-    <w:p>
-      <w:pPr>
-        <w:pStyle w:val="Heading2"/>
-      </w:pPr>
-      <w:r>
-        <w:t xml:space="preserve">4.2 APK final para la demo</w:t>
-      </w:r>
-    </w:p>
-    <w:p>
-      <w:pPr>
-        <w:spacing w:after="120" w:line="276"/>
-      </w:pPr>
-      <w:r>
-        <w:t xml:space="preserve">Brayan genera el APK independiente con </w:t>
-      </w:r>
-      <w:r>
-        <w:rPr>
-          <w:rFonts w:ascii="Consolas" w:cs="Consolas" w:eastAsia="Consolas" w:hAnsi="Consolas"/>
-          <w:color w:val="0F172A"/>
-          <w:sz w:val="19"/>
-          <w:szCs w:val="19"/>
-        </w:rPr>
-        <w:t xml:space="preserve">eas build --profile preview -p android</w:t>
-      </w:r>
-      <w:r>
-        <w:t xml:space="preserve">. Ese APK ya no necesita una PC conectada y es el que se instala en los celulares de la presentación.</w:t>
+        <w:t xml:space="preserve">). No es obligatorio.</w:t>
       </w:r>
     </w:p>
     <w:tbl>
@@ -3458,7 +3256,7 @@
               <w:spacing w:after="0"/>
             </w:pPr>
             <w:r>
-              <w:t xml:space="preserve">Nada se da por terminado hasta probarse en un celular Android físico (Isabel o Brayan). El emulador sirve para desarrollar, pero los sensores y las notificaciones se validan en hardware real.</w:t>
+              <w:t xml:space="preserve">Nada se da por terminado hasta probarse en un celular Android (Isabel o Brayan). Y nada entra al proyecto si rompe Expo Go en los iPhone.</w:t>
             </w:r>
           </w:p>
         </w:tc>
@@ -8576,7 +8374,7 @@
         <w:spacing w:after="120" w:line="276"/>
       </w:pPr>
       <w:r>
-        <w:t xml:space="preserve">Isabel y Brayan, que tienen celular Android, toman los módulos que dependen del hardware y de la configuración nativa: sensores y notificaciones push. Isabel genera el APK de desarrollo y Brayan el APK final de la demo.</w:t>
+        <w:t xml:space="preserve">Isabel y Brayan, que tienen celular Android, toman los módulos que dependen del hardware y de la configuración nativa: sensores y notificaciones push. Brayan genera el APK final de la demo.</w:t>
       </w:r>
     </w:p>
     <w:tbl>
@@ -8720,7 +8518,7 @@
               <w:spacing w:after="40"/>
             </w:pPr>
             <w:r>
-              <w:t xml:space="preserve">1. Kassie (emulador)</w:t>
+              <w:t xml:space="preserve">1. Kassie (iPhone, Expo Go)</w:t>
             </w:r>
           </w:p>
         </w:tc>
@@ -8834,7 +8632,7 @@
               <w:spacing w:after="40"/>
             </w:pPr>
             <w:r>
-              <w:t xml:space="preserve">2. Jorge (emulador)</w:t>
+              <w:t xml:space="preserve">2. Jorge (iPhone, Expo Go)</w:t>
             </w:r>
           </w:p>
         </w:tc>
@@ -8958,7 +8756,7 @@
               <w:spacing w:after="40"/>
             </w:pPr>
             <w:r>
-              <w:t xml:space="preserve">3. Jeshua (emulador)</w:t>
+              <w:t xml:space="preserve">3. Jeshua (iPhone, Expo Go)</w:t>
             </w:r>
           </w:p>
         </w:tc>
@@ -9081,7 +8879,7 @@
               <w:spacing w:after="40"/>
             </w:pPr>
             <w:r>
-              <w:t xml:space="preserve">4. Isabel (celular)</w:t>
+              <w:t xml:space="preserve">4. Isabel (Android)</w:t>
             </w:r>
           </w:p>
         </w:tc>
@@ -9217,7 +9015,7 @@
               <w:spacing w:after="40"/>
             </w:pPr>
             <w:r>
-              <w:t xml:space="preserve">5. Brayan (celular)</w:t>
+              <w:t xml:space="preserve">5. Brayan (Android)</w:t>
             </w:r>
           </w:p>
         </w:tc>
@@ -10581,7 +10379,19 @@
         <w:spacing w:after="60"/>
       </w:pPr>
       <w:r>
-        <w:t xml:space="preserve">Avisar a Isabel para que regenere el APK de desarrollo con la configuración de Firebase.</w:t>
+        <w:t xml:space="preserve">Isabel y Brayan vuelven a ejecutar </w:t>
+      </w:r>
+      <w:r>
+        <w:rPr>
+          <w:rFonts w:ascii="Consolas" w:cs="Consolas" w:eastAsia="Consolas" w:hAnsi="Consolas"/>
+          <w:color w:val="0F172A"/>
+          <w:sz w:val="19"/>
+          <w:szCs w:val="19"/>
+        </w:rPr>
+        <w:t xml:space="preserve">npm run android</w:t>
+      </w:r>
+      <w:r>
+        <w:t xml:space="preserve"> para que el development build tome la configuración de Firebase.</w:t>
       </w:r>
     </w:p>
     <w:p>
@@ -10818,7 +10628,7 @@
         <w:pStyle w:val="Heading2"/>
       </w:pPr>
       <w:r>
-        <w:t xml:space="preserve">11.4 Isabel: APK de desarrollo</w:t>
+        <w:t xml:space="preserve">11.4 Kassie, Jorge y Jeshua: Expo Go</w:t>
       </w:r>
     </w:p>
     <w:p>
@@ -10831,7 +10641,20 @@
         <w:spacing w:after="60"/>
       </w:pPr>
       <w:r>
-        <w:t xml:space="preserve">Con el celular conectado, ejecutar </w:t>
+        <w:t xml:space="preserve">Instalar o actualizar Expo Go desde la App Store.</w:t>
+      </w:r>
+    </w:p>
+    <w:p>
+      <w:pPr>
+        <w:pStyle w:val="ListParagraph"/>
+        <w:numPr>
+          <w:ilvl w:val="0"/>
+          <w:numId w:val="7"/>
+        </w:numPr>
+        <w:spacing w:after="60"/>
+      </w:pPr>
+      <w:r>
+        <w:t xml:space="preserve">Clonar el repositorio, </w:t>
       </w:r>
       <w:r>
         <w:rPr>
@@ -10840,10 +10663,22 @@
           <w:sz w:val="19"/>
           <w:szCs w:val="19"/>
         </w:rPr>
-        <w:t xml:space="preserve">npm run android</w:t>
-      </w:r>
-      <w:r>
-        <w:t xml:space="preserve">.</w:t>
+        <w:t xml:space="preserve">npm install</w:t>
+      </w:r>
+      <w:r>
+        <w:t xml:space="preserve"> y crear </w:t>
+      </w:r>
+      <w:r>
+        <w:rPr>
+          <w:rFonts w:ascii="Consolas" w:cs="Consolas" w:eastAsia="Consolas" w:hAnsi="Consolas"/>
+          <w:color w:val="0F172A"/>
+          <w:sz w:val="19"/>
+          <w:szCs w:val="19"/>
+        </w:rPr>
+        <w:t xml:space="preserve">.env</w:t>
+      </w:r>
+      <w:r>
+        <w:t xml:space="preserve"> (sección 11.5).</w:t>
       </w:r>
     </w:p>
     <w:p>
@@ -10855,78 +10690,6 @@
         </w:numPr>
         <w:spacing w:after="60"/>
       </w:pPr>
-      <w:r>
-        <w:t xml:space="preserve">Compartir </w:t>
-      </w:r>
-      <w:r>
-        <w:rPr>
-          <w:rFonts w:ascii="Consolas" w:cs="Consolas" w:eastAsia="Consolas" w:hAnsi="Consolas"/>
-          <w:color w:val="0F172A"/>
-          <w:sz w:val="19"/>
-          <w:szCs w:val="19"/>
-        </w:rPr>
-        <w:t xml:space="preserve">android/app/build/outputs/apk/debug/app-debug.apk</w:t>
-      </w:r>
-      <w:r>
-        <w:t xml:space="preserve"> con el equipo.</w:t>
-      </w:r>
-    </w:p>
-    <w:p>
-      <w:pPr>
-        <w:pStyle w:val="Heading2"/>
-      </w:pPr>
-      <w:r>
-        <w:t xml:space="preserve">11.5 Kassie, Jorge y Jeshua: emulador</w:t>
-      </w:r>
-    </w:p>
-    <w:p>
-      <w:pPr>
-        <w:pStyle w:val="ListParagraph"/>
-        <w:numPr>
-          <w:ilvl w:val="0"/>
-          <w:numId w:val="8"/>
-        </w:numPr>
-        <w:spacing w:after="60"/>
-      </w:pPr>
-      <w:r>
-        <w:t xml:space="preserve">Instalar Android Studio y, en Device Manager, crear un dispositivo Pixel con imagen </w:t>
-      </w:r>
-      <w:r>
-        <w:rPr>
-          <w:b/>
-          <w:bCs/>
-        </w:rPr>
-        <w:t xml:space="preserve">Google Play</w:t>
-      </w:r>
-      <w:r>
-        <w:t xml:space="preserve"> (API 35 o superior).</w:t>
-      </w:r>
-    </w:p>
-    <w:p>
-      <w:pPr>
-        <w:pStyle w:val="ListParagraph"/>
-        <w:numPr>
-          <w:ilvl w:val="0"/>
-          <w:numId w:val="8"/>
-        </w:numPr>
-        <w:spacing w:after="60"/>
-      </w:pPr>
-      <w:r>
-        <w:t xml:space="preserve">Iniciar el emulador y arrastrar el APK de desarrollo a la ventana para instalarlo.</w:t>
-      </w:r>
-    </w:p>
-    <w:p>
-      <w:pPr>
-        <w:pStyle w:val="ListParagraph"/>
-        <w:numPr>
-          <w:ilvl w:val="0"/>
-          <w:numId w:val="8"/>
-        </w:numPr>
-        <w:spacing w:after="60"/>
-      </w:pPr>
-      <w:r>
-        <w:t xml:space="preserve">En la PC: </w:t>
-      </w:r>
       <w:r>
         <w:rPr>
           <w:rFonts w:ascii="Consolas" w:cs="Consolas" w:eastAsia="Consolas" w:hAnsi="Consolas"/>
@@ -10937,7 +10700,7 @@
         <w:t xml:space="preserve">npm start</w:t>
       </w:r>
       <w:r>
-        <w:t xml:space="preserve"> y presionar </w:t>
+        <w:t xml:space="preserve"> y escanear el QR con la cámara del iPhone. La PC y el iPhone deben estar en la misma red WiFi, o usar </w:t>
       </w:r>
       <w:r>
         <w:rPr>
@@ -10946,31 +10709,18 @@
           <w:sz w:val="19"/>
           <w:szCs w:val="19"/>
         </w:rPr>
-        <w:t xml:space="preserve">a</w:t>
-      </w:r>
-      <w:r>
-        <w:t xml:space="preserve">. La app se abre en el emulador con el código local.</w:t>
+        <w:t xml:space="preserve">npm run start:tunnel</w:t>
+      </w:r>
+      <w:r>
+        <w:t xml:space="preserve">.</w:t>
       </w:r>
     </w:p>
     <w:p>
       <w:pPr>
-        <w:pStyle w:val="ListParagraph"/>
-        <w:numPr>
-          <w:ilvl w:val="0"/>
-          <w:numId w:val="8"/>
-        </w:numPr>
-        <w:spacing w:after="60"/>
-      </w:pPr>
-      <w:r>
-        <w:t xml:space="preserve">Iniciar sesión en Google dentro del emulador para recibir notificaciones push.</w:t>
-      </w:r>
-    </w:p>
-    <w:p>
-      <w:pPr>
         <w:pStyle w:val="Heading2"/>
       </w:pPr>
       <w:r>
-        <w:t xml:space="preserve">11.6 Todos</w:t>
+        <w:t xml:space="preserve">11.5 Todos</w:t>
       </w:r>
     </w:p>
     <w:tbl>
@@ -11068,7 +10818,20 @@
                 <w:sz w:val="18"/>
                 <w:szCs w:val="18"/>
               </w:rPr>
-              <w:t xml:space="preserve">npm start                        # luego 'a' para abrir en el emulador o celular</w:t>
+              <w:t xml:space="preserve">npm start                        # iPhone: escanear QR con Expo Go</w:t>
+            </w:r>
+          </w:p>
+          <w:p>
+            <w:pPr>
+              <w:spacing w:after="0"/>
+            </w:pPr>
+            <w:r>
+              <w:rPr>
+                <w:rFonts w:ascii="Consolas" w:cs="Consolas" w:eastAsia="Consolas" w:hAnsi="Consolas"/>
+                <w:sz w:val="18"/>
+                <w:szCs w:val="18"/>
+              </w:rPr>
+              <w:t xml:space="preserve">npm run android                  # Android: compila el development build</w:t>
             </w:r>
           </w:p>
         </w:tc>
@@ -11418,7 +11181,7 @@
               <w:spacing w:after="40"/>
             </w:pPr>
             <w:r>
-              <w:t xml:space="preserve">Emulador listo, correr app, guía de estilo</w:t>
+              <w:t xml:space="preserve">Expo Go listo, correr app, guía de estilo</w:t>
             </w:r>
           </w:p>
         </w:tc>
@@ -11444,7 +11207,7 @@
               <w:spacing w:after="40"/>
             </w:pPr>
             <w:r>
-              <w:t xml:space="preserve">Emulador listo; proyecto Supabase, migración, seed, tipos</w:t>
+              <w:t xml:space="preserve">Proyecto Supabase, migración, seed, tipos</w:t>
             </w:r>
           </w:p>
         </w:tc>
@@ -11470,7 +11233,7 @@
               <w:spacing w:after="40"/>
             </w:pPr>
             <w:r>
-              <w:t xml:space="preserve">Emulador listo; probar canal Realtime con la subasta demo</w:t>
+              <w:t xml:space="preserve">Probar canal Realtime con la subasta demo</w:t>
             </w:r>
           </w:p>
         </w:tc>
@@ -11496,7 +11259,7 @@
               <w:spacing w:after="40"/>
             </w:pPr>
             <w:r>
-              <w:t xml:space="preserve">APK de desarrollo para el equipo; permisos de cámara y ubicación</w:t>
+              <w:t xml:space="preserve">Development build; permisos de cámara y ubicación</w:t>
             </w:r>
           </w:p>
         </w:tc>
@@ -12325,7 +12088,7 @@
         <w:t xml:space="preserve">develop</w:t>
       </w:r>
       <w:r>
-        <w:t xml:space="preserve"> y se prueba la app completa en un celular físico y en un emulador.</w:t>
+        <w:t xml:space="preserve"> y se prueba la app completa en un celular Android y en un iPhone con Expo Go.</w:t>
       </w:r>
     </w:p>
     <w:p>
@@ -13204,7 +12967,7 @@
               <w:spacing w:after="40"/>
             </w:pPr>
             <w:r>
-              <w:t xml:space="preserve">Una PC no soporta el emulador</w:t>
+              <w:t xml:space="preserve">Algo se ve bien en iPhone pero distinto en Android</w:t>
             </w:r>
           </w:p>
         </w:tc>
@@ -13231,7 +12994,7 @@
               <w:spacing w:after="40"/>
             </w:pPr>
             <w:r>
-              <w:t xml:space="preserve">Detectarlo el día 1; ese integrante prueba en los celulares de Isabel o Brayan durante las sesiones de integración.</w:t>
+              <w:t xml:space="preserve">Kassie revisa el diseño en el celular de Isabel o Brayan al menos una vez al día.</w:t>
             </w:r>
           </w:p>
         </w:tc>
@@ -13259,7 +13022,7 @@
               <w:spacing w:after="40"/>
             </w:pPr>
             <w:r>
-              <w:t xml:space="preserve">Alguien agrega una librería nativa sin avisar</w:t>
+              <w:t xml:space="preserve">Alguien instala una librería incompatible con Expo Go</w:t>
             </w:r>
           </w:p>
         </w:tc>
@@ -13285,7 +13048,7 @@
               <w:spacing w:after="40"/>
             </w:pPr>
             <w:r>
-              <w:t xml:space="preserve">El APK de desarrollo deja de funcionar para los demás. Solo Isabel o Brayan instalan librerías nativas y regeneran el APK.</w:t>
+              <w:t xml:space="preserve">Los iPhone dejan de abrir la app. Regla de oro de la sección 4 y revisión en Pull Request.</w:t>
             </w:r>
           </w:p>
         </w:tc>
@@ -13763,18 +13526,6 @@
     </w:lvl>
   </w:abstractNum>
   <w:abstractNum w:abstractNumId="7" w15:restartNumberingAfterBreak="0">
-    <w:multiLevelType w:val="hybridMultilevel"/>
-    <w:lvl w:ilvl="0" w15:tentative="1">
-      <w:start w:val="1"/>
-      <w:numFmt w:val="decimal"/>
-      <w:lvlText w:val="%1."/>
-      <w:lvlJc w:val="left"/>
-      <w:pPr>
-        <w:ind w:left="540" w:hanging="360"/>
-      </w:pPr>
-    </w:lvl>
-  </w:abstractNum>
-  <w:abstractNum w:abstractNumId="8" w15:restartNumberingAfterBreak="0">
     <w:multiLevelType w:val="hybridMultilevel"/>
     <w:lvl w:ilvl="0" w15:tentative="1">
       <w:start w:val="1"/>
@@ -13824,12 +13575,6 @@
   </w:num>
   <w:num w:numId="7">
     <w:abstractNumId w:val="7"/>
-    <w:lvlOverride w:ilvl="0">
-      <w:startOverride w:val="1"/>
-    </w:lvlOverride>
-  </w:num>
-  <w:num w:numId="8">
-    <w:abstractNumId w:val="8"/>
     <w:lvlOverride w:ilvl="0">
       <w:startOverride w:val="1"/>
     </w:lvlOverride>

</xml_diff>

<commit_message>
docs: Jorge en Frontend y Kassie en Backend y BD
Co-Authored-By: Claude Opus 5.5 <noreply@anthropic.com>
Claude-Session: https://claude.ai/code/session_019xLn7cYorBNSuBjLRXFLrS
</commit_message>
<xml_diff>
--- a/docs/Arquitectura_App_Subastas.docx
+++ b/docs/Arquitectura_App_Subastas.docx
@@ -282,6 +282,9 @@
         </w:tc>
       </w:tr>
       <w:tr>
+        <w:trPr>
+          <w:cantSplit/>
+        </w:trPr>
         <w:tc>
           <w:tcPr>
             <w:tcW w:type="dxa" w:w="2400"/>
@@ -366,6 +369,9 @@
         </w:tc>
       </w:tr>
       <w:tr>
+        <w:trPr>
+          <w:cantSplit/>
+        </w:trPr>
         <w:tc>
           <w:tcPr>
             <w:tcW w:type="dxa" w:w="2400"/>
@@ -432,6 +438,9 @@
         </w:tc>
       </w:tr>
       <w:tr>
+        <w:trPr>
+          <w:cantSplit/>
+        </w:trPr>
         <w:tc>
           <w:tcPr>
             <w:tcW w:type="dxa" w:w="2400"/>
@@ -496,6 +505,9 @@
         </w:tc>
       </w:tr>
       <w:tr>
+        <w:trPr>
+          <w:cantSplit/>
+        </w:trPr>
         <w:tc>
           <w:tcPr>
             <w:tcW w:type="dxa" w:w="2400"/>
@@ -564,6 +576,9 @@
         </w:tc>
       </w:tr>
       <w:tr>
+        <w:trPr>
+          <w:cantSplit/>
+        </w:trPr>
         <w:tc>
           <w:tcPr>
             <w:tcW w:type="dxa" w:w="2400"/>
@@ -628,6 +643,9 @@
         </w:tc>
       </w:tr>
       <w:tr>
+        <w:trPr>
+          <w:cantSplit/>
+        </w:trPr>
         <w:tc>
           <w:tcPr>
             <w:tcW w:type="dxa" w:w="2400"/>
@@ -694,6 +712,9 @@
         </w:tc>
       </w:tr>
       <w:tr>
+        <w:trPr>
+          <w:cantSplit/>
+        </w:trPr>
         <w:tc>
           <w:tcPr>
             <w:tcW w:type="dxa" w:w="2400"/>
@@ -758,6 +779,9 @@
         </w:tc>
       </w:tr>
       <w:tr>
+        <w:trPr>
+          <w:cantSplit/>
+        </w:trPr>
         <w:tc>
           <w:tcPr>
             <w:tcW w:type="dxa" w:w="2400"/>
@@ -860,6 +884,9 @@
         </w:tc>
       </w:tr>
       <w:tr>
+        <w:trPr>
+          <w:cantSplit/>
+        </w:trPr>
         <w:tc>
           <w:tcPr>
             <w:tcW w:type="dxa" w:w="2400"/>
@@ -936,6 +963,9 @@
         </w:tc>
       </w:tr>
       <w:tr>
+        <w:trPr>
+          <w:cantSplit/>
+        </w:trPr>
         <w:tc>
           <w:tcPr>
             <w:tcW w:type="dxa" w:w="2400"/>
@@ -1028,6 +1058,9 @@
         </w:tc>
       </w:tr>
       <w:tr>
+        <w:trPr>
+          <w:cantSplit/>
+        </w:trPr>
         <w:tc>
           <w:tcPr>
             <w:tcW w:type="dxa" w:w="2400"/>
@@ -1094,6 +1127,9 @@
         </w:tc>
       </w:tr>
       <w:tr>
+        <w:trPr>
+          <w:cantSplit/>
+        </w:trPr>
         <w:tc>
           <w:tcPr>
             <w:tcW w:type="dxa" w:w="2400"/>
@@ -1492,6 +1528,9 @@
         </w:tc>
       </w:tr>
       <w:tr>
+        <w:trPr>
+          <w:cantSplit/>
+        </w:trPr>
         <w:tc>
           <w:tcPr>
             <w:tcW w:type="dxa" w:w="1900"/>
@@ -1572,6 +1611,9 @@
         </w:tc>
       </w:tr>
       <w:tr>
+        <w:trPr>
+          <w:cantSplit/>
+        </w:trPr>
         <w:tc>
           <w:tcPr>
             <w:tcW w:type="dxa" w:w="1900"/>
@@ -1667,6 +1709,9 @@
         </w:tc>
       </w:tr>
       <w:tr>
+        <w:trPr>
+          <w:cantSplit/>
+        </w:trPr>
         <w:tc>
           <w:tcPr>
             <w:tcW w:type="dxa" w:w="1900"/>
@@ -1747,6 +1792,9 @@
         </w:tc>
       </w:tr>
       <w:tr>
+        <w:trPr>
+          <w:cantSplit/>
+        </w:trPr>
         <w:tc>
           <w:tcPr>
             <w:tcW w:type="dxa" w:w="1900"/>
@@ -1830,6 +1878,9 @@
         </w:tc>
       </w:tr>
       <w:tr>
+        <w:trPr>
+          <w:cantSplit/>
+        </w:trPr>
         <w:tc>
           <w:tcPr>
             <w:tcW w:type="dxa" w:w="1900"/>
@@ -1910,6 +1961,9 @@
         </w:tc>
       </w:tr>
       <w:tr>
+        <w:trPr>
+          <w:cantSplit/>
+        </w:trPr>
         <w:tc>
           <w:tcPr>
             <w:tcW w:type="dxa" w:w="1900"/>
@@ -1993,6 +2047,9 @@
         </w:tc>
       </w:tr>
       <w:tr>
+        <w:trPr>
+          <w:cantSplit/>
+        </w:trPr>
         <w:tc>
           <w:tcPr>
             <w:tcW w:type="dxa" w:w="1900"/>
@@ -2073,6 +2130,9 @@
         </w:tc>
       </w:tr>
       <w:tr>
+        <w:trPr>
+          <w:cantSplit/>
+        </w:trPr>
         <w:tc>
           <w:tcPr>
             <w:tcW w:type="dxa" w:w="1900"/>
@@ -2156,6 +2216,9 @@
         </w:tc>
       </w:tr>
       <w:tr>
+        <w:trPr>
+          <w:cantSplit/>
+        </w:trPr>
         <w:tc>
           <w:tcPr>
             <w:tcW w:type="dxa" w:w="1900"/>
@@ -2236,6 +2299,9 @@
         </w:tc>
       </w:tr>
       <w:tr>
+        <w:trPr>
+          <w:cantSplit/>
+        </w:trPr>
         <w:tc>
           <w:tcPr>
             <w:tcW w:type="dxa" w:w="1900"/>
@@ -2319,6 +2385,9 @@
         </w:tc>
       </w:tr>
       <w:tr>
+        <w:trPr>
+          <w:cantSplit/>
+        </w:trPr>
         <w:tc>
           <w:tcPr>
             <w:tcW w:type="dxa" w:w="1900"/>
@@ -2399,6 +2468,9 @@
         </w:tc>
       </w:tr>
       <w:tr>
+        <w:trPr>
+          <w:cantSplit/>
+        </w:trPr>
         <w:tc>
           <w:tcPr>
             <w:tcW w:type="dxa" w:w="1900"/>
@@ -2482,6 +2554,9 @@
         </w:tc>
       </w:tr>
       <w:tr>
+        <w:trPr>
+          <w:cantSplit/>
+        </w:trPr>
         <w:tc>
           <w:tcPr>
             <w:tcW w:type="dxa" w:w="1900"/>
@@ -2702,6 +2777,9 @@
         </w:tc>
       </w:tr>
       <w:tr>
+        <w:trPr>
+          <w:cantSplit/>
+        </w:trPr>
         <w:tc>
           <w:tcPr>
             <w:tcW w:type="dxa" w:w="2000"/>
@@ -2818,6 +2896,9 @@
         </w:tc>
       </w:tr>
       <w:tr>
+        <w:trPr>
+          <w:cantSplit/>
+        </w:trPr>
         <w:tc>
           <w:tcPr>
             <w:tcW w:type="dxa" w:w="2000"/>
@@ -2901,6 +2982,9 @@
         </w:tc>
       </w:tr>
       <w:tr>
+        <w:trPr>
+          <w:cantSplit/>
+        </w:trPr>
         <w:tc>
           <w:tcPr>
             <w:tcW w:type="dxa" w:w="2000"/>
@@ -2981,6 +3065,9 @@
         </w:tc>
       </w:tr>
       <w:tr>
+        <w:trPr>
+          <w:cantSplit/>
+        </w:trPr>
         <w:tc>
           <w:tcPr>
             <w:tcW w:type="dxa" w:w="2000"/>
@@ -3064,6 +3151,9 @@
         </w:tc>
       </w:tr>
       <w:tr>
+        <w:trPr>
+          <w:cantSplit/>
+        </w:trPr>
         <w:tc>
           <w:tcPr>
             <w:tcW w:type="dxa" w:w="2000"/>
@@ -3451,6 +3541,9 @@
         </w:tc>
       </w:tr>
       <w:tr>
+        <w:trPr>
+          <w:cantSplit/>
+        </w:trPr>
         <w:tc>
           <w:tcPr>
             <w:tcW w:type="dxa" w:w="3400"/>
@@ -3550,6 +3643,9 @@
         </w:tc>
       </w:tr>
       <w:tr>
+        <w:trPr>
+          <w:cantSplit/>
+        </w:trPr>
         <w:tc>
           <w:tcPr>
             <w:tcW w:type="dxa" w:w="3400"/>
@@ -3612,6 +3708,9 @@
         </w:tc>
       </w:tr>
       <w:tr>
+        <w:trPr>
+          <w:cantSplit/>
+        </w:trPr>
         <w:tc>
           <w:tcPr>
             <w:tcW w:type="dxa" w:w="3400"/>
@@ -3672,6 +3771,9 @@
         </w:tc>
       </w:tr>
       <w:tr>
+        <w:trPr>
+          <w:cantSplit/>
+        </w:trPr>
         <w:tc>
           <w:tcPr>
             <w:tcW w:type="dxa" w:w="3400"/>
@@ -3746,6 +3848,9 @@
         </w:tc>
       </w:tr>
       <w:tr>
+        <w:trPr>
+          <w:cantSplit/>
+        </w:trPr>
         <w:tc>
           <w:tcPr>
             <w:tcW w:type="dxa" w:w="3400"/>
@@ -3806,6 +3911,9 @@
         </w:tc>
       </w:tr>
       <w:tr>
+        <w:trPr>
+          <w:cantSplit/>
+        </w:trPr>
         <w:tc>
           <w:tcPr>
             <w:tcW w:type="dxa" w:w="3400"/>
@@ -3880,6 +3988,9 @@
         </w:tc>
       </w:tr>
       <w:tr>
+        <w:trPr>
+          <w:cantSplit/>
+        </w:trPr>
         <w:tc>
           <w:tcPr>
             <w:tcW w:type="dxa" w:w="3400"/>
@@ -3940,6 +4051,9 @@
         </w:tc>
       </w:tr>
       <w:tr>
+        <w:trPr>
+          <w:cantSplit/>
+        </w:trPr>
         <w:tc>
           <w:tcPr>
             <w:tcW w:type="dxa" w:w="3400"/>
@@ -4231,6 +4345,9 @@
         </w:tc>
       </w:tr>
       <w:tr>
+        <w:trPr>
+          <w:cantSplit/>
+        </w:trPr>
         <w:tc>
           <w:tcPr>
             <w:tcW w:type="dxa" w:w="2600"/>
@@ -4337,6 +4454,9 @@
         </w:tc>
       </w:tr>
       <w:tr>
+        <w:trPr>
+          <w:cantSplit/>
+        </w:trPr>
         <w:tc>
           <w:tcPr>
             <w:tcW w:type="dxa" w:w="2600"/>
@@ -4447,6 +4567,9 @@
         </w:tc>
       </w:tr>
       <w:tr>
+        <w:trPr>
+          <w:cantSplit/>
+        </w:trPr>
         <w:tc>
           <w:tcPr>
             <w:tcW w:type="dxa" w:w="2600"/>
@@ -4553,6 +4676,9 @@
         </w:tc>
       </w:tr>
       <w:tr>
+        <w:trPr>
+          <w:cantSplit/>
+        </w:trPr>
         <w:tc>
           <w:tcPr>
             <w:tcW w:type="dxa" w:w="2600"/>
@@ -4663,6 +4789,9 @@
         </w:tc>
       </w:tr>
       <w:tr>
+        <w:trPr>
+          <w:cantSplit/>
+        </w:trPr>
         <w:tc>
           <w:tcPr>
             <w:tcW w:type="dxa" w:w="2600"/>
@@ -4769,6 +4898,9 @@
         </w:tc>
       </w:tr>
       <w:tr>
+        <w:trPr>
+          <w:cantSplit/>
+        </w:trPr>
         <w:tc>
           <w:tcPr>
             <w:tcW w:type="dxa" w:w="2600"/>
@@ -5039,6 +5171,9 @@
         </w:tc>
       </w:tr>
       <w:tr>
+        <w:trPr>
+          <w:cantSplit/>
+        </w:trPr>
         <w:tc>
           <w:tcPr>
             <w:tcW w:type="dxa" w:w="2300"/>
@@ -5137,6 +5272,9 @@
         </w:tc>
       </w:tr>
       <w:tr>
+        <w:trPr>
+          <w:cantSplit/>
+        </w:trPr>
         <w:tc>
           <w:tcPr>
             <w:tcW w:type="dxa" w:w="2300"/>
@@ -5226,6 +5364,9 @@
         </w:tc>
       </w:tr>
       <w:tr>
+        <w:trPr>
+          <w:cantSplit/>
+        </w:trPr>
         <w:tc>
           <w:tcPr>
             <w:tcW w:type="dxa" w:w="2300"/>
@@ -5312,6 +5453,9 @@
         </w:tc>
       </w:tr>
       <w:tr>
+        <w:trPr>
+          <w:cantSplit/>
+        </w:trPr>
         <w:tc>
           <w:tcPr>
             <w:tcW w:type="dxa" w:w="2300"/>
@@ -5401,6 +5545,9 @@
         </w:tc>
       </w:tr>
       <w:tr>
+        <w:trPr>
+          <w:cantSplit/>
+        </w:trPr>
         <w:tc>
           <w:tcPr>
             <w:tcW w:type="dxa" w:w="2300"/>
@@ -5487,6 +5634,9 @@
         </w:tc>
       </w:tr>
       <w:tr>
+        <w:trPr>
+          <w:cantSplit/>
+        </w:trPr>
         <w:tc>
           <w:tcPr>
             <w:tcW w:type="dxa" w:w="2300"/>
@@ -6113,6 +6263,9 @@
         </w:tc>
       </w:tr>
       <w:tr>
+        <w:trPr>
+          <w:cantSplit/>
+        </w:trPr>
         <w:tc>
           <w:tcPr>
             <w:tcW w:type="dxa" w:w="2700"/>
@@ -6219,6 +6372,9 @@
         </w:tc>
       </w:tr>
       <w:tr>
+        <w:trPr>
+          <w:cantSplit/>
+        </w:trPr>
         <w:tc>
           <w:tcPr>
             <w:tcW w:type="dxa" w:w="2700"/>
@@ -6329,6 +6485,9 @@
         </w:tc>
       </w:tr>
       <w:tr>
+        <w:trPr>
+          <w:cantSplit/>
+        </w:trPr>
         <w:tc>
           <w:tcPr>
             <w:tcW w:type="dxa" w:w="2700"/>
@@ -6435,6 +6594,9 @@
         </w:tc>
       </w:tr>
       <w:tr>
+        <w:trPr>
+          <w:cantSplit/>
+        </w:trPr>
         <w:tc>
           <w:tcPr>
             <w:tcW w:type="dxa" w:w="2700"/>
@@ -6545,6 +6707,9 @@
         </w:tc>
       </w:tr>
       <w:tr>
+        <w:trPr>
+          <w:cantSplit/>
+        </w:trPr>
         <w:tc>
           <w:tcPr>
             <w:tcW w:type="dxa" w:w="2700"/>
@@ -6801,6 +6966,9 @@
         </w:tc>
       </w:tr>
       <w:tr>
+        <w:trPr>
+          <w:cantSplit/>
+        </w:trPr>
         <w:tc>
           <w:tcPr>
             <w:tcW w:type="dxa" w:w="3120"/>
@@ -6881,6 +7049,9 @@
         </w:tc>
       </w:tr>
       <w:tr>
+        <w:trPr>
+          <w:cantSplit/>
+        </w:trPr>
         <w:tc>
           <w:tcPr>
             <w:tcW w:type="dxa" w:w="3120"/>
@@ -6964,6 +7135,9 @@
         </w:tc>
       </w:tr>
       <w:tr>
+        <w:trPr>
+          <w:cantSplit/>
+        </w:trPr>
         <w:tc>
           <w:tcPr>
             <w:tcW w:type="dxa" w:w="3120"/>
@@ -7266,6 +7440,9 @@
         </w:tc>
       </w:tr>
       <w:tr>
+        <w:trPr>
+          <w:cantSplit/>
+        </w:trPr>
         <w:tc>
           <w:tcPr>
             <w:tcW w:type="dxa" w:w="1300"/>
@@ -7428,6 +7605,9 @@
         </w:tc>
       </w:tr>
       <w:tr>
+        <w:trPr>
+          <w:cantSplit/>
+        </w:trPr>
         <w:tc>
           <w:tcPr>
             <w:tcW w:type="dxa" w:w="1300"/>
@@ -7544,6 +7724,9 @@
         </w:tc>
       </w:tr>
       <w:tr>
+        <w:trPr>
+          <w:cantSplit/>
+        </w:trPr>
         <w:tc>
           <w:tcPr>
             <w:tcW w:type="dxa" w:w="1300"/>
@@ -7668,6 +7851,9 @@
         </w:tc>
       </w:tr>
       <w:tr>
+        <w:trPr>
+          <w:cantSplit/>
+        </w:trPr>
         <w:tc>
           <w:tcPr>
             <w:tcW w:type="dxa" w:w="1300"/>
@@ -8496,6 +8682,9 @@
         </w:tc>
       </w:tr>
       <w:tr>
+        <w:trPr>
+          <w:cantSplit/>
+        </w:trPr>
         <w:tc>
           <w:tcPr>
             <w:tcW w:type="dxa" w:w="2100"/>
@@ -8518,7 +8707,7 @@
               <w:spacing w:after="40"/>
             </w:pPr>
             <w:r>
-              <w:t xml:space="preserve">1. Kassie (iPhone, Expo Go)</w:t>
+              <w:t xml:space="preserve">1. Jorge (iPhone, Expo Go)</w:t>
             </w:r>
           </w:p>
         </w:tc>
@@ -8609,6 +8798,9 @@
         </w:tc>
       </w:tr>
       <w:tr>
+        <w:trPr>
+          <w:cantSplit/>
+        </w:trPr>
         <w:tc>
           <w:tcPr>
             <w:tcW w:type="dxa" w:w="2100"/>
@@ -8632,7 +8824,7 @@
               <w:spacing w:after="40"/>
             </w:pPr>
             <w:r>
-              <w:t xml:space="preserve">2. Jorge (iPhone, Expo Go)</w:t>
+              <w:t xml:space="preserve">2. Kassie (iPhone, Expo Go)</w:t>
             </w:r>
           </w:p>
         </w:tc>
@@ -8734,6 +8926,9 @@
         </w:tc>
       </w:tr>
       <w:tr>
+        <w:trPr>
+          <w:cantSplit/>
+        </w:trPr>
         <w:tc>
           <w:tcPr>
             <w:tcW w:type="dxa" w:w="2100"/>
@@ -8856,6 +9051,9 @@
         </w:tc>
       </w:tr>
       <w:tr>
+        <w:trPr>
+          <w:cantSplit/>
+        </w:trPr>
         <w:tc>
           <w:tcPr>
             <w:tcW w:type="dxa" w:w="2100"/>
@@ -8993,6 +9191,9 @@
         </w:tc>
       </w:tr>
       <w:tr>
+        <w:trPr>
+          <w:cantSplit/>
+        </w:trPr>
         <w:tc>
           <w:tcPr>
             <w:tcW w:type="dxa" w:w="2100"/>
@@ -9139,6 +9340,9 @@
         </w:tc>
       </w:tr>
       <w:tr>
+        <w:trPr>
+          <w:cantSplit/>
+        </w:trPr>
         <w:tc>
           <w:tcPr>
             <w:tcW w:type="dxa" w:w="2100"/>
@@ -9162,7 +9366,7 @@
               <w:spacing w:after="40"/>
             </w:pPr>
             <w:r>
-              <w:t xml:space="preserve">Kassie, Jeshua e Isabel</w:t>
+              <w:t xml:space="preserve">Jorge, Jeshua e Isabel</w:t>
             </w:r>
           </w:p>
         </w:tc>
@@ -9330,6 +9534,9 @@
         </w:tc>
       </w:tr>
       <w:tr>
+        <w:trPr>
+          <w:cantSplit/>
+        </w:trPr>
         <w:tc>
           <w:tcPr>
             <w:tcW w:type="dxa" w:w="3200"/>
@@ -9402,6 +9609,9 @@
         </w:tc>
       </w:tr>
       <w:tr>
+        <w:trPr>
+          <w:cantSplit/>
+        </w:trPr>
         <w:tc>
           <w:tcPr>
             <w:tcW w:type="dxa" w:w="3200"/>
@@ -9464,6 +9674,9 @@
         </w:tc>
       </w:tr>
       <w:tr>
+        <w:trPr>
+          <w:cantSplit/>
+        </w:trPr>
         <w:tc>
           <w:tcPr>
             <w:tcW w:type="dxa" w:w="3200"/>
@@ -9536,6 +9749,9 @@
         </w:tc>
       </w:tr>
       <w:tr>
+        <w:trPr>
+          <w:cantSplit/>
+        </w:trPr>
         <w:tc>
           <w:tcPr>
             <w:tcW w:type="dxa" w:w="3200"/>
@@ -9897,7 +10113,7 @@
         <w:t xml:space="preserve">npx supabase migration new &lt;nombre&gt;</w:t>
       </w:r>
       <w:r>
-        <w:t xml:space="preserve">), revisada por Jorge (Backend y BD). Después, </w:t>
+        <w:t xml:space="preserve">), revisada por Kassie (Backend y BD). Después, </w:t>
       </w:r>
       <w:r>
         <w:rPr>
@@ -10012,7 +10228,7 @@
         <w:pStyle w:val="Heading2"/>
       </w:pPr>
       <w:r>
-        <w:t xml:space="preserve">11.1 Jorge (Integrante 2): Supabase</w:t>
+        <w:t xml:space="preserve">11.1 Kassie (Integrante 2): Supabase</w:t>
       </w:r>
     </w:p>
     <w:p>
@@ -10934,7 +11150,7 @@
                 <w:bCs/>
                 <w:color w:val="FFFFFF"/>
               </w:rPr>
-              <w:t xml:space="preserve">Kassie</w:t>
+              <w:t xml:space="preserve">Jorge</w:t>
             </w:r>
           </w:p>
           <w:p>
@@ -10979,7 +11195,7 @@
                 <w:bCs/>
                 <w:color w:val="FFFFFF"/>
               </w:rPr>
-              <w:t xml:space="preserve">Jorge</w:t>
+              <w:t xml:space="preserve">Kassie</w:t>
             </w:r>
           </w:p>
           <w:p>
@@ -11133,6 +11349,9 @@
         </w:tc>
       </w:tr>
       <w:tr>
+        <w:trPr>
+          <w:cantSplit/>
+        </w:trPr>
         <w:tc>
           <w:tcPr>
             <w:tcW w:type="dxa" w:w="600"/>
@@ -11291,6 +11510,9 @@
         </w:tc>
       </w:tr>
       <w:tr>
+        <w:trPr>
+          <w:cantSplit/>
+        </w:trPr>
         <w:tc>
           <w:tcPr>
             <w:tcW w:type="dxa" w:w="600"/>
@@ -11455,6 +11677,9 @@
         </w:tc>
       </w:tr>
       <w:tr>
+        <w:trPr>
+          <w:cantSplit/>
+        </w:trPr>
         <w:tc>
           <w:tcPr>
             <w:tcW w:type="dxa" w:w="600"/>
@@ -11625,6 +11850,9 @@
         </w:tc>
       </w:tr>
       <w:tr>
+        <w:trPr>
+          <w:cantSplit/>
+        </w:trPr>
         <w:tc>
           <w:tcPr>
             <w:tcW w:type="dxa" w:w="600"/>
@@ -11798,6 +12026,9 @@
         </w:tc>
       </w:tr>
       <w:tr>
+        <w:trPr>
+          <w:cantSplit/>
+        </w:trPr>
         <w:tc>
           <w:tcPr>
             <w:tcW w:type="dxa" w:w="600"/>
@@ -11956,6 +12187,9 @@
         </w:tc>
       </w:tr>
       <w:tr>
+        <w:trPr>
+          <w:cantSplit/>
+        </w:trPr>
         <w:tc>
           <w:tcPr>
             <w:tcW w:type="dxa" w:w="600"/>
@@ -12012,6 +12246,9 @@
         </w:tc>
       </w:tr>
       <w:tr>
+        <w:trPr>
+          <w:cantSplit/>
+        </w:trPr>
         <w:tc>
           <w:tcPr>
             <w:tcW w:type="dxa" w:w="600"/>
@@ -12193,6 +12430,9 @@
         </w:tc>
       </w:tr>
       <w:tr>
+        <w:trPr>
+          <w:cantSplit/>
+        </w:trPr>
         <w:tc>
           <w:tcPr>
             <w:tcW w:type="dxa" w:w="2600"/>
@@ -12247,6 +12487,9 @@
         </w:tc>
       </w:tr>
       <w:tr>
+        <w:trPr>
+          <w:cantSplit/>
+        </w:trPr>
         <w:tc>
           <w:tcPr>
             <w:tcW w:type="dxa" w:w="2600"/>
@@ -12303,6 +12546,9 @@
         </w:tc>
       </w:tr>
       <w:tr>
+        <w:trPr>
+          <w:cantSplit/>
+        </w:trPr>
         <w:tc>
           <w:tcPr>
             <w:tcW w:type="dxa" w:w="2600"/>
@@ -12357,6 +12603,9 @@
         </w:tc>
       </w:tr>
       <w:tr>
+        <w:trPr>
+          <w:cantSplit/>
+        </w:trPr>
         <w:tc>
           <w:tcPr>
             <w:tcW w:type="dxa" w:w="2600"/>
@@ -12425,6 +12674,9 @@
         </w:tc>
       </w:tr>
       <w:tr>
+        <w:trPr>
+          <w:cantSplit/>
+        </w:trPr>
         <w:tc>
           <w:tcPr>
             <w:tcW w:type="dxa" w:w="2600"/>
@@ -12491,6 +12743,9 @@
         </w:tc>
       </w:tr>
       <w:tr>
+        <w:trPr>
+          <w:cantSplit/>
+        </w:trPr>
         <w:tc>
           <w:tcPr>
             <w:tcW w:type="dxa" w:w="2600"/>
@@ -12547,6 +12802,9 @@
         </w:tc>
       </w:tr>
       <w:tr>
+        <w:trPr>
+          <w:cantSplit/>
+        </w:trPr>
         <w:tc>
           <w:tcPr>
             <w:tcW w:type="dxa" w:w="2600"/>
@@ -12601,6 +12859,9 @@
         </w:tc>
       </w:tr>
       <w:tr>
+        <w:trPr>
+          <w:cantSplit/>
+        </w:trPr>
         <w:tc>
           <w:tcPr>
             <w:tcW w:type="dxa" w:w="2600"/>
@@ -12756,6 +13017,9 @@
         </w:tc>
       </w:tr>
       <w:tr>
+        <w:trPr>
+          <w:cantSplit/>
+        </w:trPr>
         <w:tc>
           <w:tcPr>
             <w:tcW w:type="dxa" w:w="3600"/>
@@ -12810,6 +13074,9 @@
         </w:tc>
       </w:tr>
       <w:tr>
+        <w:trPr>
+          <w:cantSplit/>
+        </w:trPr>
         <w:tc>
           <w:tcPr>
             <w:tcW w:type="dxa" w:w="3600"/>
@@ -12878,6 +13145,9 @@
         </w:tc>
       </w:tr>
       <w:tr>
+        <w:trPr>
+          <w:cantSplit/>
+        </w:trPr>
         <w:tc>
           <w:tcPr>
             <w:tcW w:type="dxa" w:w="3600"/>
@@ -12944,6 +13214,9 @@
         </w:tc>
       </w:tr>
       <w:tr>
+        <w:trPr>
+          <w:cantSplit/>
+        </w:trPr>
         <w:tc>
           <w:tcPr>
             <w:tcW w:type="dxa" w:w="3600"/>
@@ -12994,12 +13267,15 @@
               <w:spacing w:after="40"/>
             </w:pPr>
             <w:r>
-              <w:t xml:space="preserve">Kassie revisa el diseño en el celular de Isabel o Brayan al menos una vez al día.</w:t>
+              <w:t xml:space="preserve">Jorge revisa el diseño en el celular de Isabel o Brayan al menos una vez al día.</w:t>
             </w:r>
           </w:p>
         </w:tc>
       </w:tr>
       <w:tr>
+        <w:trPr>
+          <w:cantSplit/>
+        </w:trPr>
         <w:tc>
           <w:tcPr>
             <w:tcW w:type="dxa" w:w="3600"/>
@@ -13054,6 +13330,9 @@
         </w:tc>
       </w:tr>
       <w:tr>
+        <w:trPr>
+          <w:cantSplit/>
+        </w:trPr>
         <w:tc>
           <w:tcPr>
             <w:tcW w:type="dxa" w:w="3600"/>
@@ -13119,6 +13398,9 @@
         </w:tc>
       </w:tr>
       <w:tr>
+        <w:trPr>
+          <w:cantSplit/>
+        </w:trPr>
         <w:tc>
           <w:tcPr>
             <w:tcW w:type="dxa" w:w="3600"/>
@@ -13185,6 +13467,9 @@
         </w:tc>
       </w:tr>
       <w:tr>
+        <w:trPr>
+          <w:cantSplit/>
+        </w:trPr>
         <w:tc>
           <w:tcPr>
             <w:tcW w:type="dxa" w:w="3600"/>

</xml_diff>